<commit_message>
docs: update ADR docs (docs/adr) — push latest BLE charging guide and reference files
</commit_message>
<xml_diff>
--- a/docs/adr/充电与功率分配控制状态机.docx
+++ b/docs/adr/充电与功率分配控制状态机.docx
@@ -1,6 +1,6 @@
 
 <file path=word/document.xml><?xml version="1.0" encoding="utf-8"?>
-<w:document xmlns:w="http://schemas.openxmlformats.org/wordprocessingml/2006/main">
+<w:document xmlns:wpc="http://schemas.microsoft.com/office/word/2010/wordprocessingCanvas" xmlns:cx="http://schemas.microsoft.com/office/drawing/2014/chartex" xmlns:cx1="http://schemas.microsoft.com/office/drawing/2015/9/8/chartex" xmlns:cx2="http://schemas.microsoft.com/office/drawing/2015/10/21/chartex" xmlns:cx3="http://schemas.microsoft.com/office/drawing/2016/5/9/chartex" xmlns:cx4="http://schemas.microsoft.com/office/drawing/2016/5/10/chartex" xmlns:cx5="http://schemas.microsoft.com/office/drawing/2016/5/11/chartex" xmlns:cx6="http://schemas.microsoft.com/office/drawing/2016/5/12/chartex" xmlns:cx7="http://schemas.microsoft.com/office/drawing/2016/5/13/chartex" xmlns:cx8="http://schemas.microsoft.com/office/drawing/2016/5/14/chartex" xmlns:mc="http://schemas.openxmlformats.org/markup-compatibility/2006" xmlns:o="urn:schemas-microsoft-com:office:office" xmlns:r="http://schemas.openxmlformats.org/officeDocument/2006/relationships" xmlns:m="http://schemas.openxmlformats.org/officeDocument/2006/math" xmlns:v="urn:schemas-microsoft-com:vml" xmlns:wp14="http://schemas.microsoft.com/office/word/2010/wordprocessingDrawing" xmlns:wp="http://schemas.openxmlformats.org/drawingml/2006/wordprocessingDrawing" xmlns:w="http://schemas.openxmlformats.org/wordprocessingml/2006/main" xmlns:w14="http://schemas.microsoft.com/office/word/2010/wordml" xmlns:w10="urn:schemas-microsoft-com:office:word" xmlns:w15="http://schemas.microsoft.com/office/word/2012/wordml" xmlns:wpg="http://schemas.microsoft.com/office/word/2010/wordprocessingGroup" xmlns:wpi="http://schemas.microsoft.com/office/word/2010/wordprocessingInk" xmlns:wne="http://schemas.microsoft.com/office/word/2006/wordml" xmlns:wps="http://schemas.microsoft.com/office/word/2010/wordprocessingShape" xmlns:wpsCustomData="http://www.wps.cn/officeDocument/2013/wpsCustomData" mc:Ignorable="w14 w15 wp14">
   <w:body>
     <w:p>
       <w:pPr>
@@ -10,11 +10,11 @@
       <w:r>
         <w:rPr>
           <w:b/>
+          <w:color w:val="1F3864"/>
           <w:sz w:val="34"/>
           <w:szCs w:val="34"/>
-          <w:color w:val="1F3864"/>
         </w:rPr>
-        <w:t xml:space="preserve">充电与功率分配控制状态机</w:t>
+        <w:t>充电与功率分配控制状态机</w:t>
       </w:r>
     </w:p>
     <w:p>
@@ -24,11 +24,11 @@
       </w:pPr>
       <w:r>
         <w:rPr>
+          <w:color w:val="595959"/>
           <w:sz w:val="22"/>
           <w:szCs w:val="22"/>
-          <w:color w:val="595959"/>
         </w:rPr>
-        <w:t xml:space="preserve">基于 CanProc / vcu_canbox_cur / CanRecoveryProc 的代码逆向建模</w:t>
+        <w:t>基于 CanProc / vcu_canbox_cur / CanRecoveryProc 的代码逆向建模</w:t>
       </w:r>
     </w:p>
     <w:p>
@@ -38,11 +38,11 @@
       <w:r>
         <w:rPr>
           <w:b/>
+          <w:color w:val="1F3864"/>
           <w:sz w:val="30"/>
           <w:szCs w:val="30"/>
-          <w:color w:val="1F3864"/>
         </w:rPr>
-        <w:t xml:space="preserve">一、状态机概述</w:t>
+        <w:t>一、状态机概述</w:t>
       </w:r>
     </w:p>
     <w:p>
@@ -54,7 +54,7 @@
           <w:sz w:val="22"/>
           <w:szCs w:val="22"/>
         </w:rPr>
-        <w:t xml:space="preserve">充电站主控在每个调度周期调用 CanProc()（can.c）。该函数并非线性流程，而是一个由定时器驱动的周期性控制状态机：在“总线在线监测”守卫下，不断完成“设备数据采集 → 充电使能广播 → 总功率测算 → 功率分配决策 → 逐设备下发”等动作；同时监测子设备的在线/失联状态。CAN 总线离线（BUS-OFF）恢复作为并发守卫子状态机，离线期间禁止一切下发。该状态机与上述“功率动态分配算法”紧密衔接——功率分配决策与逐设备下发正是功率分配算法的载体。</w:t>
+        <w:t>充电站主控在每个调度周期调用 CanProc()（can.c）。该函数并非线性流程，而是一个由定时器驱动的周期性控制状态机：在“总线在线监测”守卫下，不断完成“设备数据采集 → 充电使能广播 → 总功率测算 → 功率分配决策 → 逐设备下发”等动作；同时监测子设备的在线/失联状态。CAN 总线离线（BUS-OFF）恢复作为并发守卫子状态机，离线期间禁止一切下发。该状态机与上述“功率动态分配算法”紧密衔接——功率分配决策与逐设备下发正是功率分配算法的载体。</w:t>
       </w:r>
     </w:p>
     <w:p>
@@ -64,25 +64,33 @@
       <w:r>
         <w:rPr>
           <w:b/>
+          <w:color w:val="1F3864"/>
           <w:sz w:val="30"/>
           <w:szCs w:val="30"/>
-          <w:color w:val="1F3864"/>
         </w:rPr>
-        <w:t xml:space="preserve">二、状态定义</w:t>
+        <w:t>二、状态定义</w:t>
       </w:r>
     </w:p>
     <w:tbl>
       <w:tblPr>
+        <w:tblStyle w:val="2"/>
         <w:tblW w:w="9360" w:type="dxa"/>
+        <w:tblInd w:w="0" w:type="dxa"/>
         <w:tblBorders>
-          <w:top w:val="single" w:sz="4" w:color="CCCCCC"/>
-          <w:left w:val="single" w:sz="4" w:color="CCCCCC"/>
-          <w:bottom w:val="single" w:sz="4" w:color="CCCCCC"/>
-          <w:right w:val="single" w:sz="4" w:color="CCCCCC"/>
-          <w:insideH w:val="single" w:sz="4" w:color="CCCCCC"/>
-          <w:insideV w:val="single" w:sz="4" w:color="CCCCCC"/>
+          <w:top w:val="single" w:color="CCCCCC" w:sz="4" w:space="0"/>
+          <w:left w:val="single" w:color="CCCCCC" w:sz="4" w:space="0"/>
+          <w:bottom w:val="single" w:color="CCCCCC" w:sz="4" w:space="0"/>
+          <w:right w:val="single" w:color="CCCCCC" w:sz="4" w:space="0"/>
+          <w:insideH w:val="single" w:color="CCCCCC" w:sz="4" w:space="0"/>
+          <w:insideV w:val="single" w:color="CCCCCC" w:sz="4" w:space="0"/>
         </w:tblBorders>
-        <w:tblLook w:val="04A0"/>
+        <w:tblLayout w:type="autofit"/>
+        <w:tblCellMar>
+          <w:top w:w="0" w:type="dxa"/>
+          <w:left w:w="10" w:type="dxa"/>
+          <w:bottom w:w="0" w:type="dxa"/>
+          <w:right w:w="10" w:type="dxa"/>
+        </w:tblCellMar>
       </w:tblPr>
       <w:tblGrid>
         <w:gridCol w:w="1500"/>
@@ -90,6 +98,22 @@
         <w:gridCol w:w="1860"/>
       </w:tblGrid>
       <w:tr>
+        <w:tblPrEx>
+          <w:tblBorders>
+            <w:top w:val="single" w:color="CCCCCC" w:sz="4" w:space="0"/>
+            <w:left w:val="single" w:color="CCCCCC" w:sz="4" w:space="0"/>
+            <w:bottom w:val="single" w:color="CCCCCC" w:sz="4" w:space="0"/>
+            <w:right w:val="single" w:color="CCCCCC" w:sz="4" w:space="0"/>
+            <w:insideH w:val="single" w:color="CCCCCC" w:sz="4" w:space="0"/>
+            <w:insideV w:val="single" w:color="CCCCCC" w:sz="4" w:space="0"/>
+          </w:tblBorders>
+          <w:tblCellMar>
+            <w:top w:w="0" w:type="dxa"/>
+            <w:left w:w="10" w:type="dxa"/>
+            <w:bottom w:w="0" w:type="dxa"/>
+            <w:right w:w="10" w:type="dxa"/>
+          </w:tblCellMar>
+        </w:tblPrEx>
         <w:tc>
           <w:tcPr>
             <w:tcW w:w="1500" w:type="dxa"/>
@@ -108,7 +132,7 @@
                 <w:sz w:val="18"/>
                 <w:szCs w:val="18"/>
               </w:rPr>
-              <w:t xml:space="preserve">状态</w:t>
+              <w:t>状态</w:t>
             </w:r>
           </w:p>
         </w:tc>
@@ -130,7 +154,7 @@
                 <w:sz w:val="18"/>
                 <w:szCs w:val="18"/>
               </w:rPr>
-              <w:t xml:space="preserve">说明</w:t>
+              <w:t>说明</w:t>
             </w:r>
           </w:p>
         </w:tc>
@@ -152,12 +176,28 @@
                 <w:sz w:val="18"/>
                 <w:szCs w:val="18"/>
               </w:rPr>
-              <w:t xml:space="preserve">代码位置</w:t>
+              <w:t>代码位置</w:t>
             </w:r>
           </w:p>
         </w:tc>
       </w:tr>
       <w:tr>
+        <w:tblPrEx>
+          <w:tblBorders>
+            <w:top w:val="single" w:color="CCCCCC" w:sz="4" w:space="0"/>
+            <w:left w:val="single" w:color="CCCCCC" w:sz="4" w:space="0"/>
+            <w:bottom w:val="single" w:color="CCCCCC" w:sz="4" w:space="0"/>
+            <w:right w:val="single" w:color="CCCCCC" w:sz="4" w:space="0"/>
+            <w:insideH w:val="single" w:color="CCCCCC" w:sz="4" w:space="0"/>
+            <w:insideV w:val="single" w:color="CCCCCC" w:sz="4" w:space="0"/>
+          </w:tblBorders>
+          <w:tblCellMar>
+            <w:top w:w="0" w:type="dxa"/>
+            <w:left w:w="10" w:type="dxa"/>
+            <w:bottom w:w="0" w:type="dxa"/>
+            <w:right w:w="10" w:type="dxa"/>
+          </w:tblCellMar>
+        </w:tblPrEx>
         <w:tc>
           <w:tcPr>
             <w:tcW w:w="1500" w:type="dxa"/>
@@ -175,7 +215,7 @@
                 <w:sz w:val="18"/>
                 <w:szCs w:val="18"/>
               </w:rPr>
-              <w:t xml:space="preserve">S0 初始化</w:t>
+              <w:t>S0 初始化</w:t>
             </w:r>
           </w:p>
         </w:tc>
@@ -196,7 +236,7 @@
                 <w:sz w:val="18"/>
                 <w:szCs w:val="18"/>
               </w:rPr>
-              <w:t xml:space="preserve">上电/复位后调用 CanRamInit() 清零各 BMS/AP/电量结构体与定时器，进入运行。</w:t>
+              <w:t>上电/复位后调用 CanRamInit() 清零各 BMS/AP/电量结构体与定时器，进入运行。</w:t>
             </w:r>
           </w:p>
         </w:tc>
@@ -217,12 +257,28 @@
                 <w:sz w:val="18"/>
                 <w:szCs w:val="18"/>
               </w:rPr>
-              <w:t xml:space="preserve">can.c CanRamInit / 启动</w:t>
+              <w:t>can.c CanRamInit / 启动</w:t>
             </w:r>
           </w:p>
         </w:tc>
       </w:tr>
       <w:tr>
+        <w:tblPrEx>
+          <w:tblBorders>
+            <w:top w:val="single" w:color="CCCCCC" w:sz="4" w:space="0"/>
+            <w:left w:val="single" w:color="CCCCCC" w:sz="4" w:space="0"/>
+            <w:bottom w:val="single" w:color="CCCCCC" w:sz="4" w:space="0"/>
+            <w:right w:val="single" w:color="CCCCCC" w:sz="4" w:space="0"/>
+            <w:insideH w:val="single" w:color="CCCCCC" w:sz="4" w:space="0"/>
+            <w:insideV w:val="single" w:color="CCCCCC" w:sz="4" w:space="0"/>
+          </w:tblBorders>
+          <w:tblCellMar>
+            <w:top w:w="0" w:type="dxa"/>
+            <w:left w:w="10" w:type="dxa"/>
+            <w:bottom w:w="0" w:type="dxa"/>
+            <w:right w:w="10" w:type="dxa"/>
+          </w:tblCellMar>
+        </w:tblPrEx>
         <w:tc>
           <w:tcPr>
             <w:tcW w:w="1500" w:type="dxa"/>
@@ -240,7 +296,7 @@
                 <w:sz w:val="18"/>
                 <w:szCs w:val="18"/>
               </w:rPr>
-              <w:t xml:space="preserve">S1 总线监测</w:t>
+              <w:t>S1 总线监测</w:t>
             </w:r>
           </w:p>
         </w:tc>
@@ -261,7 +317,7 @@
                 <w:sz w:val="18"/>
                 <w:szCs w:val="18"/>
               </w:rPr>
-              <w:t xml:space="preserve">CanRecoveryProc()：检测 BUS-OFF 与漏应答(MISS_ACK)，维护 BUSOFF_NONE/SLOW/QUICK 与 MISS_ACK_* 子状态，离线时 tx_disable=TRUE。</w:t>
+              <w:t>CanRecoveryProc()：检测 BUS-OFF 与漏应答(MISS_ACK)，维护 BUSOFF_NONE/SLOW/QUICK 与 MISS_ACK_* 子状态，离线时 tx_disable=TRUE。</w:t>
             </w:r>
           </w:p>
         </w:tc>
@@ -282,12 +338,28 @@
                 <w:sz w:val="18"/>
                 <w:szCs w:val="18"/>
               </w:rPr>
-              <w:t xml:space="preserve">can.c:81-182</w:t>
+              <w:t>can.c:81-182</w:t>
             </w:r>
           </w:p>
         </w:tc>
       </w:tr>
       <w:tr>
+        <w:tblPrEx>
+          <w:tblBorders>
+            <w:top w:val="single" w:color="CCCCCC" w:sz="4" w:space="0"/>
+            <w:left w:val="single" w:color="CCCCCC" w:sz="4" w:space="0"/>
+            <w:bottom w:val="single" w:color="CCCCCC" w:sz="4" w:space="0"/>
+            <w:right w:val="single" w:color="CCCCCC" w:sz="4" w:space="0"/>
+            <w:insideH w:val="single" w:color="CCCCCC" w:sz="4" w:space="0"/>
+            <w:insideV w:val="single" w:color="CCCCCC" w:sz="4" w:space="0"/>
+          </w:tblBorders>
+          <w:tblCellMar>
+            <w:top w:w="0" w:type="dxa"/>
+            <w:left w:w="10" w:type="dxa"/>
+            <w:bottom w:w="0" w:type="dxa"/>
+            <w:right w:w="10" w:type="dxa"/>
+          </w:tblCellMar>
+        </w:tblPrEx>
         <w:tc>
           <w:tcPr>
             <w:tcW w:w="1500" w:type="dxa"/>
@@ -305,7 +377,7 @@
                 <w:sz w:val="18"/>
                 <w:szCs w:val="18"/>
               </w:rPr>
-              <w:t xml:space="preserve">S2 数据采集</w:t>
+              <w:t>S2 数据采集</w:t>
             </w:r>
           </w:p>
         </w:tc>
@@ -326,7 +398,7 @@
                 <w:sz w:val="18"/>
                 <w:szCs w:val="18"/>
               </w:rPr>
-              <w:t xml:space="preserve">解析 BMS/AP 报文，刷新 g_SlotBmsInfor[i].Soc、ChargeCurrent 与 g_BmsSysAP[i] 额定值；统计在线数 bat_act_number 与最大 SOC 设备 max_soc_numb。</w:t>
+              <w:t>解析 BMS/AP 报文，刷新 g_SlotBmsInfor[i].Soc、ChargeCurrent 与 g_BmsSysAP[i] 额定值；统计在线数 bat_act_number 与最大 SOC 设备 max_soc_numb。</w:t>
             </w:r>
           </w:p>
         </w:tc>
@@ -347,12 +419,28 @@
                 <w:sz w:val="18"/>
                 <w:szCs w:val="18"/>
               </w:rPr>
-              <w:t xml:space="preserve">can.c:617-634</w:t>
+              <w:t>can.c:617-634</w:t>
             </w:r>
           </w:p>
         </w:tc>
       </w:tr>
       <w:tr>
+        <w:tblPrEx>
+          <w:tblBorders>
+            <w:top w:val="single" w:color="CCCCCC" w:sz="4" w:space="0"/>
+            <w:left w:val="single" w:color="CCCCCC" w:sz="4" w:space="0"/>
+            <w:bottom w:val="single" w:color="CCCCCC" w:sz="4" w:space="0"/>
+            <w:right w:val="single" w:color="CCCCCC" w:sz="4" w:space="0"/>
+            <w:insideH w:val="single" w:color="CCCCCC" w:sz="4" w:space="0"/>
+            <w:insideV w:val="single" w:color="CCCCCC" w:sz="4" w:space="0"/>
+          </w:tblBorders>
+          <w:tblCellMar>
+            <w:top w:w="0" w:type="dxa"/>
+            <w:left w:w="10" w:type="dxa"/>
+            <w:bottom w:w="0" w:type="dxa"/>
+            <w:right w:w="10" w:type="dxa"/>
+          </w:tblCellMar>
+        </w:tblPrEx>
         <w:tc>
           <w:tcPr>
             <w:tcW w:w="1500" w:type="dxa"/>
@@ -370,7 +458,7 @@
                 <w:sz w:val="18"/>
                 <w:szCs w:val="18"/>
               </w:rPr>
-              <w:t xml:space="preserve">S3 使能广播</w:t>
+              <w:t>S3 使能广播</w:t>
             </w:r>
           </w:p>
         </w:tc>
@@ -391,7 +479,16 @@
                 <w:sz w:val="18"/>
                 <w:szCs w:val="18"/>
               </w:rPr>
-              <w:t xml:space="preserve">每 10s(t200ms≥10000) 调 vcu_canbox_mode() 向 0x1806E640 广播：PaygGetPayState() 决定 TargetChargeVoltageH(0xff=暂停)，power&gt;1.0 置 ChargeEnable=0x55。</w:t>
+              <w:t>每 10s(t200ms≥1</w:t>
+            </w:r>
+            <w:bookmarkStart w:id="0" w:name="_GoBack"/>
+            <w:bookmarkEnd w:id="0"/>
+            <w:r>
+              <w:rPr>
+                <w:sz w:val="18"/>
+                <w:szCs w:val="18"/>
+              </w:rPr>
+              <w:t>000) 调 vcu_canbox_mode() 向 0x1806E640 广播：PaygGetPayState() 决定 TargetChargeVoltageH(0xff=暂停)，power&gt;1.0 置 ChargeEnable=0x55。</w:t>
             </w:r>
           </w:p>
         </w:tc>
@@ -412,12 +509,28 @@
                 <w:sz w:val="18"/>
                 <w:szCs w:val="18"/>
               </w:rPr>
-              <w:t xml:space="preserve">can.c:702-706 / 507-542</w:t>
+              <w:t>can.c:702-706 / 507-542</w:t>
             </w:r>
           </w:p>
         </w:tc>
       </w:tr>
       <w:tr>
+        <w:tblPrEx>
+          <w:tblBorders>
+            <w:top w:val="single" w:color="CCCCCC" w:sz="4" w:space="0"/>
+            <w:left w:val="single" w:color="CCCCCC" w:sz="4" w:space="0"/>
+            <w:bottom w:val="single" w:color="CCCCCC" w:sz="4" w:space="0"/>
+            <w:right w:val="single" w:color="CCCCCC" w:sz="4" w:space="0"/>
+            <w:insideH w:val="single" w:color="CCCCCC" w:sz="4" w:space="0"/>
+            <w:insideV w:val="single" w:color="CCCCCC" w:sz="4" w:space="0"/>
+          </w:tblBorders>
+          <w:tblCellMar>
+            <w:top w:w="0" w:type="dxa"/>
+            <w:left w:w="10" w:type="dxa"/>
+            <w:bottom w:w="0" w:type="dxa"/>
+            <w:right w:w="10" w:type="dxa"/>
+          </w:tblCellMar>
+        </w:tblPrEx>
         <w:tc>
           <w:tcPr>
             <w:tcW w:w="1500" w:type="dxa"/>
@@ -435,7 +548,7 @@
                 <w:sz w:val="18"/>
                 <w:szCs w:val="18"/>
               </w:rPr>
-              <w:t xml:space="preserve">S4 总功率测算</w:t>
+              <w:t>S4 总功率测算</w:t>
             </w:r>
           </w:p>
         </w:tc>
@@ -456,7 +569,7 @@
                 <w:sz w:val="18"/>
                 <w:szCs w:val="18"/>
               </w:rPr>
-              <w:t xml:space="preserve">每 5s(t500ms≥5000) 累加 Σ(ap_vol[i]×ap_cur[i])，得到 total_power_all = 总和/1e7。</w:t>
+              <w:t>每 5s(t500ms≥5000) 累加 Σ(ap_vol[i]×ap_cur[i])，得到 total_power_all = 总和/1e7。</w:t>
             </w:r>
           </w:p>
         </w:tc>
@@ -477,12 +590,28 @@
                 <w:sz w:val="18"/>
                 <w:szCs w:val="18"/>
               </w:rPr>
-              <w:t xml:space="preserve">can.c:710-723</w:t>
+              <w:t>can.c:710-723</w:t>
             </w:r>
           </w:p>
         </w:tc>
       </w:tr>
       <w:tr>
+        <w:tblPrEx>
+          <w:tblBorders>
+            <w:top w:val="single" w:color="CCCCCC" w:sz="4" w:space="0"/>
+            <w:left w:val="single" w:color="CCCCCC" w:sz="4" w:space="0"/>
+            <w:bottom w:val="single" w:color="CCCCCC" w:sz="4" w:space="0"/>
+            <w:right w:val="single" w:color="CCCCCC" w:sz="4" w:space="0"/>
+            <w:insideH w:val="single" w:color="CCCCCC" w:sz="4" w:space="0"/>
+            <w:insideV w:val="single" w:color="CCCCCC" w:sz="4" w:space="0"/>
+          </w:tblBorders>
+          <w:tblCellMar>
+            <w:top w:w="0" w:type="dxa"/>
+            <w:left w:w="10" w:type="dxa"/>
+            <w:bottom w:w="0" w:type="dxa"/>
+            <w:right w:w="10" w:type="dxa"/>
+          </w:tblCellMar>
+        </w:tblPrEx>
         <w:tc>
           <w:tcPr>
             <w:tcW w:w="1500" w:type="dxa"/>
@@ -500,7 +629,7 @@
                 <w:sz w:val="18"/>
                 <w:szCs w:val="18"/>
               </w:rPr>
-              <w:t xml:space="preserve">S5 分配决策</w:t>
+              <w:t>S5 分配决策</w:t>
             </w:r>
           </w:p>
         </w:tc>
@@ -521,7 +650,7 @@
                 <w:sz w:val="18"/>
                 <w:szCs w:val="18"/>
               </w:rPr>
-              <w:t xml:space="preserve">读取设置功率 power，与 total_power_all 比较：≥ 则全额定；&lt; 则按 SOC 从大到小动态分配剩余功率。</w:t>
+              <w:t>读取设置功率 power，与 total_power_all 比较：≥ 则全额定；&lt; 则按 SOC 从大到小动态分配剩余功率。</w:t>
             </w:r>
           </w:p>
         </w:tc>
@@ -542,12 +671,28 @@
                 <w:sz w:val="18"/>
                 <w:szCs w:val="18"/>
               </w:rPr>
-              <w:t xml:space="preserve">can.c vcu_canbox_cur:552</w:t>
+              <w:t>can.c vcu_canbox_cur:552</w:t>
             </w:r>
           </w:p>
         </w:tc>
       </w:tr>
       <w:tr>
+        <w:tblPrEx>
+          <w:tblBorders>
+            <w:top w:val="single" w:color="CCCCCC" w:sz="4" w:space="0"/>
+            <w:left w:val="single" w:color="CCCCCC" w:sz="4" w:space="0"/>
+            <w:bottom w:val="single" w:color="CCCCCC" w:sz="4" w:space="0"/>
+            <w:right w:val="single" w:color="CCCCCC" w:sz="4" w:space="0"/>
+            <w:insideH w:val="single" w:color="CCCCCC" w:sz="4" w:space="0"/>
+            <w:insideV w:val="single" w:color="CCCCCC" w:sz="4" w:space="0"/>
+          </w:tblBorders>
+          <w:tblCellMar>
+            <w:top w:w="0" w:type="dxa"/>
+            <w:left w:w="10" w:type="dxa"/>
+            <w:bottom w:w="0" w:type="dxa"/>
+            <w:right w:w="10" w:type="dxa"/>
+          </w:tblCellMar>
+        </w:tblPrEx>
         <w:tc>
           <w:tcPr>
             <w:tcW w:w="1500" w:type="dxa"/>
@@ -565,7 +710,7 @@
                 <w:sz w:val="18"/>
                 <w:szCs w:val="18"/>
               </w:rPr>
-              <w:t xml:space="preserve">S6 逐设备下发</w:t>
+              <w:t>S6 逐设备下发</w:t>
             </w:r>
           </w:p>
         </w:tc>
@@ -586,7 +731,7 @@
                 <w:sz w:val="18"/>
                 <w:szCs w:val="18"/>
               </w:rPr>
-              <w:t xml:space="preserve">遍历 i=0…CHARGE_NUM-1，candi=0x1803F000+i；电压=额定、电流=分配/额定，ChargeEnable=(power&gt;1.0 且电流&gt;0)?0x55:0，CanTransmit 发送 8 字节。</w:t>
+              <w:t>遍历 i=0…CHARGE_NUM-1，candi=0x1803F000+i；电压=额定、电流=分配/额定，ChargeEnable=(power&gt;1.0 且电流&gt;0)?0x55:0，CanTransmit 发送 8 字节。</w:t>
             </w:r>
           </w:p>
         </w:tc>
@@ -607,12 +752,28 @@
                 <w:sz w:val="18"/>
                 <w:szCs w:val="18"/>
               </w:rPr>
-              <w:t xml:space="preserve">can.c vcu_canbox_cur:629-644</w:t>
+              <w:t>can.c vcu_canbox_cur:629-644</w:t>
             </w:r>
           </w:p>
         </w:tc>
       </w:tr>
       <w:tr>
+        <w:tblPrEx>
+          <w:tblBorders>
+            <w:top w:val="single" w:color="CCCCCC" w:sz="4" w:space="0"/>
+            <w:left w:val="single" w:color="CCCCCC" w:sz="4" w:space="0"/>
+            <w:bottom w:val="single" w:color="CCCCCC" w:sz="4" w:space="0"/>
+            <w:right w:val="single" w:color="CCCCCC" w:sz="4" w:space="0"/>
+            <w:insideH w:val="single" w:color="CCCCCC" w:sz="4" w:space="0"/>
+            <w:insideV w:val="single" w:color="CCCCCC" w:sz="4" w:space="0"/>
+          </w:tblBorders>
+          <w:tblCellMar>
+            <w:top w:w="0" w:type="dxa"/>
+            <w:left w:w="10" w:type="dxa"/>
+            <w:bottom w:w="0" w:type="dxa"/>
+            <w:right w:w="10" w:type="dxa"/>
+          </w:tblCellMar>
+        </w:tblPrEx>
         <w:tc>
           <w:tcPr>
             <w:tcW w:w="1500" w:type="dxa"/>
@@ -630,7 +791,7 @@
                 <w:sz w:val="18"/>
                 <w:szCs w:val="18"/>
               </w:rPr>
-              <w:t xml:space="preserve">S7 失联处理</w:t>
+              <w:t>S7 失联处理</w:t>
             </w:r>
           </w:p>
         </w:tc>
@@ -651,7 +812,7 @@
                 <w:sz w:val="18"/>
                 <w:szCs w:val="18"/>
               </w:rPr>
-              <w:t xml:space="preserve">g_BmsLostTimeCount[i]≥6 的子设备判定离线，清零其 SN 与 g_SlotBmsInfor[i]，退出本轮分配。</w:t>
+              <w:t>g_BmsLostTimeCount[i]≥6 的子设备判定离线，清零其 SN 与 g_SlotBmsInfor[i]，退出本轮分配。</w:t>
             </w:r>
           </w:p>
         </w:tc>
@@ -685,25 +846,33 @@
       <w:r>
         <w:rPr>
           <w:b/>
+          <w:color w:val="1F3864"/>
           <w:sz w:val="30"/>
           <w:szCs w:val="30"/>
-          <w:color w:val="1F3864"/>
         </w:rPr>
-        <w:t xml:space="preserve">三、状态转移表</w:t>
+        <w:t>三、状态转移表</w:t>
       </w:r>
     </w:p>
     <w:tbl>
       <w:tblPr>
+        <w:tblStyle w:val="2"/>
         <w:tblW w:w="9360" w:type="dxa"/>
+        <w:tblInd w:w="0" w:type="dxa"/>
         <w:tblBorders>
-          <w:top w:val="single" w:sz="4" w:color="CCCCCC"/>
-          <w:left w:val="single" w:sz="4" w:color="CCCCCC"/>
-          <w:bottom w:val="single" w:sz="4" w:color="CCCCCC"/>
-          <w:right w:val="single" w:sz="4" w:color="CCCCCC"/>
-          <w:insideH w:val="single" w:sz="4" w:color="CCCCCC"/>
-          <w:insideV w:val="single" w:sz="4" w:color="CCCCCC"/>
+          <w:top w:val="single" w:color="CCCCCC" w:sz="4" w:space="0"/>
+          <w:left w:val="single" w:color="CCCCCC" w:sz="4" w:space="0"/>
+          <w:bottom w:val="single" w:color="CCCCCC" w:sz="4" w:space="0"/>
+          <w:right w:val="single" w:color="CCCCCC" w:sz="4" w:space="0"/>
+          <w:insideH w:val="single" w:color="CCCCCC" w:sz="4" w:space="0"/>
+          <w:insideV w:val="single" w:color="CCCCCC" w:sz="4" w:space="0"/>
         </w:tblBorders>
-        <w:tblLook w:val="04A0"/>
+        <w:tblLayout w:type="autofit"/>
+        <w:tblCellMar>
+          <w:top w:w="0" w:type="dxa"/>
+          <w:left w:w="10" w:type="dxa"/>
+          <w:bottom w:w="0" w:type="dxa"/>
+          <w:right w:w="10" w:type="dxa"/>
+        </w:tblCellMar>
       </w:tblPr>
       <w:tblGrid>
         <w:gridCol w:w="1700"/>
@@ -712,6 +881,22 @@
         <w:gridCol w:w="2000"/>
       </w:tblGrid>
       <w:tr>
+        <w:tblPrEx>
+          <w:tblBorders>
+            <w:top w:val="single" w:color="CCCCCC" w:sz="4" w:space="0"/>
+            <w:left w:val="single" w:color="CCCCCC" w:sz="4" w:space="0"/>
+            <w:bottom w:val="single" w:color="CCCCCC" w:sz="4" w:space="0"/>
+            <w:right w:val="single" w:color="CCCCCC" w:sz="4" w:space="0"/>
+            <w:insideH w:val="single" w:color="CCCCCC" w:sz="4" w:space="0"/>
+            <w:insideV w:val="single" w:color="CCCCCC" w:sz="4" w:space="0"/>
+          </w:tblBorders>
+          <w:tblCellMar>
+            <w:top w:w="0" w:type="dxa"/>
+            <w:left w:w="10" w:type="dxa"/>
+            <w:bottom w:w="0" w:type="dxa"/>
+            <w:right w:w="10" w:type="dxa"/>
+          </w:tblCellMar>
+        </w:tblPrEx>
         <w:tc>
           <w:tcPr>
             <w:tcW w:w="1700" w:type="dxa"/>
@@ -730,7 +915,7 @@
                 <w:sz w:val="18"/>
                 <w:szCs w:val="18"/>
               </w:rPr>
-              <w:t xml:space="preserve">当前状态</w:t>
+              <w:t>当前状态</w:t>
             </w:r>
           </w:p>
         </w:tc>
@@ -752,7 +937,7 @@
                 <w:sz w:val="18"/>
                 <w:szCs w:val="18"/>
               </w:rPr>
-              <w:t xml:space="preserve">触发条件</w:t>
+              <w:t>触发条件</w:t>
             </w:r>
           </w:p>
         </w:tc>
@@ -774,7 +959,7 @@
                 <w:sz w:val="18"/>
                 <w:szCs w:val="18"/>
               </w:rPr>
-              <w:t xml:space="preserve">动作 / 事件</w:t>
+              <w:t>动作 / 事件</w:t>
             </w:r>
           </w:p>
         </w:tc>
@@ -796,12 +981,28 @@
                 <w:sz w:val="18"/>
                 <w:szCs w:val="18"/>
               </w:rPr>
-              <w:t xml:space="preserve">下一状态</w:t>
+              <w:t>下一状态</w:t>
             </w:r>
           </w:p>
         </w:tc>
       </w:tr>
       <w:tr>
+        <w:tblPrEx>
+          <w:tblBorders>
+            <w:top w:val="single" w:color="CCCCCC" w:sz="4" w:space="0"/>
+            <w:left w:val="single" w:color="CCCCCC" w:sz="4" w:space="0"/>
+            <w:bottom w:val="single" w:color="CCCCCC" w:sz="4" w:space="0"/>
+            <w:right w:val="single" w:color="CCCCCC" w:sz="4" w:space="0"/>
+            <w:insideH w:val="single" w:color="CCCCCC" w:sz="4" w:space="0"/>
+            <w:insideV w:val="single" w:color="CCCCCC" w:sz="4" w:space="0"/>
+          </w:tblBorders>
+          <w:tblCellMar>
+            <w:top w:w="0" w:type="dxa"/>
+            <w:left w:w="10" w:type="dxa"/>
+            <w:bottom w:w="0" w:type="dxa"/>
+            <w:right w:w="10" w:type="dxa"/>
+          </w:tblCellMar>
+        </w:tblPrEx>
         <w:tc>
           <w:tcPr>
             <w:tcW w:w="1700" w:type="dxa"/>
@@ -819,7 +1020,7 @@
                 <w:sz w:val="18"/>
                 <w:szCs w:val="18"/>
               </w:rPr>
-              <w:t xml:space="preserve">S0 初始化</w:t>
+              <w:t>S0 初始化</w:t>
             </w:r>
           </w:p>
         </w:tc>
@@ -840,7 +1041,7 @@
                 <w:sz w:val="18"/>
                 <w:szCs w:val="18"/>
               </w:rPr>
-              <w:t xml:space="preserve">上电 / 复位</w:t>
+              <w:t>上电 / 复位</w:t>
             </w:r>
           </w:p>
         </w:tc>
@@ -861,7 +1062,7 @@
                 <w:sz w:val="18"/>
                 <w:szCs w:val="18"/>
               </w:rPr>
-              <w:t xml:space="preserve">CanRamInit 清结构体与定时器</w:t>
+              <w:t>CanRamInit 清结构体与定时器</w:t>
             </w:r>
           </w:p>
         </w:tc>
@@ -882,12 +1083,28 @@
                 <w:sz w:val="18"/>
                 <w:szCs w:val="18"/>
               </w:rPr>
-              <w:t xml:space="preserve">S1 总线监测</w:t>
+              <w:t>S1 总线监测</w:t>
             </w:r>
           </w:p>
         </w:tc>
       </w:tr>
       <w:tr>
+        <w:tblPrEx>
+          <w:tblBorders>
+            <w:top w:val="single" w:color="CCCCCC" w:sz="4" w:space="0"/>
+            <w:left w:val="single" w:color="CCCCCC" w:sz="4" w:space="0"/>
+            <w:bottom w:val="single" w:color="CCCCCC" w:sz="4" w:space="0"/>
+            <w:right w:val="single" w:color="CCCCCC" w:sz="4" w:space="0"/>
+            <w:insideH w:val="single" w:color="CCCCCC" w:sz="4" w:space="0"/>
+            <w:insideV w:val="single" w:color="CCCCCC" w:sz="4" w:space="0"/>
+          </w:tblBorders>
+          <w:tblCellMar>
+            <w:top w:w="0" w:type="dxa"/>
+            <w:left w:w="10" w:type="dxa"/>
+            <w:bottom w:w="0" w:type="dxa"/>
+            <w:right w:w="10" w:type="dxa"/>
+          </w:tblCellMar>
+        </w:tblPrEx>
         <w:tc>
           <w:tcPr>
             <w:tcW w:w="1700" w:type="dxa"/>
@@ -905,7 +1122,7 @@
                 <w:sz w:val="18"/>
                 <w:szCs w:val="18"/>
               </w:rPr>
-              <w:t xml:space="preserve">S1 总线监测</w:t>
+              <w:t>S1 总线监测</w:t>
             </w:r>
           </w:p>
         </w:tc>
@@ -926,7 +1143,7 @@
                 <w:sz w:val="18"/>
                 <w:szCs w:val="18"/>
               </w:rPr>
-              <w:t xml:space="preserve">每个 CanProc 周期</w:t>
+              <w:t>每个 CanProc 周期</w:t>
             </w:r>
           </w:p>
         </w:tc>
@@ -947,7 +1164,7 @@
                 <w:sz w:val="18"/>
                 <w:szCs w:val="18"/>
               </w:rPr>
-              <w:t xml:space="preserve">检测 BUS-OFF/漏应答；离线则 tx_disable</w:t>
+              <w:t>检测 BUS-OFF/漏应答；离线则 tx_disable</w:t>
             </w:r>
           </w:p>
         </w:tc>
@@ -968,12 +1185,28 @@
                 <w:sz w:val="18"/>
                 <w:szCs w:val="18"/>
               </w:rPr>
-              <w:t xml:space="preserve">S2 数据采集</w:t>
+              <w:t>S2 数据采集</w:t>
             </w:r>
           </w:p>
         </w:tc>
       </w:tr>
       <w:tr>
+        <w:tblPrEx>
+          <w:tblBorders>
+            <w:top w:val="single" w:color="CCCCCC" w:sz="4" w:space="0"/>
+            <w:left w:val="single" w:color="CCCCCC" w:sz="4" w:space="0"/>
+            <w:bottom w:val="single" w:color="CCCCCC" w:sz="4" w:space="0"/>
+            <w:right w:val="single" w:color="CCCCCC" w:sz="4" w:space="0"/>
+            <w:insideH w:val="single" w:color="CCCCCC" w:sz="4" w:space="0"/>
+            <w:insideV w:val="single" w:color="CCCCCC" w:sz="4" w:space="0"/>
+          </w:tblBorders>
+          <w:tblCellMar>
+            <w:top w:w="0" w:type="dxa"/>
+            <w:left w:w="10" w:type="dxa"/>
+            <w:bottom w:w="0" w:type="dxa"/>
+            <w:right w:w="10" w:type="dxa"/>
+          </w:tblCellMar>
+        </w:tblPrEx>
         <w:tc>
           <w:tcPr>
             <w:tcW w:w="1700" w:type="dxa"/>
@@ -991,7 +1224,7 @@
                 <w:sz w:val="18"/>
                 <w:szCs w:val="18"/>
               </w:rPr>
-              <w:t xml:space="preserve">S1 总线监测</w:t>
+              <w:t>S1 总线监测</w:t>
             </w:r>
           </w:p>
         </w:tc>
@@ -1012,7 +1245,7 @@
                 <w:sz w:val="18"/>
                 <w:szCs w:val="18"/>
               </w:rPr>
-              <w:t xml:space="preserve">检测到 BUS-OFF 错误</w:t>
+              <w:t>检测到 BUS-OFF 错误</w:t>
             </w:r>
           </w:p>
         </w:tc>
@@ -1033,7 +1266,7 @@
                 <w:sz w:val="18"/>
                 <w:szCs w:val="18"/>
               </w:rPr>
-              <w:t xml:space="preserve">进入 BUSOFF_SLOW/QUICK 子状态</w:t>
+              <w:t>进入 BUSOFF_SLOW/QUICK 子状态</w:t>
             </w:r>
           </w:p>
         </w:tc>
@@ -1054,12 +1287,28 @@
                 <w:sz w:val="18"/>
                 <w:szCs w:val="18"/>
               </w:rPr>
-              <w:t xml:space="preserve">S1(离线,禁止下发)</w:t>
+              <w:t>S1(离线,禁止下发)</w:t>
             </w:r>
           </w:p>
         </w:tc>
       </w:tr>
       <w:tr>
+        <w:tblPrEx>
+          <w:tblBorders>
+            <w:top w:val="single" w:color="CCCCCC" w:sz="4" w:space="0"/>
+            <w:left w:val="single" w:color="CCCCCC" w:sz="4" w:space="0"/>
+            <w:bottom w:val="single" w:color="CCCCCC" w:sz="4" w:space="0"/>
+            <w:right w:val="single" w:color="CCCCCC" w:sz="4" w:space="0"/>
+            <w:insideH w:val="single" w:color="CCCCCC" w:sz="4" w:space="0"/>
+            <w:insideV w:val="single" w:color="CCCCCC" w:sz="4" w:space="0"/>
+          </w:tblBorders>
+          <w:tblCellMar>
+            <w:top w:w="0" w:type="dxa"/>
+            <w:left w:w="10" w:type="dxa"/>
+            <w:bottom w:w="0" w:type="dxa"/>
+            <w:right w:w="10" w:type="dxa"/>
+          </w:tblCellMar>
+        </w:tblPrEx>
         <w:tc>
           <w:tcPr>
             <w:tcW w:w="1700" w:type="dxa"/>
@@ -1077,7 +1326,7 @@
                 <w:sz w:val="18"/>
                 <w:szCs w:val="18"/>
               </w:rPr>
-              <w:t xml:space="preserve">S1 总线监测</w:t>
+              <w:t>S1 总线监测</w:t>
             </w:r>
           </w:p>
         </w:tc>
@@ -1098,7 +1347,7 @@
                 <w:sz w:val="18"/>
                 <w:szCs w:val="18"/>
               </w:rPr>
-              <w:t xml:space="preserve">超时恢复且无错误</w:t>
+              <w:t>超时恢复且无错误</w:t>
             </w:r>
           </w:p>
         </w:tc>
@@ -1119,7 +1368,7 @@
                 <w:sz w:val="18"/>
                 <w:szCs w:val="18"/>
               </w:rPr>
-              <w:t xml:space="preserve">busoff_state=BUSOFF_NONE, tx_disable=FALSE</w:t>
+              <w:t>busoff_state=BUSOFF_NONE, tx_disable=FALSE</w:t>
             </w:r>
           </w:p>
         </w:tc>
@@ -1140,12 +1389,28 @@
                 <w:sz w:val="18"/>
                 <w:szCs w:val="18"/>
               </w:rPr>
-              <w:t xml:space="preserve">S2 数据采集</w:t>
+              <w:t>S2 数据采集</w:t>
             </w:r>
           </w:p>
         </w:tc>
       </w:tr>
       <w:tr>
+        <w:tblPrEx>
+          <w:tblBorders>
+            <w:top w:val="single" w:color="CCCCCC" w:sz="4" w:space="0"/>
+            <w:left w:val="single" w:color="CCCCCC" w:sz="4" w:space="0"/>
+            <w:bottom w:val="single" w:color="CCCCCC" w:sz="4" w:space="0"/>
+            <w:right w:val="single" w:color="CCCCCC" w:sz="4" w:space="0"/>
+            <w:insideH w:val="single" w:color="CCCCCC" w:sz="4" w:space="0"/>
+            <w:insideV w:val="single" w:color="CCCCCC" w:sz="4" w:space="0"/>
+          </w:tblBorders>
+          <w:tblCellMar>
+            <w:top w:w="0" w:type="dxa"/>
+            <w:left w:w="10" w:type="dxa"/>
+            <w:bottom w:w="0" w:type="dxa"/>
+            <w:right w:w="10" w:type="dxa"/>
+          </w:tblCellMar>
+        </w:tblPrEx>
         <w:tc>
           <w:tcPr>
             <w:tcW w:w="1700" w:type="dxa"/>
@@ -1163,7 +1428,7 @@
                 <w:sz w:val="18"/>
                 <w:szCs w:val="18"/>
               </w:rPr>
-              <w:t xml:space="preserve">S2 数据采集</w:t>
+              <w:t>S2 数据采集</w:t>
             </w:r>
           </w:p>
         </w:tc>
@@ -1184,7 +1449,7 @@
                 <w:sz w:val="18"/>
                 <w:szCs w:val="18"/>
               </w:rPr>
-              <w:t xml:space="preserve">每周期</w:t>
+              <w:t>每周期</w:t>
             </w:r>
           </w:p>
         </w:tc>
@@ -1205,7 +1470,7 @@
                 <w:sz w:val="18"/>
                 <w:szCs w:val="18"/>
               </w:rPr>
-              <w:t xml:space="preserve">刷新 SOC/电流/额定值、在线数、最大SOC</w:t>
+              <w:t>刷新 SOC/电流/额定值、在线数、最大SOC</w:t>
             </w:r>
           </w:p>
         </w:tc>
@@ -1226,12 +1491,28 @@
                 <w:sz w:val="18"/>
                 <w:szCs w:val="18"/>
               </w:rPr>
-              <w:t xml:space="preserve">S3/S4/S5/S6(按定时器)</w:t>
+              <w:t>S3/S4/S5/S6(按定时器)</w:t>
             </w:r>
           </w:p>
         </w:tc>
       </w:tr>
       <w:tr>
+        <w:tblPrEx>
+          <w:tblBorders>
+            <w:top w:val="single" w:color="CCCCCC" w:sz="4" w:space="0"/>
+            <w:left w:val="single" w:color="CCCCCC" w:sz="4" w:space="0"/>
+            <w:bottom w:val="single" w:color="CCCCCC" w:sz="4" w:space="0"/>
+            <w:right w:val="single" w:color="CCCCCC" w:sz="4" w:space="0"/>
+            <w:insideH w:val="single" w:color="CCCCCC" w:sz="4" w:space="0"/>
+            <w:insideV w:val="single" w:color="CCCCCC" w:sz="4" w:space="0"/>
+          </w:tblBorders>
+          <w:tblCellMar>
+            <w:top w:w="0" w:type="dxa"/>
+            <w:left w:w="10" w:type="dxa"/>
+            <w:bottom w:w="0" w:type="dxa"/>
+            <w:right w:w="10" w:type="dxa"/>
+          </w:tblCellMar>
+        </w:tblPrEx>
         <w:tc>
           <w:tcPr>
             <w:tcW w:w="1700" w:type="dxa"/>
@@ -1249,7 +1530,7 @@
                 <w:sz w:val="18"/>
                 <w:szCs w:val="18"/>
               </w:rPr>
-              <w:t xml:space="preserve">S2 数据采集</w:t>
+              <w:t>S2 数据采集</w:t>
             </w:r>
           </w:p>
         </w:tc>
@@ -1270,7 +1551,7 @@
                 <w:sz w:val="18"/>
                 <w:szCs w:val="18"/>
               </w:rPr>
-              <w:t xml:space="preserve">某设备 LostTime≥6</w:t>
+              <w:t>某设备 LostTime≥6</w:t>
             </w:r>
           </w:p>
         </w:tc>
@@ -1291,7 +1572,7 @@
                 <w:sz w:val="18"/>
                 <w:szCs w:val="18"/>
               </w:rPr>
-              <w:t xml:space="preserve">清零该设备数据</w:t>
+              <w:t>清零该设备数据</w:t>
             </w:r>
           </w:p>
         </w:tc>
@@ -1312,12 +1593,28 @@
                 <w:sz w:val="18"/>
                 <w:szCs w:val="18"/>
               </w:rPr>
-              <w:t xml:space="preserve">S7 失联处理 → S2</w:t>
+              <w:t>S7 失联处理 → S2</w:t>
             </w:r>
           </w:p>
         </w:tc>
       </w:tr>
       <w:tr>
+        <w:tblPrEx>
+          <w:tblBorders>
+            <w:top w:val="single" w:color="CCCCCC" w:sz="4" w:space="0"/>
+            <w:left w:val="single" w:color="CCCCCC" w:sz="4" w:space="0"/>
+            <w:bottom w:val="single" w:color="CCCCCC" w:sz="4" w:space="0"/>
+            <w:right w:val="single" w:color="CCCCCC" w:sz="4" w:space="0"/>
+            <w:insideH w:val="single" w:color="CCCCCC" w:sz="4" w:space="0"/>
+            <w:insideV w:val="single" w:color="CCCCCC" w:sz="4" w:space="0"/>
+          </w:tblBorders>
+          <w:tblCellMar>
+            <w:top w:w="0" w:type="dxa"/>
+            <w:left w:w="10" w:type="dxa"/>
+            <w:bottom w:w="0" w:type="dxa"/>
+            <w:right w:w="10" w:type="dxa"/>
+          </w:tblCellMar>
+        </w:tblPrEx>
         <w:tc>
           <w:tcPr>
             <w:tcW w:w="1700" w:type="dxa"/>
@@ -1335,7 +1632,7 @@
                 <w:sz w:val="18"/>
                 <w:szCs w:val="18"/>
               </w:rPr>
-              <w:t xml:space="preserve">S3 使能广播</w:t>
+              <w:t>S3 使能广播</w:t>
             </w:r>
           </w:p>
         </w:tc>
@@ -1356,7 +1653,7 @@
                 <w:sz w:val="18"/>
                 <w:szCs w:val="18"/>
               </w:rPr>
-              <w:t xml:space="preserve">t200ms≥10000(10s)</w:t>
+              <w:t>t200ms≥1000(1s)</w:t>
             </w:r>
           </w:p>
         </w:tc>
@@ -1377,7 +1674,7 @@
                 <w:sz w:val="18"/>
                 <w:szCs w:val="18"/>
               </w:rPr>
-              <w:t xml:space="preserve">vcu_canbox_mode → 0x1806E640</w:t>
+              <w:t>vcu_canbox_mode → 0x1806E640</w:t>
             </w:r>
           </w:p>
         </w:tc>
@@ -1398,12 +1695,28 @@
                 <w:sz w:val="18"/>
                 <w:szCs w:val="18"/>
               </w:rPr>
-              <w:t xml:space="preserve">S2 数据采集</w:t>
+              <w:t>S2 数据采集</w:t>
             </w:r>
           </w:p>
         </w:tc>
       </w:tr>
       <w:tr>
+        <w:tblPrEx>
+          <w:tblBorders>
+            <w:top w:val="single" w:color="CCCCCC" w:sz="4" w:space="0"/>
+            <w:left w:val="single" w:color="CCCCCC" w:sz="4" w:space="0"/>
+            <w:bottom w:val="single" w:color="CCCCCC" w:sz="4" w:space="0"/>
+            <w:right w:val="single" w:color="CCCCCC" w:sz="4" w:space="0"/>
+            <w:insideH w:val="single" w:color="CCCCCC" w:sz="4" w:space="0"/>
+            <w:insideV w:val="single" w:color="CCCCCC" w:sz="4" w:space="0"/>
+          </w:tblBorders>
+          <w:tblCellMar>
+            <w:top w:w="0" w:type="dxa"/>
+            <w:left w:w="10" w:type="dxa"/>
+            <w:bottom w:w="0" w:type="dxa"/>
+            <w:right w:w="10" w:type="dxa"/>
+          </w:tblCellMar>
+        </w:tblPrEx>
         <w:tc>
           <w:tcPr>
             <w:tcW w:w="1700" w:type="dxa"/>
@@ -1421,7 +1734,7 @@
                 <w:sz w:val="18"/>
                 <w:szCs w:val="18"/>
               </w:rPr>
-              <w:t xml:space="preserve">S4 总功率测算</w:t>
+              <w:t>S4 总功率测算</w:t>
             </w:r>
           </w:p>
         </w:tc>
@@ -1442,7 +1755,7 @@
                 <w:sz w:val="18"/>
                 <w:szCs w:val="18"/>
               </w:rPr>
-              <w:t xml:space="preserve">t500ms≥5000(5s)</w:t>
+              <w:t>t500ms≥5000(5s)</w:t>
             </w:r>
           </w:p>
         </w:tc>
@@ -1463,7 +1776,7 @@
                 <w:sz w:val="18"/>
                 <w:szCs w:val="18"/>
               </w:rPr>
-              <w:t xml:space="preserve">算 total_power_all</w:t>
+              <w:t>算 total_power_all</w:t>
             </w:r>
           </w:p>
         </w:tc>
@@ -1484,12 +1797,28 @@
                 <w:sz w:val="18"/>
                 <w:szCs w:val="18"/>
               </w:rPr>
-              <w:t xml:space="preserve">S5 分配决策</w:t>
+              <w:t>S5 分配决策</w:t>
             </w:r>
           </w:p>
         </w:tc>
       </w:tr>
       <w:tr>
+        <w:tblPrEx>
+          <w:tblBorders>
+            <w:top w:val="single" w:color="CCCCCC" w:sz="4" w:space="0"/>
+            <w:left w:val="single" w:color="CCCCCC" w:sz="4" w:space="0"/>
+            <w:bottom w:val="single" w:color="CCCCCC" w:sz="4" w:space="0"/>
+            <w:right w:val="single" w:color="CCCCCC" w:sz="4" w:space="0"/>
+            <w:insideH w:val="single" w:color="CCCCCC" w:sz="4" w:space="0"/>
+            <w:insideV w:val="single" w:color="CCCCCC" w:sz="4" w:space="0"/>
+          </w:tblBorders>
+          <w:tblCellMar>
+            <w:top w:w="0" w:type="dxa"/>
+            <w:left w:w="10" w:type="dxa"/>
+            <w:bottom w:w="0" w:type="dxa"/>
+            <w:right w:w="10" w:type="dxa"/>
+          </w:tblCellMar>
+        </w:tblPrEx>
         <w:tc>
           <w:tcPr>
             <w:tcW w:w="1700" w:type="dxa"/>
@@ -1507,7 +1836,7 @@
                 <w:sz w:val="18"/>
                 <w:szCs w:val="18"/>
               </w:rPr>
-              <w:t xml:space="preserve">S5 分配决策</w:t>
+              <w:t>S5 分配决策</w:t>
             </w:r>
           </w:p>
         </w:tc>
@@ -1528,7 +1857,7 @@
                 <w:sz w:val="18"/>
                 <w:szCs w:val="18"/>
               </w:rPr>
-              <w:t xml:space="preserve">power ≥ total_power_all</w:t>
+              <w:t>power ≥ total_power_all</w:t>
             </w:r>
           </w:p>
         </w:tc>
@@ -1549,7 +1878,7 @@
                 <w:sz w:val="18"/>
                 <w:szCs w:val="18"/>
               </w:rPr>
-              <w:t xml:space="preserve">全部 out_cur=额定</w:t>
+              <w:t>全部 out_cur=额定</w:t>
             </w:r>
           </w:p>
         </w:tc>
@@ -1570,12 +1899,28 @@
                 <w:sz w:val="18"/>
                 <w:szCs w:val="18"/>
               </w:rPr>
-              <w:t xml:space="preserve">S6 逐设备下发</w:t>
+              <w:t>S6 逐设备下发</w:t>
             </w:r>
           </w:p>
         </w:tc>
       </w:tr>
       <w:tr>
+        <w:tblPrEx>
+          <w:tblBorders>
+            <w:top w:val="single" w:color="CCCCCC" w:sz="4" w:space="0"/>
+            <w:left w:val="single" w:color="CCCCCC" w:sz="4" w:space="0"/>
+            <w:bottom w:val="single" w:color="CCCCCC" w:sz="4" w:space="0"/>
+            <w:right w:val="single" w:color="CCCCCC" w:sz="4" w:space="0"/>
+            <w:insideH w:val="single" w:color="CCCCCC" w:sz="4" w:space="0"/>
+            <w:insideV w:val="single" w:color="CCCCCC" w:sz="4" w:space="0"/>
+          </w:tblBorders>
+          <w:tblCellMar>
+            <w:top w:w="0" w:type="dxa"/>
+            <w:left w:w="10" w:type="dxa"/>
+            <w:bottom w:w="0" w:type="dxa"/>
+            <w:right w:w="10" w:type="dxa"/>
+          </w:tblCellMar>
+        </w:tblPrEx>
         <w:tc>
           <w:tcPr>
             <w:tcW w:w="1700" w:type="dxa"/>
@@ -1593,7 +1938,7 @@
                 <w:sz w:val="18"/>
                 <w:szCs w:val="18"/>
               </w:rPr>
-              <w:t xml:space="preserve">S5 分配决策</w:t>
+              <w:t>S5 分配决策</w:t>
             </w:r>
           </w:p>
         </w:tc>
@@ -1614,7 +1959,7 @@
                 <w:sz w:val="18"/>
                 <w:szCs w:val="18"/>
               </w:rPr>
-              <w:t xml:space="preserve">power &lt; total_power_all</w:t>
+              <w:t>power &lt; total_power_all</w:t>
             </w:r>
           </w:p>
         </w:tc>
@@ -1635,7 +1980,7 @@
                 <w:sz w:val="18"/>
                 <w:szCs w:val="18"/>
               </w:rPr>
-              <w:t xml:space="preserve">按 SOC 排序动态分配剩余功率</w:t>
+              <w:t>按 SOC 排序动态分配剩余功率</w:t>
             </w:r>
           </w:p>
         </w:tc>
@@ -1656,12 +2001,28 @@
                 <w:sz w:val="18"/>
                 <w:szCs w:val="18"/>
               </w:rPr>
-              <w:t xml:space="preserve">S6 逐设备下发</w:t>
+              <w:t>S6 逐设备下发</w:t>
             </w:r>
           </w:p>
         </w:tc>
       </w:tr>
       <w:tr>
+        <w:tblPrEx>
+          <w:tblBorders>
+            <w:top w:val="single" w:color="CCCCCC" w:sz="4" w:space="0"/>
+            <w:left w:val="single" w:color="CCCCCC" w:sz="4" w:space="0"/>
+            <w:bottom w:val="single" w:color="CCCCCC" w:sz="4" w:space="0"/>
+            <w:right w:val="single" w:color="CCCCCC" w:sz="4" w:space="0"/>
+            <w:insideH w:val="single" w:color="CCCCCC" w:sz="4" w:space="0"/>
+            <w:insideV w:val="single" w:color="CCCCCC" w:sz="4" w:space="0"/>
+          </w:tblBorders>
+          <w:tblCellMar>
+            <w:top w:w="0" w:type="dxa"/>
+            <w:left w:w="10" w:type="dxa"/>
+            <w:bottom w:w="0" w:type="dxa"/>
+            <w:right w:w="10" w:type="dxa"/>
+          </w:tblCellMar>
+        </w:tblPrEx>
         <w:tc>
           <w:tcPr>
             <w:tcW w:w="1700" w:type="dxa"/>
@@ -1679,7 +2040,7 @@
                 <w:sz w:val="18"/>
                 <w:szCs w:val="18"/>
               </w:rPr>
-              <w:t xml:space="preserve">S6 逐设备下发</w:t>
+              <w:t>S6 逐设备下发</w:t>
             </w:r>
           </w:p>
         </w:tc>
@@ -1700,7 +2061,7 @@
                 <w:sz w:val="18"/>
                 <w:szCs w:val="18"/>
               </w:rPr>
-              <w:t xml:space="preserve">完成遍历发送</w:t>
+              <w:t>完成遍历发送</w:t>
             </w:r>
           </w:p>
         </w:tc>
@@ -1721,7 +2082,7 @@
                 <w:sz w:val="18"/>
                 <w:szCs w:val="18"/>
               </w:rPr>
-              <w:t xml:space="preserve">CanTransmit 各子设备</w:t>
+              <w:t>CanTransmit 各子设备</w:t>
             </w:r>
           </w:p>
         </w:tc>
@@ -1742,7 +2103,7 @@
                 <w:sz w:val="18"/>
                 <w:szCs w:val="18"/>
               </w:rPr>
-              <w:t xml:space="preserve">S2 数据采集</w:t>
+              <w:t>S2 数据采集</w:t>
             </w:r>
           </w:p>
         </w:tc>
@@ -1755,11 +2116,11 @@
       <w:r>
         <w:rPr>
           <w:b/>
+          <w:color w:val="1F3864"/>
           <w:sz w:val="30"/>
           <w:szCs w:val="30"/>
-          <w:color w:val="1F3864"/>
         </w:rPr>
-        <w:t xml:space="preserve">四、状态转移图（主控制状态机）</w:t>
+        <w:t>四、状态转移图（主控制状态机）</w:t>
       </w:r>
     </w:p>
     <w:p>
@@ -1769,21 +2130,45 @@
     </w:p>
     <w:tbl>
       <w:tblPr>
+        <w:tblStyle w:val="2"/>
         <w:tblW w:w="7000" w:type="dxa"/>
+        <w:tblInd w:w="0" w:type="dxa"/>
         <w:tblBorders>
-          <w:top w:val="single" w:sz="6" w:color="2E75B6"/>
-          <w:left w:val="single" w:sz="6" w:color="2E75B6"/>
-          <w:bottom w:val="single" w:sz="6" w:color="2E75B6"/>
-          <w:right w:val="single" w:sz="6" w:color="2E75B6"/>
-          <w:insideH w:val="single" w:sz="6" w:color="2E75B6"/>
-          <w:insideV w:val="single" w:sz="6" w:color="2E75B6"/>
+          <w:top w:val="single" w:color="2E75B6" w:sz="6" w:space="0"/>
+          <w:left w:val="single" w:color="2E75B6" w:sz="6" w:space="0"/>
+          <w:bottom w:val="single" w:color="2E75B6" w:sz="6" w:space="0"/>
+          <w:right w:val="single" w:color="2E75B6" w:sz="6" w:space="0"/>
+          <w:insideH w:val="single" w:color="2E75B6" w:sz="6" w:space="0"/>
+          <w:insideV w:val="single" w:color="2E75B6" w:sz="6" w:space="0"/>
         </w:tblBorders>
-        <w:tblLook w:val="04A0"/>
+        <w:tblLayout w:type="autofit"/>
+        <w:tblCellMar>
+          <w:top w:w="0" w:type="dxa"/>
+          <w:left w:w="10" w:type="dxa"/>
+          <w:bottom w:w="0" w:type="dxa"/>
+          <w:right w:w="10" w:type="dxa"/>
+        </w:tblCellMar>
       </w:tblPr>
       <w:tblGrid>
         <w:gridCol w:w="7000"/>
       </w:tblGrid>
       <w:tr>
+        <w:tblPrEx>
+          <w:tblBorders>
+            <w:top w:val="single" w:color="2E75B6" w:sz="6" w:space="0"/>
+            <w:left w:val="single" w:color="2E75B6" w:sz="6" w:space="0"/>
+            <w:bottom w:val="single" w:color="2E75B6" w:sz="6" w:space="0"/>
+            <w:right w:val="single" w:color="2E75B6" w:sz="6" w:space="0"/>
+            <w:insideH w:val="single" w:color="2E75B6" w:sz="6" w:space="0"/>
+            <w:insideV w:val="single" w:color="2E75B6" w:sz="6" w:space="0"/>
+          </w:tblBorders>
+          <w:tblCellMar>
+            <w:top w:w="0" w:type="dxa"/>
+            <w:left w:w="10" w:type="dxa"/>
+            <w:bottom w:w="0" w:type="dxa"/>
+            <w:right w:w="10" w:type="dxa"/>
+          </w:tblCellMar>
+        </w:tblPrEx>
         <w:tc>
           <w:tcPr>
             <w:tcW w:w="7000" w:type="dxa"/>
@@ -1805,9 +2190,23 @@
                 <w:sz w:val="22"/>
                 <w:szCs w:val="22"/>
               </w:rPr>
-              <w:t xml:space="preserve">S0 初始化</w:t>
-              <w:br/>
-              <w:t xml:space="preserve">CanRamInit()</w:t>
+              <w:t>S0 初始化</w:t>
+            </w:r>
+            <w:r>
+              <w:rPr>
+                <w:b/>
+                <w:sz w:val="22"/>
+                <w:szCs w:val="22"/>
+              </w:rPr>
+              <w:br w:type="textWrapping"/>
+            </w:r>
+            <w:r>
+              <w:rPr>
+                <w:b/>
+                <w:sz w:val="22"/>
+                <w:szCs w:val="22"/>
+              </w:rPr>
+              <w:t>CanRamInit()</w:t>
             </w:r>
           </w:p>
         </w:tc>
@@ -1826,11 +2225,11 @@
       <w:r>
         <w:rPr>
           <w:b/>
+          <w:color w:val="2E75B6"/>
           <w:sz w:val="24"/>
           <w:szCs w:val="24"/>
-          <w:color w:val="2E75B6"/>
         </w:rPr>
-        <w:t xml:space="preserve">↓</w:t>
+        <w:t>↓</w:t>
       </w:r>
     </w:p>
     <w:p>
@@ -1840,21 +2239,45 @@
     </w:p>
     <w:tbl>
       <w:tblPr>
+        <w:tblStyle w:val="2"/>
         <w:tblW w:w="7000" w:type="dxa"/>
+        <w:tblInd w:w="0" w:type="dxa"/>
         <w:tblBorders>
-          <w:top w:val="single" w:sz="6" w:color="2E75B6"/>
-          <w:left w:val="single" w:sz="6" w:color="2E75B6"/>
-          <w:bottom w:val="single" w:sz="6" w:color="2E75B6"/>
-          <w:right w:val="single" w:sz="6" w:color="2E75B6"/>
-          <w:insideH w:val="single" w:sz="6" w:color="2E75B6"/>
-          <w:insideV w:val="single" w:sz="6" w:color="2E75B6"/>
+          <w:top w:val="single" w:color="2E75B6" w:sz="6" w:space="0"/>
+          <w:left w:val="single" w:color="2E75B6" w:sz="6" w:space="0"/>
+          <w:bottom w:val="single" w:color="2E75B6" w:sz="6" w:space="0"/>
+          <w:right w:val="single" w:color="2E75B6" w:sz="6" w:space="0"/>
+          <w:insideH w:val="single" w:color="2E75B6" w:sz="6" w:space="0"/>
+          <w:insideV w:val="single" w:color="2E75B6" w:sz="6" w:space="0"/>
         </w:tblBorders>
-        <w:tblLook w:val="04A0"/>
+        <w:tblLayout w:type="autofit"/>
+        <w:tblCellMar>
+          <w:top w:w="0" w:type="dxa"/>
+          <w:left w:w="10" w:type="dxa"/>
+          <w:bottom w:w="0" w:type="dxa"/>
+          <w:right w:w="10" w:type="dxa"/>
+        </w:tblCellMar>
       </w:tblPr>
       <w:tblGrid>
         <w:gridCol w:w="7000"/>
       </w:tblGrid>
       <w:tr>
+        <w:tblPrEx>
+          <w:tblBorders>
+            <w:top w:val="single" w:color="2E75B6" w:sz="6" w:space="0"/>
+            <w:left w:val="single" w:color="2E75B6" w:sz="6" w:space="0"/>
+            <w:bottom w:val="single" w:color="2E75B6" w:sz="6" w:space="0"/>
+            <w:right w:val="single" w:color="2E75B6" w:sz="6" w:space="0"/>
+            <w:insideH w:val="single" w:color="2E75B6" w:sz="6" w:space="0"/>
+            <w:insideV w:val="single" w:color="2E75B6" w:sz="6" w:space="0"/>
+          </w:tblBorders>
+          <w:tblCellMar>
+            <w:top w:w="0" w:type="dxa"/>
+            <w:left w:w="10" w:type="dxa"/>
+            <w:bottom w:w="0" w:type="dxa"/>
+            <w:right w:w="10" w:type="dxa"/>
+          </w:tblCellMar>
+        </w:tblPrEx>
         <w:tc>
           <w:tcPr>
             <w:tcW w:w="7000" w:type="dxa"/>
@@ -1876,13 +2299,55 @@
                 <w:sz w:val="22"/>
                 <w:szCs w:val="22"/>
               </w:rPr>
-              <w:t xml:space="preserve">S1 总线监测</w:t>
-              <w:br/>
-              <w:t xml:space="preserve">CanRecoveryProc()</w:t>
-              <w:br/>
-              <w:t xml:space="preserve">BUSOFF_NONE / SLOW / QUICK</w:t>
-              <w:br/>
-              <w:t xml:space="preserve">MISS_ACK_NONE / TIMEOUT / RECOVERY</w:t>
+              <w:t>S1 总线监测</w:t>
+            </w:r>
+            <w:r>
+              <w:rPr>
+                <w:b/>
+                <w:sz w:val="22"/>
+                <w:szCs w:val="22"/>
+              </w:rPr>
+              <w:br w:type="textWrapping"/>
+            </w:r>
+            <w:r>
+              <w:rPr>
+                <w:b/>
+                <w:sz w:val="22"/>
+                <w:szCs w:val="22"/>
+              </w:rPr>
+              <w:t>CanRecoveryProc()</w:t>
+            </w:r>
+            <w:r>
+              <w:rPr>
+                <w:b/>
+                <w:sz w:val="22"/>
+                <w:szCs w:val="22"/>
+              </w:rPr>
+              <w:br w:type="textWrapping"/>
+            </w:r>
+            <w:r>
+              <w:rPr>
+                <w:b/>
+                <w:sz w:val="22"/>
+                <w:szCs w:val="22"/>
+              </w:rPr>
+              <w:t>BUSOFF_NONE / SLOW / QUICK</w:t>
+            </w:r>
+            <w:r>
+              <w:rPr>
+                <w:b/>
+                <w:sz w:val="22"/>
+                <w:szCs w:val="22"/>
+              </w:rPr>
+              <w:br w:type="textWrapping"/>
+            </w:r>
+            <w:r>
+              <w:rPr>
+                <w:b/>
+                <w:sz w:val="22"/>
+                <w:szCs w:val="22"/>
+              </w:rPr>
+              <w:t>MISS_ACK_NONE / TIMEOUT / RECOVERY</w:t>
             </w:r>
           </w:p>
         </w:tc>
@@ -1901,11 +2366,11 @@
       <w:r>
         <w:rPr>
           <w:b/>
+          <w:color w:val="2E75B6"/>
           <w:sz w:val="24"/>
           <w:szCs w:val="24"/>
-          <w:color w:val="2E75B6"/>
         </w:rPr>
-        <w:t xml:space="preserve">↓</w:t>
+        <w:t>↓</w:t>
       </w:r>
     </w:p>
     <w:p>
@@ -1915,21 +2380,45 @@
     </w:p>
     <w:tbl>
       <w:tblPr>
+        <w:tblStyle w:val="2"/>
         <w:tblW w:w="7000" w:type="dxa"/>
+        <w:tblInd w:w="0" w:type="dxa"/>
         <w:tblBorders>
-          <w:top w:val="single" w:sz="6" w:color="2E75B6"/>
-          <w:left w:val="single" w:sz="6" w:color="2E75B6"/>
-          <w:bottom w:val="single" w:sz="6" w:color="2E75B6"/>
-          <w:right w:val="single" w:sz="6" w:color="2E75B6"/>
-          <w:insideH w:val="single" w:sz="6" w:color="2E75B6"/>
-          <w:insideV w:val="single" w:sz="6" w:color="2E75B6"/>
+          <w:top w:val="single" w:color="2E75B6" w:sz="6" w:space="0"/>
+          <w:left w:val="single" w:color="2E75B6" w:sz="6" w:space="0"/>
+          <w:bottom w:val="single" w:color="2E75B6" w:sz="6" w:space="0"/>
+          <w:right w:val="single" w:color="2E75B6" w:sz="6" w:space="0"/>
+          <w:insideH w:val="single" w:color="2E75B6" w:sz="6" w:space="0"/>
+          <w:insideV w:val="single" w:color="2E75B6" w:sz="6" w:space="0"/>
         </w:tblBorders>
-        <w:tblLook w:val="04A0"/>
+        <w:tblLayout w:type="autofit"/>
+        <w:tblCellMar>
+          <w:top w:w="0" w:type="dxa"/>
+          <w:left w:w="10" w:type="dxa"/>
+          <w:bottom w:w="0" w:type="dxa"/>
+          <w:right w:w="10" w:type="dxa"/>
+        </w:tblCellMar>
       </w:tblPr>
       <w:tblGrid>
         <w:gridCol w:w="7000"/>
       </w:tblGrid>
       <w:tr>
+        <w:tblPrEx>
+          <w:tblBorders>
+            <w:top w:val="single" w:color="2E75B6" w:sz="6" w:space="0"/>
+            <w:left w:val="single" w:color="2E75B6" w:sz="6" w:space="0"/>
+            <w:bottom w:val="single" w:color="2E75B6" w:sz="6" w:space="0"/>
+            <w:right w:val="single" w:color="2E75B6" w:sz="6" w:space="0"/>
+            <w:insideH w:val="single" w:color="2E75B6" w:sz="6" w:space="0"/>
+            <w:insideV w:val="single" w:color="2E75B6" w:sz="6" w:space="0"/>
+          </w:tblBorders>
+          <w:tblCellMar>
+            <w:top w:w="0" w:type="dxa"/>
+            <w:left w:w="10" w:type="dxa"/>
+            <w:bottom w:w="0" w:type="dxa"/>
+            <w:right w:w="10" w:type="dxa"/>
+          </w:tblCellMar>
+        </w:tblPrEx>
         <w:tc>
           <w:tcPr>
             <w:tcW w:w="7000" w:type="dxa"/>
@@ -1951,11 +2440,39 @@
                 <w:sz w:val="22"/>
                 <w:szCs w:val="22"/>
               </w:rPr>
-              <w:t xml:space="preserve">S2 数据采集</w:t>
-              <w:br/>
-              <w:t xml:space="preserve">刷新 Soc / 电流 / 额定值</w:t>
-              <w:br/>
-              <w:t xml:space="preserve">统计在线数 &amp; 最大SOC</w:t>
+              <w:t>S2 数据采集</w:t>
+            </w:r>
+            <w:r>
+              <w:rPr>
+                <w:b/>
+                <w:sz w:val="22"/>
+                <w:szCs w:val="22"/>
+              </w:rPr>
+              <w:br w:type="textWrapping"/>
+            </w:r>
+            <w:r>
+              <w:rPr>
+                <w:b/>
+                <w:sz w:val="22"/>
+                <w:szCs w:val="22"/>
+              </w:rPr>
+              <w:t>刷新 Soc / 电流 / 额定值</w:t>
+            </w:r>
+            <w:r>
+              <w:rPr>
+                <w:b/>
+                <w:sz w:val="22"/>
+                <w:szCs w:val="22"/>
+              </w:rPr>
+              <w:br w:type="textWrapping"/>
+            </w:r>
+            <w:r>
+              <w:rPr>
+                <w:b/>
+                <w:sz w:val="22"/>
+                <w:szCs w:val="22"/>
+              </w:rPr>
+              <w:t>统计在线数 &amp; 最大SOC</w:t>
             </w:r>
           </w:p>
         </w:tc>
@@ -1974,11 +2491,11 @@
       <w:r>
         <w:rPr>
           <w:b/>
+          <w:color w:val="2E75B6"/>
           <w:sz w:val="24"/>
           <w:szCs w:val="24"/>
-          <w:color w:val="2E75B6"/>
         </w:rPr>
-        <w:t xml:space="preserve">每周期</w:t>
+        <w:t>每周期</w:t>
       </w:r>
     </w:p>
     <w:p>
@@ -1988,21 +2505,45 @@
     </w:p>
     <w:tbl>
       <w:tblPr>
+        <w:tblStyle w:val="2"/>
         <w:tblW w:w="7000" w:type="dxa"/>
+        <w:tblInd w:w="0" w:type="dxa"/>
         <w:tblBorders>
-          <w:top w:val="single" w:sz="6" w:color="2E75B6"/>
-          <w:left w:val="single" w:sz="6" w:color="2E75B6"/>
-          <w:bottom w:val="single" w:sz="6" w:color="2E75B6"/>
-          <w:right w:val="single" w:sz="6" w:color="2E75B6"/>
-          <w:insideH w:val="single" w:sz="6" w:color="2E75B6"/>
-          <w:insideV w:val="single" w:sz="6" w:color="2E75B6"/>
+          <w:top w:val="single" w:color="2E75B6" w:sz="6" w:space="0"/>
+          <w:left w:val="single" w:color="2E75B6" w:sz="6" w:space="0"/>
+          <w:bottom w:val="single" w:color="2E75B6" w:sz="6" w:space="0"/>
+          <w:right w:val="single" w:color="2E75B6" w:sz="6" w:space="0"/>
+          <w:insideH w:val="single" w:color="2E75B6" w:sz="6" w:space="0"/>
+          <w:insideV w:val="single" w:color="2E75B6" w:sz="6" w:space="0"/>
         </w:tblBorders>
-        <w:tblLook w:val="04A0"/>
+        <w:tblLayout w:type="autofit"/>
+        <w:tblCellMar>
+          <w:top w:w="0" w:type="dxa"/>
+          <w:left w:w="10" w:type="dxa"/>
+          <w:bottom w:w="0" w:type="dxa"/>
+          <w:right w:w="10" w:type="dxa"/>
+        </w:tblCellMar>
       </w:tblPr>
       <w:tblGrid>
         <w:gridCol w:w="7000"/>
       </w:tblGrid>
       <w:tr>
+        <w:tblPrEx>
+          <w:tblBorders>
+            <w:top w:val="single" w:color="2E75B6" w:sz="6" w:space="0"/>
+            <w:left w:val="single" w:color="2E75B6" w:sz="6" w:space="0"/>
+            <w:bottom w:val="single" w:color="2E75B6" w:sz="6" w:space="0"/>
+            <w:right w:val="single" w:color="2E75B6" w:sz="6" w:space="0"/>
+            <w:insideH w:val="single" w:color="2E75B6" w:sz="6" w:space="0"/>
+            <w:insideV w:val="single" w:color="2E75B6" w:sz="6" w:space="0"/>
+          </w:tblBorders>
+          <w:tblCellMar>
+            <w:top w:w="0" w:type="dxa"/>
+            <w:left w:w="10" w:type="dxa"/>
+            <w:bottom w:w="0" w:type="dxa"/>
+            <w:right w:w="10" w:type="dxa"/>
+          </w:tblCellMar>
+        </w:tblPrEx>
         <w:tc>
           <w:tcPr>
             <w:tcW w:w="7000" w:type="dxa"/>
@@ -2024,7 +2565,7 @@
                 <w:sz w:val="22"/>
                 <w:szCs w:val="22"/>
               </w:rPr>
-              <w:t xml:space="preserve">定时器分支判断</w:t>
+              <w:t>定时器分支判断</w:t>
             </w:r>
           </w:p>
         </w:tc>
@@ -2043,11 +2584,11 @@
       <w:r>
         <w:rPr>
           <w:b/>
+          <w:color w:val="2E75B6"/>
           <w:sz w:val="24"/>
           <w:szCs w:val="24"/>
-          <w:color w:val="2E75B6"/>
         </w:rPr>
-        <w:t xml:space="preserve">t200ms≥10s (10s)</w:t>
+        <w:t>t200ms≥1s (1s)</w:t>
       </w:r>
     </w:p>
     <w:p>
@@ -2057,21 +2598,45 @@
     </w:p>
     <w:tbl>
       <w:tblPr>
+        <w:tblStyle w:val="2"/>
         <w:tblW w:w="7000" w:type="dxa"/>
+        <w:tblInd w:w="0" w:type="dxa"/>
         <w:tblBorders>
-          <w:top w:val="single" w:sz="6" w:color="2E75B6"/>
-          <w:left w:val="single" w:sz="6" w:color="2E75B6"/>
-          <w:bottom w:val="single" w:sz="6" w:color="2E75B6"/>
-          <w:right w:val="single" w:sz="6" w:color="2E75B6"/>
-          <w:insideH w:val="single" w:sz="6" w:color="2E75B6"/>
-          <w:insideV w:val="single" w:sz="6" w:color="2E75B6"/>
+          <w:top w:val="single" w:color="2E75B6" w:sz="6" w:space="0"/>
+          <w:left w:val="single" w:color="2E75B6" w:sz="6" w:space="0"/>
+          <w:bottom w:val="single" w:color="2E75B6" w:sz="6" w:space="0"/>
+          <w:right w:val="single" w:color="2E75B6" w:sz="6" w:space="0"/>
+          <w:insideH w:val="single" w:color="2E75B6" w:sz="6" w:space="0"/>
+          <w:insideV w:val="single" w:color="2E75B6" w:sz="6" w:space="0"/>
         </w:tblBorders>
-        <w:tblLook w:val="04A0"/>
+        <w:tblLayout w:type="autofit"/>
+        <w:tblCellMar>
+          <w:top w:w="0" w:type="dxa"/>
+          <w:left w:w="10" w:type="dxa"/>
+          <w:bottom w:w="0" w:type="dxa"/>
+          <w:right w:w="10" w:type="dxa"/>
+        </w:tblCellMar>
       </w:tblPr>
       <w:tblGrid>
         <w:gridCol w:w="7000"/>
       </w:tblGrid>
       <w:tr>
+        <w:tblPrEx>
+          <w:tblBorders>
+            <w:top w:val="single" w:color="2E75B6" w:sz="6" w:space="0"/>
+            <w:left w:val="single" w:color="2E75B6" w:sz="6" w:space="0"/>
+            <w:bottom w:val="single" w:color="2E75B6" w:sz="6" w:space="0"/>
+            <w:right w:val="single" w:color="2E75B6" w:sz="6" w:space="0"/>
+            <w:insideH w:val="single" w:color="2E75B6" w:sz="6" w:space="0"/>
+            <w:insideV w:val="single" w:color="2E75B6" w:sz="6" w:space="0"/>
+          </w:tblBorders>
+          <w:tblCellMar>
+            <w:top w:w="0" w:type="dxa"/>
+            <w:left w:w="10" w:type="dxa"/>
+            <w:bottom w:w="0" w:type="dxa"/>
+            <w:right w:w="10" w:type="dxa"/>
+          </w:tblCellMar>
+        </w:tblPrEx>
         <w:tc>
           <w:tcPr>
             <w:tcW w:w="7000" w:type="dxa"/>
@@ -2093,11 +2658,39 @@
                 <w:sz w:val="22"/>
                 <w:szCs w:val="22"/>
               </w:rPr>
-              <w:t xml:space="preserve">S3 使能广播</w:t>
-              <w:br/>
-              <w:t xml:space="preserve">vcu_canbox_mode → 0x1806E640</w:t>
-              <w:br/>
-              <w:t xml:space="preserve">PaygGetPayState 门控 / power&gt;1.0 使能</w:t>
+              <w:t>S3 使能广播</w:t>
+            </w:r>
+            <w:r>
+              <w:rPr>
+                <w:b/>
+                <w:sz w:val="22"/>
+                <w:szCs w:val="22"/>
+              </w:rPr>
+              <w:br w:type="textWrapping"/>
+            </w:r>
+            <w:r>
+              <w:rPr>
+                <w:b/>
+                <w:sz w:val="22"/>
+                <w:szCs w:val="22"/>
+              </w:rPr>
+              <w:t>vcu_canbox_mode → 0x1806E640</w:t>
+            </w:r>
+            <w:r>
+              <w:rPr>
+                <w:b/>
+                <w:sz w:val="22"/>
+                <w:szCs w:val="22"/>
+              </w:rPr>
+              <w:br w:type="textWrapping"/>
+            </w:r>
+            <w:r>
+              <w:rPr>
+                <w:b/>
+                <w:sz w:val="22"/>
+                <w:szCs w:val="22"/>
+              </w:rPr>
+              <w:t>PaygGetPayState 门控 / power&gt;1.0 使能</w:t>
             </w:r>
           </w:p>
         </w:tc>
@@ -2116,11 +2709,11 @@
       <w:r>
         <w:rPr>
           <w:b/>
+          <w:color w:val="2E75B6"/>
           <w:sz w:val="24"/>
           <w:szCs w:val="24"/>
-          <w:color w:val="2E75B6"/>
         </w:rPr>
-        <w:t xml:space="preserve">t500ms≥5s (5s)</w:t>
+        <w:t>t500ms≥5s (5s)</w:t>
       </w:r>
     </w:p>
     <w:p>
@@ -2130,21 +2723,45 @@
     </w:p>
     <w:tbl>
       <w:tblPr>
+        <w:tblStyle w:val="2"/>
         <w:tblW w:w="7000" w:type="dxa"/>
+        <w:tblInd w:w="0" w:type="dxa"/>
         <w:tblBorders>
-          <w:top w:val="single" w:sz="6" w:color="2E75B6"/>
-          <w:left w:val="single" w:sz="6" w:color="2E75B6"/>
-          <w:bottom w:val="single" w:sz="6" w:color="2E75B6"/>
-          <w:right w:val="single" w:sz="6" w:color="2E75B6"/>
-          <w:insideH w:val="single" w:sz="6" w:color="2E75B6"/>
-          <w:insideV w:val="single" w:sz="6" w:color="2E75B6"/>
+          <w:top w:val="single" w:color="2E75B6" w:sz="6" w:space="0"/>
+          <w:left w:val="single" w:color="2E75B6" w:sz="6" w:space="0"/>
+          <w:bottom w:val="single" w:color="2E75B6" w:sz="6" w:space="0"/>
+          <w:right w:val="single" w:color="2E75B6" w:sz="6" w:space="0"/>
+          <w:insideH w:val="single" w:color="2E75B6" w:sz="6" w:space="0"/>
+          <w:insideV w:val="single" w:color="2E75B6" w:sz="6" w:space="0"/>
         </w:tblBorders>
-        <w:tblLook w:val="04A0"/>
+        <w:tblLayout w:type="autofit"/>
+        <w:tblCellMar>
+          <w:top w:w="0" w:type="dxa"/>
+          <w:left w:w="10" w:type="dxa"/>
+          <w:bottom w:w="0" w:type="dxa"/>
+          <w:right w:w="10" w:type="dxa"/>
+        </w:tblCellMar>
       </w:tblPr>
       <w:tblGrid>
         <w:gridCol w:w="7000"/>
       </w:tblGrid>
       <w:tr>
+        <w:tblPrEx>
+          <w:tblBorders>
+            <w:top w:val="single" w:color="2E75B6" w:sz="6" w:space="0"/>
+            <w:left w:val="single" w:color="2E75B6" w:sz="6" w:space="0"/>
+            <w:bottom w:val="single" w:color="2E75B6" w:sz="6" w:space="0"/>
+            <w:right w:val="single" w:color="2E75B6" w:sz="6" w:space="0"/>
+            <w:insideH w:val="single" w:color="2E75B6" w:sz="6" w:space="0"/>
+            <w:insideV w:val="single" w:color="2E75B6" w:sz="6" w:space="0"/>
+          </w:tblBorders>
+          <w:tblCellMar>
+            <w:top w:w="0" w:type="dxa"/>
+            <w:left w:w="10" w:type="dxa"/>
+            <w:bottom w:w="0" w:type="dxa"/>
+            <w:right w:w="10" w:type="dxa"/>
+          </w:tblCellMar>
+        </w:tblPrEx>
         <w:tc>
           <w:tcPr>
             <w:tcW w:w="7000" w:type="dxa"/>
@@ -2166,9 +2783,23 @@
                 <w:sz w:val="22"/>
                 <w:szCs w:val="22"/>
               </w:rPr>
-              <w:t xml:space="preserve">S4 总功率测算</w:t>
-              <w:br/>
-              <w:t xml:space="preserve">total_power_all = Σ(ap×cur)/1e7</w:t>
+              <w:t>S4 总功率测算</w:t>
+            </w:r>
+            <w:r>
+              <w:rPr>
+                <w:b/>
+                <w:sz w:val="22"/>
+                <w:szCs w:val="22"/>
+              </w:rPr>
+              <w:br w:type="textWrapping"/>
+            </w:r>
+            <w:r>
+              <w:rPr>
+                <w:b/>
+                <w:sz w:val="22"/>
+                <w:szCs w:val="22"/>
+              </w:rPr>
+              <w:t>total_power_all = Σ(ap×cur)/1e7</w:t>
             </w:r>
           </w:p>
         </w:tc>
@@ -2187,11 +2818,11 @@
       <w:r>
         <w:rPr>
           <w:b/>
+          <w:color w:val="2E75B6"/>
           <w:sz w:val="24"/>
           <w:szCs w:val="24"/>
-          <w:color w:val="2E75B6"/>
         </w:rPr>
-        <w:t xml:space="preserve">↓</w:t>
+        <w:t>↓</w:t>
       </w:r>
     </w:p>
     <w:p>
@@ -2201,21 +2832,45 @@
     </w:p>
     <w:tbl>
       <w:tblPr>
+        <w:tblStyle w:val="2"/>
         <w:tblW w:w="7000" w:type="dxa"/>
+        <w:tblInd w:w="0" w:type="dxa"/>
         <w:tblBorders>
-          <w:top w:val="single" w:sz="6" w:color="2E75B6"/>
-          <w:left w:val="single" w:sz="6" w:color="2E75B6"/>
-          <w:bottom w:val="single" w:sz="6" w:color="2E75B6"/>
-          <w:right w:val="single" w:sz="6" w:color="2E75B6"/>
-          <w:insideH w:val="single" w:sz="6" w:color="2E75B6"/>
-          <w:insideV w:val="single" w:sz="6" w:color="2E75B6"/>
+          <w:top w:val="single" w:color="2E75B6" w:sz="6" w:space="0"/>
+          <w:left w:val="single" w:color="2E75B6" w:sz="6" w:space="0"/>
+          <w:bottom w:val="single" w:color="2E75B6" w:sz="6" w:space="0"/>
+          <w:right w:val="single" w:color="2E75B6" w:sz="6" w:space="0"/>
+          <w:insideH w:val="single" w:color="2E75B6" w:sz="6" w:space="0"/>
+          <w:insideV w:val="single" w:color="2E75B6" w:sz="6" w:space="0"/>
         </w:tblBorders>
-        <w:tblLook w:val="04A0"/>
+        <w:tblLayout w:type="autofit"/>
+        <w:tblCellMar>
+          <w:top w:w="0" w:type="dxa"/>
+          <w:left w:w="10" w:type="dxa"/>
+          <w:bottom w:w="0" w:type="dxa"/>
+          <w:right w:w="10" w:type="dxa"/>
+        </w:tblCellMar>
       </w:tblPr>
       <w:tblGrid>
         <w:gridCol w:w="7000"/>
       </w:tblGrid>
       <w:tr>
+        <w:tblPrEx>
+          <w:tblBorders>
+            <w:top w:val="single" w:color="2E75B6" w:sz="6" w:space="0"/>
+            <w:left w:val="single" w:color="2E75B6" w:sz="6" w:space="0"/>
+            <w:bottom w:val="single" w:color="2E75B6" w:sz="6" w:space="0"/>
+            <w:right w:val="single" w:color="2E75B6" w:sz="6" w:space="0"/>
+            <w:insideH w:val="single" w:color="2E75B6" w:sz="6" w:space="0"/>
+            <w:insideV w:val="single" w:color="2E75B6" w:sz="6" w:space="0"/>
+          </w:tblBorders>
+          <w:tblCellMar>
+            <w:top w:w="0" w:type="dxa"/>
+            <w:left w:w="10" w:type="dxa"/>
+            <w:bottom w:w="0" w:type="dxa"/>
+            <w:right w:w="10" w:type="dxa"/>
+          </w:tblCellMar>
+        </w:tblPrEx>
         <w:tc>
           <w:tcPr>
             <w:tcW w:w="7000" w:type="dxa"/>
@@ -2237,9 +2892,23 @@
                 <w:sz w:val="22"/>
                 <w:szCs w:val="22"/>
               </w:rPr>
-              <w:t xml:space="preserve">S5 分配决策</w:t>
-              <w:br/>
-              <w:t xml:space="preserve">power ≥ total_power_all ?</w:t>
+              <w:t>S5 分配决策</w:t>
+            </w:r>
+            <w:r>
+              <w:rPr>
+                <w:b/>
+                <w:sz w:val="22"/>
+                <w:szCs w:val="22"/>
+              </w:rPr>
+              <w:br w:type="textWrapping"/>
+            </w:r>
+            <w:r>
+              <w:rPr>
+                <w:b/>
+                <w:sz w:val="22"/>
+                <w:szCs w:val="22"/>
+              </w:rPr>
+              <w:t>power ≥ total_power_all ?</w:t>
             </w:r>
           </w:p>
         </w:tc>
@@ -2258,11 +2927,11 @@
       <w:r>
         <w:rPr>
           <w:b/>
+          <w:color w:val="2E75B6"/>
           <w:sz w:val="24"/>
           <w:szCs w:val="24"/>
-          <w:color w:val="2E75B6"/>
         </w:rPr>
-        <w:t xml:space="preserve">是（充足）</w:t>
+        <w:t>是（充足）</w:t>
       </w:r>
     </w:p>
     <w:p>
@@ -2272,21 +2941,45 @@
     </w:p>
     <w:tbl>
       <w:tblPr>
+        <w:tblStyle w:val="2"/>
         <w:tblW w:w="7000" w:type="dxa"/>
+        <w:tblInd w:w="0" w:type="dxa"/>
         <w:tblBorders>
-          <w:top w:val="single" w:sz="6" w:color="2E75B6"/>
-          <w:left w:val="single" w:sz="6" w:color="2E75B6"/>
-          <w:bottom w:val="single" w:sz="6" w:color="2E75B6"/>
-          <w:right w:val="single" w:sz="6" w:color="2E75B6"/>
-          <w:insideH w:val="single" w:sz="6" w:color="2E75B6"/>
-          <w:insideV w:val="single" w:sz="6" w:color="2E75B6"/>
+          <w:top w:val="single" w:color="2E75B6" w:sz="6" w:space="0"/>
+          <w:left w:val="single" w:color="2E75B6" w:sz="6" w:space="0"/>
+          <w:bottom w:val="single" w:color="2E75B6" w:sz="6" w:space="0"/>
+          <w:right w:val="single" w:color="2E75B6" w:sz="6" w:space="0"/>
+          <w:insideH w:val="single" w:color="2E75B6" w:sz="6" w:space="0"/>
+          <w:insideV w:val="single" w:color="2E75B6" w:sz="6" w:space="0"/>
         </w:tblBorders>
-        <w:tblLook w:val="04A0"/>
+        <w:tblLayout w:type="autofit"/>
+        <w:tblCellMar>
+          <w:top w:w="0" w:type="dxa"/>
+          <w:left w:w="10" w:type="dxa"/>
+          <w:bottom w:w="0" w:type="dxa"/>
+          <w:right w:w="10" w:type="dxa"/>
+        </w:tblCellMar>
       </w:tblPr>
       <w:tblGrid>
         <w:gridCol w:w="7000"/>
       </w:tblGrid>
       <w:tr>
+        <w:tblPrEx>
+          <w:tblBorders>
+            <w:top w:val="single" w:color="2E75B6" w:sz="6" w:space="0"/>
+            <w:left w:val="single" w:color="2E75B6" w:sz="6" w:space="0"/>
+            <w:bottom w:val="single" w:color="2E75B6" w:sz="6" w:space="0"/>
+            <w:right w:val="single" w:color="2E75B6" w:sz="6" w:space="0"/>
+            <w:insideH w:val="single" w:color="2E75B6" w:sz="6" w:space="0"/>
+            <w:insideV w:val="single" w:color="2E75B6" w:sz="6" w:space="0"/>
+          </w:tblBorders>
+          <w:tblCellMar>
+            <w:top w:w="0" w:type="dxa"/>
+            <w:left w:w="10" w:type="dxa"/>
+            <w:bottom w:w="0" w:type="dxa"/>
+            <w:right w:w="10" w:type="dxa"/>
+          </w:tblCellMar>
+        </w:tblPrEx>
         <w:tc>
           <w:tcPr>
             <w:tcW w:w="7000" w:type="dxa"/>
@@ -2308,9 +3001,23 @@
                 <w:sz w:val="22"/>
                 <w:szCs w:val="22"/>
               </w:rPr>
-              <w:t xml:space="preserve">全额定下发</w:t>
-              <w:br/>
-              <w:t xml:space="preserve">out_cur[i] = ap_cur[i]</w:t>
+              <w:t>全额定下发</w:t>
+            </w:r>
+            <w:r>
+              <w:rPr>
+                <w:b/>
+                <w:sz w:val="22"/>
+                <w:szCs w:val="22"/>
+              </w:rPr>
+              <w:br w:type="textWrapping"/>
+            </w:r>
+            <w:r>
+              <w:rPr>
+                <w:b/>
+                <w:sz w:val="22"/>
+                <w:szCs w:val="22"/>
+              </w:rPr>
+              <w:t>out_cur[i] = ap_cur[i]</w:t>
             </w:r>
           </w:p>
         </w:tc>
@@ -2329,11 +3036,11 @@
       <w:r>
         <w:rPr>
           <w:b/>
+          <w:color w:val="2E75B6"/>
           <w:sz w:val="24"/>
           <w:szCs w:val="24"/>
-          <w:color w:val="2E75B6"/>
         </w:rPr>
-        <w:t xml:space="preserve">否（不足）</w:t>
+        <w:t>否（不足）</w:t>
       </w:r>
     </w:p>
     <w:p>
@@ -2343,21 +3050,45 @@
     </w:p>
     <w:tbl>
       <w:tblPr>
+        <w:tblStyle w:val="2"/>
         <w:tblW w:w="7000" w:type="dxa"/>
+        <w:tblInd w:w="0" w:type="dxa"/>
         <w:tblBorders>
-          <w:top w:val="single" w:sz="6" w:color="2E75B6"/>
-          <w:left w:val="single" w:sz="6" w:color="2E75B6"/>
-          <w:bottom w:val="single" w:sz="6" w:color="2E75B6"/>
-          <w:right w:val="single" w:sz="6" w:color="2E75B6"/>
-          <w:insideH w:val="single" w:sz="6" w:color="2E75B6"/>
-          <w:insideV w:val="single" w:sz="6" w:color="2E75B6"/>
+          <w:top w:val="single" w:color="2E75B6" w:sz="6" w:space="0"/>
+          <w:left w:val="single" w:color="2E75B6" w:sz="6" w:space="0"/>
+          <w:bottom w:val="single" w:color="2E75B6" w:sz="6" w:space="0"/>
+          <w:right w:val="single" w:color="2E75B6" w:sz="6" w:space="0"/>
+          <w:insideH w:val="single" w:color="2E75B6" w:sz="6" w:space="0"/>
+          <w:insideV w:val="single" w:color="2E75B6" w:sz="6" w:space="0"/>
         </w:tblBorders>
-        <w:tblLook w:val="04A0"/>
+        <w:tblLayout w:type="autofit"/>
+        <w:tblCellMar>
+          <w:top w:w="0" w:type="dxa"/>
+          <w:left w:w="10" w:type="dxa"/>
+          <w:bottom w:w="0" w:type="dxa"/>
+          <w:right w:w="10" w:type="dxa"/>
+        </w:tblCellMar>
       </w:tblPr>
       <w:tblGrid>
         <w:gridCol w:w="7000"/>
       </w:tblGrid>
       <w:tr>
+        <w:tblPrEx>
+          <w:tblBorders>
+            <w:top w:val="single" w:color="2E75B6" w:sz="6" w:space="0"/>
+            <w:left w:val="single" w:color="2E75B6" w:sz="6" w:space="0"/>
+            <w:bottom w:val="single" w:color="2E75B6" w:sz="6" w:space="0"/>
+            <w:right w:val="single" w:color="2E75B6" w:sz="6" w:space="0"/>
+            <w:insideH w:val="single" w:color="2E75B6" w:sz="6" w:space="0"/>
+            <w:insideV w:val="single" w:color="2E75B6" w:sz="6" w:space="0"/>
+          </w:tblBorders>
+          <w:tblCellMar>
+            <w:top w:w="0" w:type="dxa"/>
+            <w:left w:w="10" w:type="dxa"/>
+            <w:bottom w:w="0" w:type="dxa"/>
+            <w:right w:w="10" w:type="dxa"/>
+          </w:tblCellMar>
+        </w:tblPrEx>
         <w:tc>
           <w:tcPr>
             <w:tcW w:w="7000" w:type="dxa"/>
@@ -2379,11 +3110,39 @@
                 <w:sz w:val="22"/>
                 <w:szCs w:val="22"/>
               </w:rPr>
-              <w:t xml:space="preserve">按 SOC 从大到小</w:t>
-              <w:br/>
-              <w:t xml:space="preserve">动态分配剩余功率</w:t>
-              <w:br/>
-              <w:t xml:space="preserve">电流 = 剩余 / 额定电压</w:t>
+              <w:t>按 SOC 从大到小</w:t>
+            </w:r>
+            <w:r>
+              <w:rPr>
+                <w:b/>
+                <w:sz w:val="22"/>
+                <w:szCs w:val="22"/>
+              </w:rPr>
+              <w:br w:type="textWrapping"/>
+            </w:r>
+            <w:r>
+              <w:rPr>
+                <w:b/>
+                <w:sz w:val="22"/>
+                <w:szCs w:val="22"/>
+              </w:rPr>
+              <w:t>动态分配剩余功率</w:t>
+            </w:r>
+            <w:r>
+              <w:rPr>
+                <w:b/>
+                <w:sz w:val="22"/>
+                <w:szCs w:val="22"/>
+              </w:rPr>
+              <w:br w:type="textWrapping"/>
+            </w:r>
+            <w:r>
+              <w:rPr>
+                <w:b/>
+                <w:sz w:val="22"/>
+                <w:szCs w:val="22"/>
+              </w:rPr>
+              <w:t>电流 = 剩余 / 额定电压</w:t>
             </w:r>
           </w:p>
         </w:tc>
@@ -2402,11 +3161,11 @@
       <w:r>
         <w:rPr>
           <w:b/>
+          <w:color w:val="2E75B6"/>
           <w:sz w:val="24"/>
           <w:szCs w:val="24"/>
-          <w:color w:val="2E75B6"/>
         </w:rPr>
-        <w:t xml:space="preserve">↓</w:t>
+        <w:t>↓</w:t>
       </w:r>
     </w:p>
     <w:p>
@@ -2416,21 +3175,45 @@
     </w:p>
     <w:tbl>
       <w:tblPr>
+        <w:tblStyle w:val="2"/>
         <w:tblW w:w="7000" w:type="dxa"/>
+        <w:tblInd w:w="0" w:type="dxa"/>
         <w:tblBorders>
-          <w:top w:val="single" w:sz="6" w:color="2E75B6"/>
-          <w:left w:val="single" w:sz="6" w:color="2E75B6"/>
-          <w:bottom w:val="single" w:sz="6" w:color="2E75B6"/>
-          <w:right w:val="single" w:sz="6" w:color="2E75B6"/>
-          <w:insideH w:val="single" w:sz="6" w:color="2E75B6"/>
-          <w:insideV w:val="single" w:sz="6" w:color="2E75B6"/>
+          <w:top w:val="single" w:color="2E75B6" w:sz="6" w:space="0"/>
+          <w:left w:val="single" w:color="2E75B6" w:sz="6" w:space="0"/>
+          <w:bottom w:val="single" w:color="2E75B6" w:sz="6" w:space="0"/>
+          <w:right w:val="single" w:color="2E75B6" w:sz="6" w:space="0"/>
+          <w:insideH w:val="single" w:color="2E75B6" w:sz="6" w:space="0"/>
+          <w:insideV w:val="single" w:color="2E75B6" w:sz="6" w:space="0"/>
         </w:tblBorders>
-        <w:tblLook w:val="04A0"/>
+        <w:tblLayout w:type="autofit"/>
+        <w:tblCellMar>
+          <w:top w:w="0" w:type="dxa"/>
+          <w:left w:w="10" w:type="dxa"/>
+          <w:bottom w:w="0" w:type="dxa"/>
+          <w:right w:w="10" w:type="dxa"/>
+        </w:tblCellMar>
       </w:tblPr>
       <w:tblGrid>
         <w:gridCol w:w="7000"/>
       </w:tblGrid>
       <w:tr>
+        <w:tblPrEx>
+          <w:tblBorders>
+            <w:top w:val="single" w:color="2E75B6" w:sz="6" w:space="0"/>
+            <w:left w:val="single" w:color="2E75B6" w:sz="6" w:space="0"/>
+            <w:bottom w:val="single" w:color="2E75B6" w:sz="6" w:space="0"/>
+            <w:right w:val="single" w:color="2E75B6" w:sz="6" w:space="0"/>
+            <w:insideH w:val="single" w:color="2E75B6" w:sz="6" w:space="0"/>
+            <w:insideV w:val="single" w:color="2E75B6" w:sz="6" w:space="0"/>
+          </w:tblBorders>
+          <w:tblCellMar>
+            <w:top w:w="0" w:type="dxa"/>
+            <w:left w:w="10" w:type="dxa"/>
+            <w:bottom w:w="0" w:type="dxa"/>
+            <w:right w:w="10" w:type="dxa"/>
+          </w:tblCellMar>
+        </w:tblPrEx>
         <w:tc>
           <w:tcPr>
             <w:tcW w:w="7000" w:type="dxa"/>
@@ -2452,13 +3235,55 @@
                 <w:sz w:val="22"/>
                 <w:szCs w:val="22"/>
               </w:rPr>
-              <w:t xml:space="preserve">S6 逐设备下发</w:t>
-              <w:br/>
-              <w:t xml:space="preserve">candi = 0x1803F000 + i</w:t>
-              <w:br/>
-              <w:t xml:space="preserve">电压=额定, 电流=分配</w:t>
-              <w:br/>
-              <w:t xml:space="preserve">ChargeEnable=(power&gt;1.0 &amp;&amp; cur&gt;0)?0x55:0</w:t>
+              <w:t>S6 逐设备下发</w:t>
+            </w:r>
+            <w:r>
+              <w:rPr>
+                <w:b/>
+                <w:sz w:val="22"/>
+                <w:szCs w:val="22"/>
+              </w:rPr>
+              <w:br w:type="textWrapping"/>
+            </w:r>
+            <w:r>
+              <w:rPr>
+                <w:b/>
+                <w:sz w:val="22"/>
+                <w:szCs w:val="22"/>
+              </w:rPr>
+              <w:t>candi = 0x1803F000 + i</w:t>
+            </w:r>
+            <w:r>
+              <w:rPr>
+                <w:b/>
+                <w:sz w:val="22"/>
+                <w:szCs w:val="22"/>
+              </w:rPr>
+              <w:br w:type="textWrapping"/>
+            </w:r>
+            <w:r>
+              <w:rPr>
+                <w:b/>
+                <w:sz w:val="22"/>
+                <w:szCs w:val="22"/>
+              </w:rPr>
+              <w:t>电压=额定, 电流=分配</w:t>
+            </w:r>
+            <w:r>
+              <w:rPr>
+                <w:b/>
+                <w:sz w:val="22"/>
+                <w:szCs w:val="22"/>
+              </w:rPr>
+              <w:br w:type="textWrapping"/>
+            </w:r>
+            <w:r>
+              <w:rPr>
+                <w:b/>
+                <w:sz w:val="22"/>
+                <w:szCs w:val="22"/>
+              </w:rPr>
+              <w:t>ChargeEnable=(power&gt;1.0 &amp;&amp; cur&gt;0)?0x55:0</w:t>
             </w:r>
           </w:p>
         </w:tc>
@@ -2477,11 +3302,11 @@
       <w:r>
         <w:rPr>
           <w:b/>
+          <w:color w:val="2E75B6"/>
           <w:sz w:val="24"/>
           <w:szCs w:val="24"/>
-          <w:color w:val="2E75B6"/>
         </w:rPr>
-        <w:t xml:space="preserve">回到 S2</w:t>
+        <w:t>回到 S2</w:t>
       </w:r>
     </w:p>
     <w:p>
@@ -2491,11 +3316,11 @@
       <w:r>
         <w:rPr>
           <w:b/>
+          <w:color w:val="1F3864"/>
           <w:sz w:val="26"/>
           <w:szCs w:val="26"/>
-          <w:color w:val="1F3864"/>
         </w:rPr>
-        <w:t xml:space="preserve">四-B、CAN 总线离线恢复子状态机（S1 守卫）</w:t>
+        <w:t>四-B、CAN 总线离线恢复子状态机（S1 守卫）</w:t>
       </w:r>
     </w:p>
     <w:p>
@@ -2505,21 +3330,45 @@
     </w:p>
     <w:tbl>
       <w:tblPr>
+        <w:tblStyle w:val="2"/>
         <w:tblW w:w="7000" w:type="dxa"/>
+        <w:tblInd w:w="0" w:type="dxa"/>
         <w:tblBorders>
-          <w:top w:val="single" w:sz="6" w:color="2E75B6"/>
-          <w:left w:val="single" w:sz="6" w:color="2E75B6"/>
-          <w:bottom w:val="single" w:sz="6" w:color="2E75B6"/>
-          <w:right w:val="single" w:sz="6" w:color="2E75B6"/>
-          <w:insideH w:val="single" w:sz="6" w:color="2E75B6"/>
-          <w:insideV w:val="single" w:sz="6" w:color="2E75B6"/>
+          <w:top w:val="single" w:color="2E75B6" w:sz="6" w:space="0"/>
+          <w:left w:val="single" w:color="2E75B6" w:sz="6" w:space="0"/>
+          <w:bottom w:val="single" w:color="2E75B6" w:sz="6" w:space="0"/>
+          <w:right w:val="single" w:color="2E75B6" w:sz="6" w:space="0"/>
+          <w:insideH w:val="single" w:color="2E75B6" w:sz="6" w:space="0"/>
+          <w:insideV w:val="single" w:color="2E75B6" w:sz="6" w:space="0"/>
         </w:tblBorders>
-        <w:tblLook w:val="04A0"/>
+        <w:tblLayout w:type="autofit"/>
+        <w:tblCellMar>
+          <w:top w:w="0" w:type="dxa"/>
+          <w:left w:w="10" w:type="dxa"/>
+          <w:bottom w:w="0" w:type="dxa"/>
+          <w:right w:w="10" w:type="dxa"/>
+        </w:tblCellMar>
       </w:tblPr>
       <w:tblGrid>
         <w:gridCol w:w="7000"/>
       </w:tblGrid>
       <w:tr>
+        <w:tblPrEx>
+          <w:tblBorders>
+            <w:top w:val="single" w:color="2E75B6" w:sz="6" w:space="0"/>
+            <w:left w:val="single" w:color="2E75B6" w:sz="6" w:space="0"/>
+            <w:bottom w:val="single" w:color="2E75B6" w:sz="6" w:space="0"/>
+            <w:right w:val="single" w:color="2E75B6" w:sz="6" w:space="0"/>
+            <w:insideH w:val="single" w:color="2E75B6" w:sz="6" w:space="0"/>
+            <w:insideV w:val="single" w:color="2E75B6" w:sz="6" w:space="0"/>
+          </w:tblBorders>
+          <w:tblCellMar>
+            <w:top w:w="0" w:type="dxa"/>
+            <w:left w:w="10" w:type="dxa"/>
+            <w:bottom w:w="0" w:type="dxa"/>
+            <w:right w:w="10" w:type="dxa"/>
+          </w:tblCellMar>
+        </w:tblPrEx>
         <w:tc>
           <w:tcPr>
             <w:tcW w:w="7000" w:type="dxa"/>
@@ -2541,9 +3390,23 @@
                 <w:sz w:val="22"/>
                 <w:szCs w:val="22"/>
               </w:rPr>
-              <w:t xml:space="preserve">BUSOFF_NONE</w:t>
-              <w:br/>
-              <w:t xml:space="preserve">(总线正常, tx_disable=FALSE)</w:t>
+              <w:t>BUSOFF_NONE</w:t>
+            </w:r>
+            <w:r>
+              <w:rPr>
+                <w:b/>
+                <w:sz w:val="22"/>
+                <w:szCs w:val="22"/>
+              </w:rPr>
+              <w:br w:type="textWrapping"/>
+            </w:r>
+            <w:r>
+              <w:rPr>
+                <w:b/>
+                <w:sz w:val="22"/>
+                <w:szCs w:val="22"/>
+              </w:rPr>
+              <w:t>(总线正常, tx_disable=FALSE)</w:t>
             </w:r>
           </w:p>
         </w:tc>
@@ -2562,11 +3425,11 @@
       <w:r>
         <w:rPr>
           <w:b/>
+          <w:color w:val="2E75B6"/>
           <w:sz w:val="24"/>
           <w:szCs w:val="24"/>
-          <w:color w:val="2E75B6"/>
         </w:rPr>
-        <w:t xml:space="preserve">检测到 BUS-OFF 错误 (CAN_ERR_BOERR)</w:t>
+        <w:t>检测到 BUS-OFF 错误 (CAN_ERR_BOERR)</w:t>
       </w:r>
     </w:p>
     <w:p>
@@ -2576,21 +3439,45 @@
     </w:p>
     <w:tbl>
       <w:tblPr>
+        <w:tblStyle w:val="2"/>
         <w:tblW w:w="7000" w:type="dxa"/>
+        <w:tblInd w:w="0" w:type="dxa"/>
         <w:tblBorders>
-          <w:top w:val="single" w:sz="6" w:color="2E75B6"/>
-          <w:left w:val="single" w:sz="6" w:color="2E75B6"/>
-          <w:bottom w:val="single" w:sz="6" w:color="2E75B6"/>
-          <w:right w:val="single" w:sz="6" w:color="2E75B6"/>
-          <w:insideH w:val="single" w:sz="6" w:color="2E75B6"/>
-          <w:insideV w:val="single" w:sz="6" w:color="2E75B6"/>
+          <w:top w:val="single" w:color="2E75B6" w:sz="6" w:space="0"/>
+          <w:left w:val="single" w:color="2E75B6" w:sz="6" w:space="0"/>
+          <w:bottom w:val="single" w:color="2E75B6" w:sz="6" w:space="0"/>
+          <w:right w:val="single" w:color="2E75B6" w:sz="6" w:space="0"/>
+          <w:insideH w:val="single" w:color="2E75B6" w:sz="6" w:space="0"/>
+          <w:insideV w:val="single" w:color="2E75B6" w:sz="6" w:space="0"/>
         </w:tblBorders>
-        <w:tblLook w:val="04A0"/>
+        <w:tblLayout w:type="autofit"/>
+        <w:tblCellMar>
+          <w:top w:w="0" w:type="dxa"/>
+          <w:left w:w="10" w:type="dxa"/>
+          <w:bottom w:w="0" w:type="dxa"/>
+          <w:right w:w="10" w:type="dxa"/>
+        </w:tblCellMar>
       </w:tblPr>
       <w:tblGrid>
         <w:gridCol w:w="7000"/>
       </w:tblGrid>
       <w:tr>
+        <w:tblPrEx>
+          <w:tblBorders>
+            <w:top w:val="single" w:color="2E75B6" w:sz="6" w:space="0"/>
+            <w:left w:val="single" w:color="2E75B6" w:sz="6" w:space="0"/>
+            <w:bottom w:val="single" w:color="2E75B6" w:sz="6" w:space="0"/>
+            <w:right w:val="single" w:color="2E75B6" w:sz="6" w:space="0"/>
+            <w:insideH w:val="single" w:color="2E75B6" w:sz="6" w:space="0"/>
+            <w:insideV w:val="single" w:color="2E75B6" w:sz="6" w:space="0"/>
+          </w:tblBorders>
+          <w:tblCellMar>
+            <w:top w:w="0" w:type="dxa"/>
+            <w:left w:w="10" w:type="dxa"/>
+            <w:bottom w:w="0" w:type="dxa"/>
+            <w:right w:w="10" w:type="dxa"/>
+          </w:tblCellMar>
+        </w:tblPrEx>
         <w:tc>
           <w:tcPr>
             <w:tcW w:w="7000" w:type="dxa"/>
@@ -2612,9 +3499,23 @@
                 <w:sz w:val="22"/>
                 <w:szCs w:val="22"/>
               </w:rPr>
-              <w:t xml:space="preserve">BUSOFF_QUICK</w:t>
-              <w:br/>
-              <w:t xml:space="preserve">(counter&lt;5, 快恢复 100ms)</w:t>
+              <w:t>BUSOFF_QUICK</w:t>
+            </w:r>
+            <w:r>
+              <w:rPr>
+                <w:b/>
+                <w:sz w:val="22"/>
+                <w:szCs w:val="22"/>
+              </w:rPr>
+              <w:br w:type="textWrapping"/>
+            </w:r>
+            <w:r>
+              <w:rPr>
+                <w:b/>
+                <w:sz w:val="22"/>
+                <w:szCs w:val="22"/>
+              </w:rPr>
+              <w:t>(counter&lt;5, 快恢复 100ms)</w:t>
             </w:r>
           </w:p>
         </w:tc>
@@ -2633,11 +3534,11 @@
       <w:r>
         <w:rPr>
           <w:b/>
+          <w:color w:val="2E75B6"/>
           <w:sz w:val="24"/>
           <w:szCs w:val="24"/>
-          <w:color w:val="2E75B6"/>
         </w:rPr>
-        <w:t xml:space="preserve">busoff_counter≥5</w:t>
+        <w:t>busoff_counter≥5</w:t>
       </w:r>
     </w:p>
     <w:p>
@@ -2647,21 +3548,45 @@
     </w:p>
     <w:tbl>
       <w:tblPr>
+        <w:tblStyle w:val="2"/>
         <w:tblW w:w="7000" w:type="dxa"/>
+        <w:tblInd w:w="0" w:type="dxa"/>
         <w:tblBorders>
-          <w:top w:val="single" w:sz="6" w:color="2E75B6"/>
-          <w:left w:val="single" w:sz="6" w:color="2E75B6"/>
-          <w:bottom w:val="single" w:sz="6" w:color="2E75B6"/>
-          <w:right w:val="single" w:sz="6" w:color="2E75B6"/>
-          <w:insideH w:val="single" w:sz="6" w:color="2E75B6"/>
-          <w:insideV w:val="single" w:sz="6" w:color="2E75B6"/>
+          <w:top w:val="single" w:color="2E75B6" w:sz="6" w:space="0"/>
+          <w:left w:val="single" w:color="2E75B6" w:sz="6" w:space="0"/>
+          <w:bottom w:val="single" w:color="2E75B6" w:sz="6" w:space="0"/>
+          <w:right w:val="single" w:color="2E75B6" w:sz="6" w:space="0"/>
+          <w:insideH w:val="single" w:color="2E75B6" w:sz="6" w:space="0"/>
+          <w:insideV w:val="single" w:color="2E75B6" w:sz="6" w:space="0"/>
         </w:tblBorders>
-        <w:tblLook w:val="04A0"/>
+        <w:tblLayout w:type="autofit"/>
+        <w:tblCellMar>
+          <w:top w:w="0" w:type="dxa"/>
+          <w:left w:w="10" w:type="dxa"/>
+          <w:bottom w:w="0" w:type="dxa"/>
+          <w:right w:w="10" w:type="dxa"/>
+        </w:tblCellMar>
       </w:tblPr>
       <w:tblGrid>
         <w:gridCol w:w="7000"/>
       </w:tblGrid>
       <w:tr>
+        <w:tblPrEx>
+          <w:tblBorders>
+            <w:top w:val="single" w:color="2E75B6" w:sz="6" w:space="0"/>
+            <w:left w:val="single" w:color="2E75B6" w:sz="6" w:space="0"/>
+            <w:bottom w:val="single" w:color="2E75B6" w:sz="6" w:space="0"/>
+            <w:right w:val="single" w:color="2E75B6" w:sz="6" w:space="0"/>
+            <w:insideH w:val="single" w:color="2E75B6" w:sz="6" w:space="0"/>
+            <w:insideV w:val="single" w:color="2E75B6" w:sz="6" w:space="0"/>
+          </w:tblBorders>
+          <w:tblCellMar>
+            <w:top w:w="0" w:type="dxa"/>
+            <w:left w:w="10" w:type="dxa"/>
+            <w:bottom w:w="0" w:type="dxa"/>
+            <w:right w:w="10" w:type="dxa"/>
+          </w:tblCellMar>
+        </w:tblPrEx>
         <w:tc>
           <w:tcPr>
             <w:tcW w:w="7000" w:type="dxa"/>
@@ -2683,9 +3608,23 @@
                 <w:sz w:val="22"/>
                 <w:szCs w:val="22"/>
               </w:rPr>
-              <w:t xml:space="preserve">BUSOFF_SLOW</w:t>
-              <w:br/>
-              <w:t xml:space="preserve">(慢恢复 1000ms)</w:t>
+              <w:t>BUSOFF_SLOW</w:t>
+            </w:r>
+            <w:r>
+              <w:rPr>
+                <w:b/>
+                <w:sz w:val="22"/>
+                <w:szCs w:val="22"/>
+              </w:rPr>
+              <w:br w:type="textWrapping"/>
+            </w:r>
+            <w:r>
+              <w:rPr>
+                <w:b/>
+                <w:sz w:val="22"/>
+                <w:szCs w:val="22"/>
+              </w:rPr>
+              <w:t>(慢恢复 1000ms)</w:t>
             </w:r>
           </w:p>
         </w:tc>
@@ -2704,11 +3643,11 @@
       <w:r>
         <w:rPr>
           <w:b/>
+          <w:color w:val="2E75B6"/>
           <w:sz w:val="24"/>
           <w:szCs w:val="24"/>
-          <w:color w:val="2E75B6"/>
         </w:rPr>
-        <w:t xml:space="preserve">↓</w:t>
+        <w:t>↓</w:t>
       </w:r>
     </w:p>
     <w:p>
@@ -2718,21 +3657,45 @@
     </w:p>
     <w:tbl>
       <w:tblPr>
+        <w:tblStyle w:val="2"/>
         <w:tblW w:w="7000" w:type="dxa"/>
+        <w:tblInd w:w="0" w:type="dxa"/>
         <w:tblBorders>
-          <w:top w:val="single" w:sz="6" w:color="2E75B6"/>
-          <w:left w:val="single" w:sz="6" w:color="2E75B6"/>
-          <w:bottom w:val="single" w:sz="6" w:color="2E75B6"/>
-          <w:right w:val="single" w:sz="6" w:color="2E75B6"/>
-          <w:insideH w:val="single" w:sz="6" w:color="2E75B6"/>
-          <w:insideV w:val="single" w:sz="6" w:color="2E75B6"/>
+          <w:top w:val="single" w:color="2E75B6" w:sz="6" w:space="0"/>
+          <w:left w:val="single" w:color="2E75B6" w:sz="6" w:space="0"/>
+          <w:bottom w:val="single" w:color="2E75B6" w:sz="6" w:space="0"/>
+          <w:right w:val="single" w:color="2E75B6" w:sz="6" w:space="0"/>
+          <w:insideH w:val="single" w:color="2E75B6" w:sz="6" w:space="0"/>
+          <w:insideV w:val="single" w:color="2E75B6" w:sz="6" w:space="0"/>
         </w:tblBorders>
-        <w:tblLook w:val="04A0"/>
+        <w:tblLayout w:type="autofit"/>
+        <w:tblCellMar>
+          <w:top w:w="0" w:type="dxa"/>
+          <w:left w:w="10" w:type="dxa"/>
+          <w:bottom w:w="0" w:type="dxa"/>
+          <w:right w:w="10" w:type="dxa"/>
+        </w:tblCellMar>
       </w:tblPr>
       <w:tblGrid>
         <w:gridCol w:w="7000"/>
       </w:tblGrid>
       <w:tr>
+        <w:tblPrEx>
+          <w:tblBorders>
+            <w:top w:val="single" w:color="2E75B6" w:sz="6" w:space="0"/>
+            <w:left w:val="single" w:color="2E75B6" w:sz="6" w:space="0"/>
+            <w:bottom w:val="single" w:color="2E75B6" w:sz="6" w:space="0"/>
+            <w:right w:val="single" w:color="2E75B6" w:sz="6" w:space="0"/>
+            <w:insideH w:val="single" w:color="2E75B6" w:sz="6" w:space="0"/>
+            <w:insideV w:val="single" w:color="2E75B6" w:sz="6" w:space="0"/>
+          </w:tblBorders>
+          <w:tblCellMar>
+            <w:top w:w="0" w:type="dxa"/>
+            <w:left w:w="10" w:type="dxa"/>
+            <w:bottom w:w="0" w:type="dxa"/>
+            <w:right w:w="10" w:type="dxa"/>
+          </w:tblCellMar>
+        </w:tblPrEx>
         <w:tc>
           <w:tcPr>
             <w:tcW w:w="7000" w:type="dxa"/>
@@ -2754,11 +3717,39 @@
                 <w:sz w:val="22"/>
                 <w:szCs w:val="22"/>
               </w:rPr>
-              <w:t xml:space="preserve">超时后重新初始化 CAN</w:t>
-              <w:br/>
-              <w:t xml:space="preserve">清 BOERR, tx_disable=FALSE</w:t>
-              <w:br/>
-              <w:t xml:space="preserve">busoff_state=NONE</w:t>
+              <w:t>超时后重新初始化 CAN</w:t>
+            </w:r>
+            <w:r>
+              <w:rPr>
+                <w:b/>
+                <w:sz w:val="22"/>
+                <w:szCs w:val="22"/>
+              </w:rPr>
+              <w:br w:type="textWrapping"/>
+            </w:r>
+            <w:r>
+              <w:rPr>
+                <w:b/>
+                <w:sz w:val="22"/>
+                <w:szCs w:val="22"/>
+              </w:rPr>
+              <w:t>清 BOERR, tx_disable=FALSE</w:t>
+            </w:r>
+            <w:r>
+              <w:rPr>
+                <w:b/>
+                <w:sz w:val="22"/>
+                <w:szCs w:val="22"/>
+              </w:rPr>
+              <w:br w:type="textWrapping"/>
+            </w:r>
+            <w:r>
+              <w:rPr>
+                <w:b/>
+                <w:sz w:val="22"/>
+                <w:szCs w:val="22"/>
+              </w:rPr>
+              <w:t>busoff_state=NONE</w:t>
             </w:r>
           </w:p>
         </w:tc>
@@ -2777,11 +3768,11 @@
       <w:r>
         <w:rPr>
           <w:b/>
+          <w:color w:val="2E75B6"/>
           <w:sz w:val="24"/>
           <w:szCs w:val="24"/>
-          <w:color w:val="2E75B6"/>
         </w:rPr>
-        <w:t xml:space="preserve">恢复</w:t>
+        <w:t>恢复</w:t>
       </w:r>
     </w:p>
     <w:p>
@@ -2791,21 +3782,45 @@
     </w:p>
     <w:tbl>
       <w:tblPr>
+        <w:tblStyle w:val="2"/>
         <w:tblW w:w="7000" w:type="dxa"/>
+        <w:tblInd w:w="0" w:type="dxa"/>
         <w:tblBorders>
-          <w:top w:val="single" w:sz="6" w:color="2E75B6"/>
-          <w:left w:val="single" w:sz="6" w:color="2E75B6"/>
-          <w:bottom w:val="single" w:sz="6" w:color="2E75B6"/>
-          <w:right w:val="single" w:sz="6" w:color="2E75B6"/>
-          <w:insideH w:val="single" w:sz="6" w:color="2E75B6"/>
-          <w:insideV w:val="single" w:sz="6" w:color="2E75B6"/>
+          <w:top w:val="single" w:color="2E75B6" w:sz="6" w:space="0"/>
+          <w:left w:val="single" w:color="2E75B6" w:sz="6" w:space="0"/>
+          <w:bottom w:val="single" w:color="2E75B6" w:sz="6" w:space="0"/>
+          <w:right w:val="single" w:color="2E75B6" w:sz="6" w:space="0"/>
+          <w:insideH w:val="single" w:color="2E75B6" w:sz="6" w:space="0"/>
+          <w:insideV w:val="single" w:color="2E75B6" w:sz="6" w:space="0"/>
         </w:tblBorders>
-        <w:tblLook w:val="04A0"/>
+        <w:tblLayout w:type="autofit"/>
+        <w:tblCellMar>
+          <w:top w:w="0" w:type="dxa"/>
+          <w:left w:w="10" w:type="dxa"/>
+          <w:bottom w:w="0" w:type="dxa"/>
+          <w:right w:w="10" w:type="dxa"/>
+        </w:tblCellMar>
       </w:tblPr>
       <w:tblGrid>
         <w:gridCol w:w="7000"/>
       </w:tblGrid>
       <w:tr>
+        <w:tblPrEx>
+          <w:tblBorders>
+            <w:top w:val="single" w:color="2E75B6" w:sz="6" w:space="0"/>
+            <w:left w:val="single" w:color="2E75B6" w:sz="6" w:space="0"/>
+            <w:bottom w:val="single" w:color="2E75B6" w:sz="6" w:space="0"/>
+            <w:right w:val="single" w:color="2E75B6" w:sz="6" w:space="0"/>
+            <w:insideH w:val="single" w:color="2E75B6" w:sz="6" w:space="0"/>
+            <w:insideV w:val="single" w:color="2E75B6" w:sz="6" w:space="0"/>
+          </w:tblBorders>
+          <w:tblCellMar>
+            <w:top w:w="0" w:type="dxa"/>
+            <w:left w:w="10" w:type="dxa"/>
+            <w:bottom w:w="0" w:type="dxa"/>
+            <w:right w:w="10" w:type="dxa"/>
+          </w:tblCellMar>
+        </w:tblPrEx>
         <w:tc>
           <w:tcPr>
             <w:tcW w:w="7000" w:type="dxa"/>
@@ -2827,11 +3842,39 @@
                 <w:sz w:val="22"/>
                 <w:szCs w:val="22"/>
               </w:rPr>
-              <w:t xml:space="preserve">MISS_ACK_NONE → MISS_ACK_TIMEOUT</w:t>
-              <w:br/>
-              <w:t xml:space="preserve">→ MISS_ACK_RECOVERY</w:t>
-              <w:br/>
-              <w:t xml:space="preserve">(漏应答时停发 TX_TIMEOUT, 再恢复)</w:t>
+              <w:t>MISS_ACK_NONE → MISS_ACK_TIMEOUT</w:t>
+            </w:r>
+            <w:r>
+              <w:rPr>
+                <w:b/>
+                <w:sz w:val="22"/>
+                <w:szCs w:val="22"/>
+              </w:rPr>
+              <w:br w:type="textWrapping"/>
+            </w:r>
+            <w:r>
+              <w:rPr>
+                <w:b/>
+                <w:sz w:val="22"/>
+                <w:szCs w:val="22"/>
+              </w:rPr>
+              <w:t>→ MISS_ACK_RECOVERY</w:t>
+            </w:r>
+            <w:r>
+              <w:rPr>
+                <w:b/>
+                <w:sz w:val="22"/>
+                <w:szCs w:val="22"/>
+              </w:rPr>
+              <w:br w:type="textWrapping"/>
+            </w:r>
+            <w:r>
+              <w:rPr>
+                <w:b/>
+                <w:sz w:val="22"/>
+                <w:szCs w:val="22"/>
+              </w:rPr>
+              <w:t>(漏应答时停发 TX_TIMEOUT, 再恢复)</w:t>
             </w:r>
           </w:p>
         </w:tc>
@@ -2849,18 +3892,18 @@
       <w:r>
         <w:rPr>
           <w:b/>
+          <w:color w:val="1F3864"/>
           <w:sz w:val="30"/>
           <w:szCs w:val="30"/>
-          <w:color w:val="1F3864"/>
         </w:rPr>
-        <w:t xml:space="preserve">五、关键说明</w:t>
+        <w:t>五、关键说明</w:t>
       </w:r>
     </w:p>
     <w:p>
       <w:pPr>
         <w:numPr>
           <w:ilvl w:val="0"/>
-          <w:numId w:val="2"/>
+          <w:numId w:val="1"/>
         </w:numPr>
         <w:spacing w:before="40" w:after="40"/>
       </w:pPr>
@@ -2869,14 +3912,14 @@
           <w:sz w:val="22"/>
           <w:szCs w:val="22"/>
         </w:rPr>
-        <w:t xml:space="preserve">守卫关系：S1 总线监测是全局守卫。只有 busoff_state==BUSOFF_NONE 且 tx_disable==FALSE 时，S3/S6 的下发才真正有效；离线期间所有 CanTransmit 被抑制。</w:t>
+        <w:t>守卫关系：S1 总线监测是全局守卫。只有 busoff_state==BUSOFF_NONE 且 tx_disable==FALSE 时，S3/S6 的下发才真正有效；离线期间所有 CanTransmit 被抑制。</w:t>
       </w:r>
     </w:p>
     <w:p>
       <w:pPr>
         <w:numPr>
           <w:ilvl w:val="0"/>
-          <w:numId w:val="2"/>
+          <w:numId w:val="1"/>
         </w:numPr>
         <w:spacing w:before="40" w:after="40"/>
       </w:pPr>
@@ -2885,14 +3928,14 @@
           <w:sz w:val="22"/>
           <w:szCs w:val="22"/>
         </w:rPr>
-        <w:t xml:space="preserve">并发而非互斥：S2 每周期都执行；S3（10s）与 S4/S5/S6（5s）按各自定时器触发，互相穿插，并非严格串行排队。</w:t>
+        <w:t>并发而非互斥：S2 每周期都执行；S3（10s）与 S4/S5/S6（5s）按各自定时器触发，互相穿插，并非严格串行排队。</w:t>
       </w:r>
     </w:p>
     <w:p>
       <w:pPr>
         <w:numPr>
           <w:ilvl w:val="0"/>
-          <w:numId w:val="2"/>
+          <w:numId w:val="1"/>
         </w:numPr>
         <w:spacing w:before="40" w:after="40"/>
       </w:pPr>
@@ -2901,14 +3944,14 @@
           <w:sz w:val="22"/>
           <w:szCs w:val="22"/>
         </w:rPr>
-        <w:t xml:space="preserve">支付门控：S3 使能广播受 PaygGetPayState() 约束——未付费时 TargetChargeVoltageH 置 0xFF（暂停），设备据此停止充电。</w:t>
+        <w:t>支付门控：S3 使能广播受 PaygGetPayState() 约束——未付费时 TargetChargeVoltageH 置 0xFF（暂停），设备据此停止充电。</w:t>
       </w:r>
     </w:p>
     <w:p>
       <w:pPr>
         <w:numPr>
           <w:ilvl w:val="0"/>
-          <w:numId w:val="2"/>
+          <w:numId w:val="1"/>
         </w:numPr>
         <w:spacing w:before="40" w:after="40"/>
       </w:pPr>
@@ -2917,14 +3960,14 @@
           <w:sz w:val="22"/>
           <w:szCs w:val="22"/>
         </w:rPr>
-        <w:t xml:space="preserve">功率门控：power&gt;1.0 才允许 ChargeEnable=0x55；分配结果为 0 电流的设备同样被置为不使能，自然退出充电。</w:t>
+        <w:t>功率门控：power&gt;1.0 才允许 ChargeEnable=0x55；分配结果为 0 电流的设备同样被置为不使能，自然退出充电。</w:t>
       </w:r>
     </w:p>
     <w:p>
       <w:pPr>
         <w:numPr>
           <w:ilvl w:val="0"/>
-          <w:numId w:val="2"/>
+          <w:numId w:val="1"/>
         </w:numPr>
         <w:spacing w:before="40" w:after="40"/>
       </w:pPr>
@@ -2933,14 +3976,14 @@
           <w:sz w:val="22"/>
           <w:szCs w:val="22"/>
         </w:rPr>
-        <w:t xml:space="preserve">失联自愈：S7 仅清零离线设备数据并使其退出本轮分配，不影响其他在线设备的功率分配与下发。</w:t>
+        <w:t>失联自愈：S7 仅清零离线设备数据并使其退出本轮分配，不影响其他在线设备的功率分配与下发。</w:t>
       </w:r>
     </w:p>
     <w:p>
       <w:pPr>
         <w:numPr>
           <w:ilvl w:val="0"/>
-          <w:numId w:val="2"/>
+          <w:numId w:val="1"/>
         </w:numPr>
         <w:spacing w:before="40" w:after="40"/>
       </w:pPr>
@@ -2949,7 +3992,7 @@
           <w:sz w:val="22"/>
           <w:szCs w:val="22"/>
         </w:rPr>
-        <w:t xml:space="preserve">与功率分配算法的衔接：S5/S6 正是《充电功率动态分配算法说明》中流程图的具体实现，决策与下发逻辑完全一致。</w:t>
+        <w:t>与功率分配算法的衔接：S5/S6 正是《充电功率动态分配算法说明》中流程图的具体实现，决策与下发逻辑完全一致。</w:t>
       </w:r>
     </w:p>
     <w:p>
@@ -2959,25 +4002,33 @@
       <w:r>
         <w:rPr>
           <w:b/>
+          <w:color w:val="1F3864"/>
           <w:sz w:val="30"/>
           <w:szCs w:val="30"/>
-          <w:color w:val="1F3864"/>
         </w:rPr>
-        <w:t xml:space="preserve">六、与《充电功率动态分配算法说明》的对应关系</w:t>
+        <w:t>六、与《充电功率动态分配算法说明》的对应关系</w:t>
       </w:r>
     </w:p>
     <w:tbl>
       <w:tblPr>
+        <w:tblStyle w:val="2"/>
         <w:tblW w:w="9360" w:type="dxa"/>
+        <w:tblInd w:w="0" w:type="dxa"/>
         <w:tblBorders>
-          <w:top w:val="single" w:sz="4" w:color="CCCCCC"/>
-          <w:left w:val="single" w:sz="4" w:color="CCCCCC"/>
-          <w:bottom w:val="single" w:sz="4" w:color="CCCCCC"/>
-          <w:right w:val="single" w:sz="4" w:color="CCCCCC"/>
-          <w:insideH w:val="single" w:sz="4" w:color="CCCCCC"/>
-          <w:insideV w:val="single" w:sz="4" w:color="CCCCCC"/>
+          <w:top w:val="single" w:color="CCCCCC" w:sz="4" w:space="0"/>
+          <w:left w:val="single" w:color="CCCCCC" w:sz="4" w:space="0"/>
+          <w:bottom w:val="single" w:color="CCCCCC" w:sz="4" w:space="0"/>
+          <w:right w:val="single" w:color="CCCCCC" w:sz="4" w:space="0"/>
+          <w:insideH w:val="single" w:color="CCCCCC" w:sz="4" w:space="0"/>
+          <w:insideV w:val="single" w:color="CCCCCC" w:sz="4" w:space="0"/>
         </w:tblBorders>
-        <w:tblLook w:val="04A0"/>
+        <w:tblLayout w:type="autofit"/>
+        <w:tblCellMar>
+          <w:top w:w="0" w:type="dxa"/>
+          <w:left w:w="10" w:type="dxa"/>
+          <w:bottom w:w="0" w:type="dxa"/>
+          <w:right w:w="10" w:type="dxa"/>
+        </w:tblCellMar>
       </w:tblPr>
       <w:tblGrid>
         <w:gridCol w:w="3400"/>
@@ -2985,6 +4036,22 @@
         <w:gridCol w:w="2760"/>
       </w:tblGrid>
       <w:tr>
+        <w:tblPrEx>
+          <w:tblBorders>
+            <w:top w:val="single" w:color="CCCCCC" w:sz="4" w:space="0"/>
+            <w:left w:val="single" w:color="CCCCCC" w:sz="4" w:space="0"/>
+            <w:bottom w:val="single" w:color="CCCCCC" w:sz="4" w:space="0"/>
+            <w:right w:val="single" w:color="CCCCCC" w:sz="4" w:space="0"/>
+            <w:insideH w:val="single" w:color="CCCCCC" w:sz="4" w:space="0"/>
+            <w:insideV w:val="single" w:color="CCCCCC" w:sz="4" w:space="0"/>
+          </w:tblBorders>
+          <w:tblCellMar>
+            <w:top w:w="0" w:type="dxa"/>
+            <w:left w:w="10" w:type="dxa"/>
+            <w:bottom w:w="0" w:type="dxa"/>
+            <w:right w:w="10" w:type="dxa"/>
+          </w:tblCellMar>
+        </w:tblPrEx>
         <w:tc>
           <w:tcPr>
             <w:tcW w:w="3400" w:type="dxa"/>
@@ -3003,7 +4070,7 @@
                 <w:sz w:val="18"/>
                 <w:szCs w:val="18"/>
               </w:rPr>
-              <w:t xml:space="preserve">算法文档步骤</w:t>
+              <w:t>算法文档步骤</w:t>
             </w:r>
           </w:p>
         </w:tc>
@@ -3025,7 +4092,7 @@
                 <w:sz w:val="18"/>
                 <w:szCs w:val="18"/>
               </w:rPr>
-              <w:t xml:space="preserve">本状态机环节</w:t>
+              <w:t>本状态机环节</w:t>
             </w:r>
           </w:p>
         </w:tc>
@@ -3047,12 +4114,28 @@
                 <w:sz w:val="18"/>
                 <w:szCs w:val="18"/>
               </w:rPr>
-              <w:t xml:space="preserve">代码</w:t>
+              <w:t>代码</w:t>
             </w:r>
           </w:p>
         </w:tc>
       </w:tr>
       <w:tr>
+        <w:tblPrEx>
+          <w:tblBorders>
+            <w:top w:val="single" w:color="CCCCCC" w:sz="4" w:space="0"/>
+            <w:left w:val="single" w:color="CCCCCC" w:sz="4" w:space="0"/>
+            <w:bottom w:val="single" w:color="CCCCCC" w:sz="4" w:space="0"/>
+            <w:right w:val="single" w:color="CCCCCC" w:sz="4" w:space="0"/>
+            <w:insideH w:val="single" w:color="CCCCCC" w:sz="4" w:space="0"/>
+            <w:insideV w:val="single" w:color="CCCCCC" w:sz="4" w:space="0"/>
+          </w:tblBorders>
+          <w:tblCellMar>
+            <w:top w:w="0" w:type="dxa"/>
+            <w:left w:w="10" w:type="dxa"/>
+            <w:bottom w:w="0" w:type="dxa"/>
+            <w:right w:w="10" w:type="dxa"/>
+          </w:tblCellMar>
+        </w:tblPrEx>
         <w:tc>
           <w:tcPr>
             <w:tcW w:w="3400" w:type="dxa"/>
@@ -3070,7 +4153,7 @@
                 <w:sz w:val="18"/>
                 <w:szCs w:val="18"/>
               </w:rPr>
-              <w:t xml:space="preserve">读取设置功率 / 量纲换算</w:t>
+              <w:t>读取设置功率 / 量纲换算</w:t>
             </w:r>
           </w:p>
         </w:tc>
@@ -3091,7 +4174,7 @@
                 <w:sz w:val="18"/>
                 <w:szCs w:val="18"/>
               </w:rPr>
-              <w:t xml:space="preserve">S5 分配决策</w:t>
+              <w:t>S5 分配决策</w:t>
             </w:r>
           </w:p>
         </w:tc>
@@ -3112,12 +4195,28 @@
                 <w:sz w:val="18"/>
                 <w:szCs w:val="18"/>
               </w:rPr>
-              <w:t xml:space="preserve">vcu_canbox_cur:564-596</w:t>
+              <w:t>vcu_canbox_cur:564-596</w:t>
             </w:r>
           </w:p>
         </w:tc>
       </w:tr>
       <w:tr>
+        <w:tblPrEx>
+          <w:tblBorders>
+            <w:top w:val="single" w:color="CCCCCC" w:sz="4" w:space="0"/>
+            <w:left w:val="single" w:color="CCCCCC" w:sz="4" w:space="0"/>
+            <w:bottom w:val="single" w:color="CCCCCC" w:sz="4" w:space="0"/>
+            <w:right w:val="single" w:color="CCCCCC" w:sz="4" w:space="0"/>
+            <w:insideH w:val="single" w:color="CCCCCC" w:sz="4" w:space="0"/>
+            <w:insideV w:val="single" w:color="CCCCCC" w:sz="4" w:space="0"/>
+          </w:tblBorders>
+          <w:tblCellMar>
+            <w:top w:w="0" w:type="dxa"/>
+            <w:left w:w="10" w:type="dxa"/>
+            <w:bottom w:w="0" w:type="dxa"/>
+            <w:right w:w="10" w:type="dxa"/>
+          </w:tblCellMar>
+        </w:tblPrEx>
         <w:tc>
           <w:tcPr>
             <w:tcW w:w="3400" w:type="dxa"/>
@@ -3135,7 +4234,7 @@
                 <w:sz w:val="18"/>
                 <w:szCs w:val="18"/>
               </w:rPr>
-              <w:t xml:space="preserve">SOC 排序（大者优先）</w:t>
+              <w:t>SOC 排序（大者优先）</w:t>
             </w:r>
           </w:p>
         </w:tc>
@@ -3156,7 +4255,7 @@
                 <w:sz w:val="18"/>
                 <w:szCs w:val="18"/>
               </w:rPr>
-              <w:t xml:space="preserve">S2 数据采集 + S5</w:t>
+              <w:t>S2 数据采集 + S5</w:t>
             </w:r>
           </w:p>
         </w:tc>
@@ -3177,12 +4276,28 @@
                 <w:sz w:val="18"/>
                 <w:szCs w:val="18"/>
               </w:rPr>
-              <w:t xml:space="preserve">g_bat_soc / soc_order</w:t>
+              <w:t>g_bat_soc / soc_order</w:t>
             </w:r>
           </w:p>
         </w:tc>
       </w:tr>
       <w:tr>
+        <w:tblPrEx>
+          <w:tblBorders>
+            <w:top w:val="single" w:color="CCCCCC" w:sz="4" w:space="0"/>
+            <w:left w:val="single" w:color="CCCCCC" w:sz="4" w:space="0"/>
+            <w:bottom w:val="single" w:color="CCCCCC" w:sz="4" w:space="0"/>
+            <w:right w:val="single" w:color="CCCCCC" w:sz="4" w:space="0"/>
+            <w:insideH w:val="single" w:color="CCCCCC" w:sz="4" w:space="0"/>
+            <w:insideV w:val="single" w:color="CCCCCC" w:sz="4" w:space="0"/>
+          </w:tblBorders>
+          <w:tblCellMar>
+            <w:top w:w="0" w:type="dxa"/>
+            <w:left w:w="10" w:type="dxa"/>
+            <w:bottom w:w="0" w:type="dxa"/>
+            <w:right w:w="10" w:type="dxa"/>
+          </w:tblCellMar>
+        </w:tblPrEx>
         <w:tc>
           <w:tcPr>
             <w:tcW w:w="3400" w:type="dxa"/>
@@ -3200,7 +4315,7 @@
                 <w:sz w:val="18"/>
                 <w:szCs w:val="18"/>
               </w:rPr>
-              <w:t xml:space="preserve">power≥total 全额定</w:t>
+              <w:t>power≥total 全额定</w:t>
             </w:r>
           </w:p>
         </w:tc>
@@ -3221,7 +4336,7 @@
                 <w:sz w:val="18"/>
                 <w:szCs w:val="18"/>
               </w:rPr>
-              <w:t xml:space="preserve">S5→S6 充足分支</w:t>
+              <w:t>S5→S6 充足分支</w:t>
             </w:r>
           </w:p>
         </w:tc>
@@ -3242,12 +4357,28 @@
                 <w:sz w:val="18"/>
                 <w:szCs w:val="18"/>
               </w:rPr>
-              <w:t xml:space="preserve">vcu_canbox_cur:598-601</w:t>
+              <w:t>vcu_canbox_cur:598-601</w:t>
             </w:r>
           </w:p>
         </w:tc>
       </w:tr>
       <w:tr>
+        <w:tblPrEx>
+          <w:tblBorders>
+            <w:top w:val="single" w:color="CCCCCC" w:sz="4" w:space="0"/>
+            <w:left w:val="single" w:color="CCCCCC" w:sz="4" w:space="0"/>
+            <w:bottom w:val="single" w:color="CCCCCC" w:sz="4" w:space="0"/>
+            <w:right w:val="single" w:color="CCCCCC" w:sz="4" w:space="0"/>
+            <w:insideH w:val="single" w:color="CCCCCC" w:sz="4" w:space="0"/>
+            <w:insideV w:val="single" w:color="CCCCCC" w:sz="4" w:space="0"/>
+          </w:tblBorders>
+          <w:tblCellMar>
+            <w:top w:w="0" w:type="dxa"/>
+            <w:left w:w="10" w:type="dxa"/>
+            <w:bottom w:w="0" w:type="dxa"/>
+            <w:right w:w="10" w:type="dxa"/>
+          </w:tblCellMar>
+        </w:tblPrEx>
         <w:tc>
           <w:tcPr>
             <w:tcW w:w="3400" w:type="dxa"/>
@@ -3265,7 +4396,7 @@
                 <w:sz w:val="18"/>
                 <w:szCs w:val="18"/>
               </w:rPr>
-              <w:t xml:space="preserve">功率不足动态分配</w:t>
+              <w:t>功率不足动态分配</w:t>
             </w:r>
           </w:p>
         </w:tc>
@@ -3286,7 +4417,7 @@
                 <w:sz w:val="18"/>
                 <w:szCs w:val="18"/>
               </w:rPr>
-              <w:t xml:space="preserve">S5→S6 不足分支</w:t>
+              <w:t>S5→S6 不足分支</w:t>
             </w:r>
           </w:p>
         </w:tc>
@@ -3307,12 +4438,28 @@
                 <w:sz w:val="18"/>
                 <w:szCs w:val="18"/>
               </w:rPr>
-              <w:t xml:space="preserve">vcu_canbox_cur:603-627</w:t>
+              <w:t>vcu_canbox_cur:603-627</w:t>
             </w:r>
           </w:p>
         </w:tc>
       </w:tr>
       <w:tr>
+        <w:tblPrEx>
+          <w:tblBorders>
+            <w:top w:val="single" w:color="CCCCCC" w:sz="4" w:space="0"/>
+            <w:left w:val="single" w:color="CCCCCC" w:sz="4" w:space="0"/>
+            <w:bottom w:val="single" w:color="CCCCCC" w:sz="4" w:space="0"/>
+            <w:right w:val="single" w:color="CCCCCC" w:sz="4" w:space="0"/>
+            <w:insideH w:val="single" w:color="CCCCCC" w:sz="4" w:space="0"/>
+            <w:insideV w:val="single" w:color="CCCCCC" w:sz="4" w:space="0"/>
+          </w:tblBorders>
+          <w:tblCellMar>
+            <w:top w:w="0" w:type="dxa"/>
+            <w:left w:w="10" w:type="dxa"/>
+            <w:bottom w:w="0" w:type="dxa"/>
+            <w:right w:w="10" w:type="dxa"/>
+          </w:tblCellMar>
+        </w:tblPrEx>
         <w:tc>
           <w:tcPr>
             <w:tcW w:w="3400" w:type="dxa"/>
@@ -3330,7 +4477,7 @@
                 <w:sz w:val="18"/>
                 <w:szCs w:val="18"/>
               </w:rPr>
-              <w:t xml:space="preserve">逐设备下发电压/电流/使能</w:t>
+              <w:t>逐设备下发电压/电流/使能</w:t>
             </w:r>
           </w:p>
         </w:tc>
@@ -3351,7 +4498,7 @@
                 <w:sz w:val="18"/>
                 <w:szCs w:val="18"/>
               </w:rPr>
-              <w:t xml:space="preserve">S6 逐设备下发</w:t>
+              <w:t>S6 逐设备下发</w:t>
             </w:r>
           </w:p>
         </w:tc>
@@ -3372,35 +4519,29 @@
                 <w:sz w:val="18"/>
                 <w:szCs w:val="18"/>
               </w:rPr>
-              <w:t xml:space="preserve">vcu_canbox_cur:629-644</w:t>
+              <w:t>vcu_canbox_cur:629-644</w:t>
             </w:r>
           </w:p>
         </w:tc>
       </w:tr>
     </w:tbl>
+    <w:p/>
     <w:sectPr>
       <w:pgSz w:w="12240" w:h="15840"/>
       <w:pgMar w:top="1440" w:right="1440" w:bottom="1440" w:left="1440" w:header="720" w:footer="720" w:gutter="0"/>
+      <w:cols w:space="720" w:num="1"/>
     </w:sectPr>
   </w:body>
 </w:document>
 </file>
 
 <file path=word/numbering.xml><?xml version="1.0" encoding="utf-8"?>
-<w:numbering xmlns:w="http://schemas.openxmlformats.org/wordprocessingml/2006/main">
+<w:numbering xmlns:wpc="http://schemas.microsoft.com/office/word/2010/wordprocessingCanvas" xmlns:mc="http://schemas.openxmlformats.org/markup-compatibility/2006" xmlns:o="urn:schemas-microsoft-com:office:office" xmlns:r="http://schemas.openxmlformats.org/officeDocument/2006/relationships" xmlns:m="http://schemas.openxmlformats.org/officeDocument/2006/math" xmlns:v="urn:schemas-microsoft-com:vml" xmlns:wp14="http://schemas.microsoft.com/office/word/2010/wordprocessingDrawing" xmlns:wp="http://schemas.openxmlformats.org/drawingml/2006/wordprocessingDrawing" xmlns:w10="urn:schemas-microsoft-com:office:word" xmlns:w="http://schemas.openxmlformats.org/wordprocessingml/2006/main" xmlns:w14="http://schemas.microsoft.com/office/word/2010/wordml" xmlns:wpg="http://schemas.microsoft.com/office/word/2010/wordprocessingGroup" xmlns:wpi="http://schemas.microsoft.com/office/word/2010/wordprocessingInk" xmlns:wne="http://schemas.microsoft.com/office/word/2006/wordml" xmlns:wps="http://schemas.microsoft.com/office/word/2010/wordprocessingShape" xmlns:wpsCustomData="http://www.wps.cn/officeDocument/2013/wpsCustomData" mc:Ignorable="w14 wp14">
   <w:abstractNum w:abstractNumId="0">
-    <w:lvl w:ilvl="0">
-      <w:start w:val="1"/>
-      <w:numFmt w:val="bullet"/>
-      <w:lvlText w:val="•"/>
-      <w:lvlJc w:val="left"/>
-      <w:pPr>
-        <w:ind w:left="720" w:hanging="360"/>
-      </w:pPr>
-    </w:lvl>
-  </w:abstractNum>
-  <w:abstractNum w:abstractNumId="1">
-    <w:lvl w:ilvl="0">
+    <w:nsid w:val="0053208E"/>
+    <w:multiLevelType w:val="singleLevel"/>
+    <w:tmpl w:val="0053208E"/>
+    <w:lvl w:ilvl="0" w:tentative="0">
       <w:start w:val="1"/>
       <w:numFmt w:val="decimal"/>
       <w:lvlText w:val="%1."/>
@@ -3413,8 +4554,584 @@
   <w:num w:numId="1">
     <w:abstractNumId w:val="0"/>
   </w:num>
-  <w:num w:numId="2">
-    <w:abstractNumId w:val="1"/>
-  </w:num>
 </w:numbering>
+</file>
+
+<file path=word/styles.xml><?xml version="1.0" encoding="utf-8"?>
+<w:styles xmlns:mc="http://schemas.openxmlformats.org/markup-compatibility/2006" xmlns:o="urn:schemas-microsoft-com:office:office" xmlns:r="http://schemas.openxmlformats.org/officeDocument/2006/relationships" xmlns:m="http://schemas.openxmlformats.org/officeDocument/2006/math" xmlns:v="urn:schemas-microsoft-com:vml" xmlns:w="http://schemas.openxmlformats.org/wordprocessingml/2006/main" xmlns:w14="http://schemas.microsoft.com/office/word/2010/wordml" xmlns:w10="urn:schemas-microsoft-com:office:word" xmlns:sl="http://schemas.openxmlformats.org/schemaLibrary/2006/main" xmlns:wpsCustomData="http://www.wps.cn/officeDocument/2013/wpsCustomData" mc:Ignorable="w14">
+  <w:docDefaults>
+    <w:rPrDefault>
+      <w:rPr>
+        <w:rFonts w:asciiTheme="minorHAnsi" w:hAnsiTheme="minorHAnsi" w:eastAsiaTheme="minorEastAsia" w:cstheme="minorBidi"/>
+      </w:rPr>
+    </w:rPrDefault>
+    <w:pPrDefault/>
+  </w:docDefaults>
+  <w:latentStyles w:count="260" w:defQFormat="0" w:defUnhideWhenUsed="1" w:defSemiHidden="1" w:defUIPriority="99" w:defLockedState="0">
+    <w:lsdException w:qFormat="1" w:unhideWhenUsed="0" w:uiPriority="0" w:semiHidden="0" w:name="Normal"/>
+    <w:lsdException w:qFormat="1" w:unhideWhenUsed="0" w:uiPriority="0" w:semiHidden="0" w:name="heading 1"/>
+    <w:lsdException w:qFormat="1" w:uiPriority="0" w:name="heading 2"/>
+    <w:lsdException w:qFormat="1" w:uiPriority="0" w:name="heading 3"/>
+    <w:lsdException w:qFormat="1" w:uiPriority="0" w:name="heading 4"/>
+    <w:lsdException w:qFormat="1" w:uiPriority="0" w:name="heading 5"/>
+    <w:lsdException w:qFormat="1" w:uiPriority="0" w:name="heading 6"/>
+    <w:lsdException w:qFormat="1" w:uiPriority="0" w:name="heading 7"/>
+    <w:lsdException w:qFormat="1" w:uiPriority="0" w:name="heading 8"/>
+    <w:lsdException w:qFormat="1" w:uiPriority="0" w:name="heading 9"/>
+    <w:lsdException w:unhideWhenUsed="0" w:uiPriority="0" w:semiHidden="0" w:name="index 1"/>
+    <w:lsdException w:unhideWhenUsed="0" w:uiPriority="0" w:semiHidden="0" w:name="index 2"/>
+    <w:lsdException w:unhideWhenUsed="0" w:uiPriority="0" w:semiHidden="0" w:name="index 3"/>
+    <w:lsdException w:unhideWhenUsed="0" w:uiPriority="0" w:semiHidden="0" w:name="index 4"/>
+    <w:lsdException w:unhideWhenUsed="0" w:uiPriority="0" w:semiHidden="0" w:name="index 5"/>
+    <w:lsdException w:unhideWhenUsed="0" w:uiPriority="0" w:semiHidden="0" w:name="index 6"/>
+    <w:lsdException w:unhideWhenUsed="0" w:uiPriority="0" w:semiHidden="0" w:name="index 7"/>
+    <w:lsdException w:unhideWhenUsed="0" w:uiPriority="0" w:semiHidden="0" w:name="index 8"/>
+    <w:lsdException w:unhideWhenUsed="0" w:uiPriority="0" w:semiHidden="0" w:name="index 9"/>
+    <w:lsdException w:unhideWhenUsed="0" w:uiPriority="0" w:semiHidden="0" w:name="toc 1"/>
+    <w:lsdException w:unhideWhenUsed="0" w:uiPriority="0" w:semiHidden="0" w:name="toc 2"/>
+    <w:lsdException w:unhideWhenUsed="0" w:uiPriority="0" w:semiHidden="0" w:name="toc 3"/>
+    <w:lsdException w:unhideWhenUsed="0" w:uiPriority="0" w:semiHidden="0" w:name="toc 4"/>
+    <w:lsdException w:unhideWhenUsed="0" w:uiPriority="0" w:semiHidden="0" w:name="toc 5"/>
+    <w:lsdException w:unhideWhenUsed="0" w:uiPriority="0" w:semiHidden="0" w:name="toc 6"/>
+    <w:lsdException w:unhideWhenUsed="0" w:uiPriority="0" w:semiHidden="0" w:name="toc 7"/>
+    <w:lsdException w:unhideWhenUsed="0" w:uiPriority="0" w:semiHidden="0" w:name="toc 8"/>
+    <w:lsdException w:unhideWhenUsed="0" w:uiPriority="0" w:semiHidden="0" w:name="toc 9"/>
+    <w:lsdException w:unhideWhenUsed="0" w:uiPriority="0" w:semiHidden="0" w:name="Normal Indent"/>
+    <w:lsdException w:unhideWhenUsed="0" w:uiPriority="0" w:semiHidden="0" w:name="footnote text"/>
+    <w:lsdException w:unhideWhenUsed="0" w:uiPriority="0" w:semiHidden="0" w:name="annotation text"/>
+    <w:lsdException w:unhideWhenUsed="0" w:uiPriority="0" w:semiHidden="0" w:name="header"/>
+    <w:lsdException w:unhideWhenUsed="0" w:uiPriority="0" w:semiHidden="0" w:name="footer"/>
+    <w:lsdException w:unhideWhenUsed="0" w:uiPriority="0" w:semiHidden="0" w:name="index heading"/>
+    <w:lsdException w:qFormat="1" w:uiPriority="0" w:name="caption"/>
+    <w:lsdException w:unhideWhenUsed="0" w:uiPriority="0" w:semiHidden="0" w:name="table of figures"/>
+    <w:lsdException w:unhideWhenUsed="0" w:uiPriority="0" w:semiHidden="0" w:name="envelope address"/>
+    <w:lsdException w:unhideWhenUsed="0" w:uiPriority="0" w:semiHidden="0" w:name="envelope return"/>
+    <w:lsdException w:unhideWhenUsed="0" w:uiPriority="0" w:semiHidden="0" w:name="footnote reference"/>
+    <w:lsdException w:unhideWhenUsed="0" w:uiPriority="0" w:semiHidden="0" w:name="annotation reference"/>
+    <w:lsdException w:unhideWhenUsed="0" w:uiPriority="0" w:semiHidden="0" w:name="line number"/>
+    <w:lsdException w:unhideWhenUsed="0" w:uiPriority="0" w:semiHidden="0" w:name="page number"/>
+    <w:lsdException w:unhideWhenUsed="0" w:uiPriority="0" w:semiHidden="0" w:name="endnote reference"/>
+    <w:lsdException w:unhideWhenUsed="0" w:uiPriority="0" w:semiHidden="0" w:name="endnote text"/>
+    <w:lsdException w:unhideWhenUsed="0" w:uiPriority="0" w:semiHidden="0" w:name="table of authorities"/>
+    <w:lsdException w:unhideWhenUsed="0" w:uiPriority="0" w:semiHidden="0" w:name="macro"/>
+    <w:lsdException w:unhideWhenUsed="0" w:uiPriority="0" w:semiHidden="0" w:name="toa heading"/>
+    <w:lsdException w:unhideWhenUsed="0" w:uiPriority="0" w:semiHidden="0" w:name="List"/>
+    <w:lsdException w:unhideWhenUsed="0" w:uiPriority="0" w:semiHidden="0" w:name="List Bullet"/>
+    <w:lsdException w:unhideWhenUsed="0" w:uiPriority="0" w:semiHidden="0" w:name="List Number"/>
+    <w:lsdException w:unhideWhenUsed="0" w:uiPriority="0" w:semiHidden="0" w:name="List 2"/>
+    <w:lsdException w:unhideWhenUsed="0" w:uiPriority="0" w:semiHidden="0" w:name="List 3"/>
+    <w:lsdException w:unhideWhenUsed="0" w:uiPriority="0" w:semiHidden="0" w:name="List 4"/>
+    <w:lsdException w:unhideWhenUsed="0" w:uiPriority="0" w:semiHidden="0" w:name="List 5"/>
+    <w:lsdException w:unhideWhenUsed="0" w:uiPriority="0" w:semiHidden="0" w:name="List Bullet 2"/>
+    <w:lsdException w:unhideWhenUsed="0" w:uiPriority="0" w:semiHidden="0" w:name="List Bullet 3"/>
+    <w:lsdException w:unhideWhenUsed="0" w:uiPriority="0" w:semiHidden="0" w:name="List Bullet 4"/>
+    <w:lsdException w:unhideWhenUsed="0" w:uiPriority="0" w:semiHidden="0" w:name="List Bullet 5"/>
+    <w:lsdException w:unhideWhenUsed="0" w:uiPriority="0" w:semiHidden="0" w:name="List Number 2"/>
+    <w:lsdException w:unhideWhenUsed="0" w:uiPriority="0" w:semiHidden="0" w:name="List Number 3"/>
+    <w:lsdException w:unhideWhenUsed="0" w:uiPriority="0" w:semiHidden="0" w:name="List Number 4"/>
+    <w:lsdException w:unhideWhenUsed="0" w:uiPriority="0" w:semiHidden="0" w:name="List Number 5"/>
+    <w:lsdException w:qFormat="1" w:unhideWhenUsed="0" w:uiPriority="0" w:semiHidden="0" w:name="Title"/>
+    <w:lsdException w:unhideWhenUsed="0" w:uiPriority="0" w:semiHidden="0" w:name="Closing"/>
+    <w:lsdException w:unhideWhenUsed="0" w:uiPriority="0" w:semiHidden="0" w:name="Signature"/>
+    <w:lsdException w:unhideWhenUsed="0" w:uiPriority="0" w:name="Default Paragraph Font"/>
+    <w:lsdException w:unhideWhenUsed="0" w:uiPriority="0" w:semiHidden="0" w:name="Body Text"/>
+    <w:lsdException w:unhideWhenUsed="0" w:uiPriority="0" w:semiHidden="0" w:name="Body Text Indent"/>
+    <w:lsdException w:unhideWhenUsed="0" w:uiPriority="0" w:semiHidden="0" w:name="List Continue"/>
+    <w:lsdException w:unhideWhenUsed="0" w:uiPriority="0" w:semiHidden="0" w:name="List Continue 2"/>
+    <w:lsdException w:unhideWhenUsed="0" w:uiPriority="0" w:semiHidden="0" w:name="List Continue 3"/>
+    <w:lsdException w:unhideWhenUsed="0" w:uiPriority="0" w:semiHidden="0" w:name="List Continue 4"/>
+    <w:lsdException w:unhideWhenUsed="0" w:uiPriority="0" w:semiHidden="0" w:name="List Continue 5"/>
+    <w:lsdException w:unhideWhenUsed="0" w:uiPriority="0" w:semiHidden="0" w:name="Message Header"/>
+    <w:lsdException w:qFormat="1" w:unhideWhenUsed="0" w:uiPriority="0" w:semiHidden="0" w:name="Subtitle"/>
+    <w:lsdException w:unhideWhenUsed="0" w:uiPriority="0" w:semiHidden="0" w:name="Salutation"/>
+    <w:lsdException w:unhideWhenUsed="0" w:uiPriority="0" w:semiHidden="0" w:name="Date"/>
+    <w:lsdException w:unhideWhenUsed="0" w:uiPriority="0" w:semiHidden="0" w:name="Body Text First Indent"/>
+    <w:lsdException w:unhideWhenUsed="0" w:uiPriority="0" w:semiHidden="0" w:name="Body Text First Indent 2"/>
+    <w:lsdException w:unhideWhenUsed="0" w:uiPriority="0" w:semiHidden="0" w:name="Note Heading"/>
+    <w:lsdException w:unhideWhenUsed="0" w:uiPriority="0" w:semiHidden="0" w:name="Body Text 2"/>
+    <w:lsdException w:unhideWhenUsed="0" w:uiPriority="0" w:semiHidden="0" w:name="Body Text 3"/>
+    <w:lsdException w:unhideWhenUsed="0" w:uiPriority="0" w:semiHidden="0" w:name="Body Text Indent 2"/>
+    <w:lsdException w:unhideWhenUsed="0" w:uiPriority="0" w:semiHidden="0" w:name="Body Text Indent 3"/>
+    <w:lsdException w:unhideWhenUsed="0" w:uiPriority="0" w:semiHidden="0" w:name="Block Text"/>
+    <w:lsdException w:unhideWhenUsed="0" w:uiPriority="0" w:semiHidden="0" w:name="Hyperlink"/>
+    <w:lsdException w:unhideWhenUsed="0" w:uiPriority="0" w:semiHidden="0" w:name="FollowedHyperlink"/>
+    <w:lsdException w:qFormat="1" w:unhideWhenUsed="0" w:uiPriority="0" w:semiHidden="0" w:name="Strong"/>
+    <w:lsdException w:qFormat="1" w:unhideWhenUsed="0" w:uiPriority="0" w:semiHidden="0" w:name="Emphasis"/>
+    <w:lsdException w:unhideWhenUsed="0" w:uiPriority="0" w:semiHidden="0" w:name="Document Map"/>
+    <w:lsdException w:unhideWhenUsed="0" w:uiPriority="0" w:semiHidden="0" w:name="Plain Text"/>
+    <w:lsdException w:unhideWhenUsed="0" w:uiPriority="0" w:semiHidden="0" w:name="E-mail Signature"/>
+    <w:lsdException w:unhideWhenUsed="0" w:uiPriority="0" w:semiHidden="0" w:name="Normal (Web)"/>
+    <w:lsdException w:unhideWhenUsed="0" w:uiPriority="0" w:semiHidden="0" w:name="HTML Acronym"/>
+    <w:lsdException w:unhideWhenUsed="0" w:uiPriority="0" w:semiHidden="0" w:name="HTML Address"/>
+    <w:lsdException w:unhideWhenUsed="0" w:uiPriority="0" w:semiHidden="0" w:name="HTML Cite"/>
+    <w:lsdException w:unhideWhenUsed="0" w:uiPriority="0" w:semiHidden="0" w:name="HTML Code"/>
+    <w:lsdException w:unhideWhenUsed="0" w:uiPriority="0" w:semiHidden="0" w:name="HTML Definition"/>
+    <w:lsdException w:unhideWhenUsed="0" w:uiPriority="0" w:semiHidden="0" w:name="HTML Keyboard"/>
+    <w:lsdException w:unhideWhenUsed="0" w:uiPriority="0" w:semiHidden="0" w:name="HTML Preformatted"/>
+    <w:lsdException w:unhideWhenUsed="0" w:uiPriority="0" w:semiHidden="0" w:name="HTML Sample"/>
+    <w:lsdException w:unhideWhenUsed="0" w:uiPriority="0" w:semiHidden="0" w:name="HTML Typewriter"/>
+    <w:lsdException w:unhideWhenUsed="0" w:uiPriority="0" w:semiHidden="0" w:name="HTML Variable"/>
+    <w:lsdException w:unhideWhenUsed="0" w:uiPriority="0" w:name="Normal Table"/>
+    <w:lsdException w:unhideWhenUsed="0" w:uiPriority="0" w:semiHidden="0" w:name="annotation subject"/>
+    <w:lsdException w:unhideWhenUsed="0" w:uiPriority="0" w:semiHidden="0" w:name="Table Simple 1"/>
+    <w:lsdException w:unhideWhenUsed="0" w:uiPriority="0" w:semiHidden="0" w:name="Table Simple 2"/>
+    <w:lsdException w:unhideWhenUsed="0" w:uiPriority="0" w:semiHidden="0" w:name="Table Simple 3"/>
+    <w:lsdException w:unhideWhenUsed="0" w:uiPriority="0" w:semiHidden="0" w:name="Table Classic 1"/>
+    <w:lsdException w:unhideWhenUsed="0" w:uiPriority="0" w:semiHidden="0" w:name="Table Classic 2"/>
+    <w:lsdException w:unhideWhenUsed="0" w:uiPriority="0" w:semiHidden="0" w:name="Table Classic 3"/>
+    <w:lsdException w:unhideWhenUsed="0" w:uiPriority="0" w:semiHidden="0" w:name="Table Classic 4"/>
+    <w:lsdException w:unhideWhenUsed="0" w:uiPriority="0" w:semiHidden="0" w:name="Table Colorful 1"/>
+    <w:lsdException w:unhideWhenUsed="0" w:uiPriority="0" w:semiHidden="0" w:name="Table Colorful 2"/>
+    <w:lsdException w:unhideWhenUsed="0" w:uiPriority="0" w:semiHidden="0" w:name="Table Colorful 3"/>
+    <w:lsdException w:unhideWhenUsed="0" w:uiPriority="0" w:semiHidden="0" w:name="Table Columns 1"/>
+    <w:lsdException w:unhideWhenUsed="0" w:uiPriority="0" w:semiHidden="0" w:name="Table Columns 2"/>
+    <w:lsdException w:unhideWhenUsed="0" w:uiPriority="0" w:semiHidden="0" w:name="Table Columns 3"/>
+    <w:lsdException w:unhideWhenUsed="0" w:uiPriority="0" w:semiHidden="0" w:name="Table Columns 4"/>
+    <w:lsdException w:unhideWhenUsed="0" w:uiPriority="0" w:semiHidden="0" w:name="Table Columns 5"/>
+    <w:lsdException w:unhideWhenUsed="0" w:uiPriority="0" w:semiHidden="0" w:name="Table Grid 1"/>
+    <w:lsdException w:unhideWhenUsed="0" w:uiPriority="0" w:semiHidden="0" w:name="Table Grid 2"/>
+    <w:lsdException w:unhideWhenUsed="0" w:uiPriority="0" w:semiHidden="0" w:name="Table Grid 3"/>
+    <w:lsdException w:unhideWhenUsed="0" w:uiPriority="0" w:semiHidden="0" w:name="Table Grid 4"/>
+    <w:lsdException w:unhideWhenUsed="0" w:uiPriority="0" w:semiHidden="0" w:name="Table Grid 5"/>
+    <w:lsdException w:unhideWhenUsed="0" w:uiPriority="0" w:semiHidden="0" w:name="Table Grid 6"/>
+    <w:lsdException w:unhideWhenUsed="0" w:uiPriority="0" w:semiHidden="0" w:name="Table Grid 7"/>
+    <w:lsdException w:unhideWhenUsed="0" w:uiPriority="0" w:semiHidden="0" w:name="Table Grid 8"/>
+    <w:lsdException w:unhideWhenUsed="0" w:uiPriority="0" w:semiHidden="0" w:name="Table List 1"/>
+    <w:lsdException w:unhideWhenUsed="0" w:uiPriority="0" w:semiHidden="0" w:name="Table List 2"/>
+    <w:lsdException w:unhideWhenUsed="0" w:uiPriority="0" w:semiHidden="0" w:name="Table List 3"/>
+    <w:lsdException w:unhideWhenUsed="0" w:uiPriority="0" w:semiHidden="0" w:name="Table List 4"/>
+    <w:lsdException w:unhideWhenUsed="0" w:uiPriority="0" w:semiHidden="0" w:name="Table List 5"/>
+    <w:lsdException w:unhideWhenUsed="0" w:uiPriority="0" w:semiHidden="0" w:name="Table List 6"/>
+    <w:lsdException w:unhideWhenUsed="0" w:uiPriority="0" w:semiHidden="0" w:name="Table List 7"/>
+    <w:lsdException w:unhideWhenUsed="0" w:uiPriority="0" w:semiHidden="0" w:name="Table List 8"/>
+    <w:lsdException w:unhideWhenUsed="0" w:uiPriority="0" w:semiHidden="0" w:name="Table 3D effects 1"/>
+    <w:lsdException w:unhideWhenUsed="0" w:uiPriority="0" w:semiHidden="0" w:name="Table 3D effects 2"/>
+    <w:lsdException w:unhideWhenUsed="0" w:uiPriority="0" w:semiHidden="0" w:name="Table 3D effects 3"/>
+    <w:lsdException w:unhideWhenUsed="0" w:uiPriority="0" w:semiHidden="0" w:name="Table Contemporary"/>
+    <w:lsdException w:unhideWhenUsed="0" w:uiPriority="0" w:semiHidden="0" w:name="Table Elegant"/>
+    <w:lsdException w:unhideWhenUsed="0" w:uiPriority="0" w:semiHidden="0" w:name="Table Professional"/>
+    <w:lsdException w:unhideWhenUsed="0" w:uiPriority="0" w:semiHidden="0" w:name="Table Subtle 1"/>
+    <w:lsdException w:unhideWhenUsed="0" w:uiPriority="0" w:semiHidden="0" w:name="Table Subtle 2"/>
+    <w:lsdException w:unhideWhenUsed="0" w:uiPriority="0" w:semiHidden="0" w:name="Table Web 1"/>
+    <w:lsdException w:unhideWhenUsed="0" w:uiPriority="0" w:semiHidden="0" w:name="Table Web 2"/>
+    <w:lsdException w:unhideWhenUsed="0" w:uiPriority="0" w:semiHidden="0" w:name="Table Web 3"/>
+    <w:lsdException w:unhideWhenUsed="0" w:uiPriority="0" w:semiHidden="0" w:name="Balloon Text"/>
+    <w:lsdException w:unhideWhenUsed="0" w:uiPriority="0" w:semiHidden="0" w:name="Table Grid"/>
+    <w:lsdException w:unhideWhenUsed="0" w:uiPriority="0" w:semiHidden="0" w:name="Table Theme"/>
+    <w:lsdException w:unhideWhenUsed="0" w:uiPriority="60" w:semiHidden="0" w:name="Light Shading"/>
+    <w:lsdException w:unhideWhenUsed="0" w:uiPriority="61" w:semiHidden="0" w:name="Light List"/>
+    <w:lsdException w:unhideWhenUsed="0" w:uiPriority="62" w:semiHidden="0" w:name="Light Grid"/>
+    <w:lsdException w:unhideWhenUsed="0" w:uiPriority="63" w:semiHidden="0" w:name="Medium Shading 1"/>
+    <w:lsdException w:unhideWhenUsed="0" w:uiPriority="64" w:semiHidden="0" w:name="Medium Shading 2"/>
+    <w:lsdException w:unhideWhenUsed="0" w:uiPriority="65" w:semiHidden="0" w:name="Medium List 1"/>
+    <w:lsdException w:unhideWhenUsed="0" w:uiPriority="66" w:semiHidden="0" w:name="Medium List 2"/>
+    <w:lsdException w:unhideWhenUsed="0" w:uiPriority="67" w:semiHidden="0" w:name="Medium Grid 1"/>
+    <w:lsdException w:unhideWhenUsed="0" w:uiPriority="68" w:semiHidden="0" w:name="Medium Grid 2"/>
+    <w:lsdException w:unhideWhenUsed="0" w:uiPriority="69" w:semiHidden="0" w:name="Medium Grid 3"/>
+    <w:lsdException w:unhideWhenUsed="0" w:uiPriority="70" w:semiHidden="0" w:name="Dark List"/>
+    <w:lsdException w:unhideWhenUsed="0" w:uiPriority="71" w:semiHidden="0" w:name="Colorful Shading"/>
+    <w:lsdException w:unhideWhenUsed="0" w:uiPriority="72" w:semiHidden="0" w:name="Colorful List"/>
+    <w:lsdException w:unhideWhenUsed="0" w:uiPriority="73" w:semiHidden="0" w:name="Colorful Grid"/>
+    <w:lsdException w:unhideWhenUsed="0" w:uiPriority="60" w:semiHidden="0" w:name="Light Shading Accent 1"/>
+    <w:lsdException w:unhideWhenUsed="0" w:uiPriority="61" w:semiHidden="0" w:name="Light List Accent 1"/>
+    <w:lsdException w:unhideWhenUsed="0" w:uiPriority="62" w:semiHidden="0" w:name="Light Grid Accent 1"/>
+    <w:lsdException w:unhideWhenUsed="0" w:uiPriority="63" w:semiHidden="0" w:name="Medium Shading 1 Accent 1"/>
+    <w:lsdException w:unhideWhenUsed="0" w:uiPriority="64" w:semiHidden="0" w:name="Medium Shading 2 Accent 1"/>
+    <w:lsdException w:unhideWhenUsed="0" w:uiPriority="65" w:semiHidden="0" w:name="Medium List 1 Accent 1"/>
+    <w:lsdException w:unhideWhenUsed="0" w:uiPriority="66" w:semiHidden="0" w:name="Medium List 2 Accent 1"/>
+    <w:lsdException w:unhideWhenUsed="0" w:uiPriority="67" w:semiHidden="0" w:name="Medium Grid 1 Accent 1"/>
+    <w:lsdException w:unhideWhenUsed="0" w:uiPriority="68" w:semiHidden="0" w:name="Medium Grid 2 Accent 1"/>
+    <w:lsdException w:unhideWhenUsed="0" w:uiPriority="69" w:semiHidden="0" w:name="Medium Grid 3 Accent 1"/>
+    <w:lsdException w:unhideWhenUsed="0" w:uiPriority="70" w:semiHidden="0" w:name="Dark List Accent 1"/>
+    <w:lsdException w:unhideWhenUsed="0" w:uiPriority="71" w:semiHidden="0" w:name="Colorful Shading Accent 1"/>
+    <w:lsdException w:unhideWhenUsed="0" w:uiPriority="72" w:semiHidden="0" w:name="Colorful List Accent 1"/>
+    <w:lsdException w:unhideWhenUsed="0" w:uiPriority="73" w:semiHidden="0" w:name="Colorful Grid Accent 1"/>
+    <w:lsdException w:unhideWhenUsed="0" w:uiPriority="60" w:semiHidden="0" w:name="Light Shading Accent 2"/>
+    <w:lsdException w:unhideWhenUsed="0" w:uiPriority="61" w:semiHidden="0" w:name="Light List Accent 2"/>
+    <w:lsdException w:unhideWhenUsed="0" w:uiPriority="62" w:semiHidden="0" w:name="Light Grid Accent 2"/>
+    <w:lsdException w:unhideWhenUsed="0" w:uiPriority="63" w:semiHidden="0" w:name="Medium Shading 1 Accent 2"/>
+    <w:lsdException w:unhideWhenUsed="0" w:uiPriority="64" w:semiHidden="0" w:name="Medium Shading 2 Accent 2"/>
+    <w:lsdException w:unhideWhenUsed="0" w:uiPriority="65" w:semiHidden="0" w:name="Medium List 1 Accent 2"/>
+    <w:lsdException w:unhideWhenUsed="0" w:uiPriority="66" w:semiHidden="0" w:name="Medium List 2 Accent 2"/>
+    <w:lsdException w:unhideWhenUsed="0" w:uiPriority="67" w:semiHidden="0" w:name="Medium Grid 1 Accent 2"/>
+    <w:lsdException w:unhideWhenUsed="0" w:uiPriority="68" w:semiHidden="0" w:name="Medium Grid 2 Accent 2"/>
+    <w:lsdException w:unhideWhenUsed="0" w:uiPriority="69" w:semiHidden="0" w:name="Medium Grid 3 Accent 2"/>
+    <w:lsdException w:unhideWhenUsed="0" w:uiPriority="70" w:semiHidden="0" w:name="Dark List Accent 2"/>
+    <w:lsdException w:unhideWhenUsed="0" w:uiPriority="71" w:semiHidden="0" w:name="Colorful Shading Accent 2"/>
+    <w:lsdException w:unhideWhenUsed="0" w:uiPriority="72" w:semiHidden="0" w:name="Colorful List Accent 2"/>
+    <w:lsdException w:unhideWhenUsed="0" w:uiPriority="73" w:semiHidden="0" w:name="Colorful Grid Accent 2"/>
+    <w:lsdException w:unhideWhenUsed="0" w:uiPriority="60" w:semiHidden="0" w:name="Light Shading Accent 3"/>
+    <w:lsdException w:unhideWhenUsed="0" w:uiPriority="61" w:semiHidden="0" w:name="Light List Accent 3"/>
+    <w:lsdException w:unhideWhenUsed="0" w:uiPriority="62" w:semiHidden="0" w:name="Light Grid Accent 3"/>
+    <w:lsdException w:unhideWhenUsed="0" w:uiPriority="63" w:semiHidden="0" w:name="Medium Shading 1 Accent 3"/>
+    <w:lsdException w:unhideWhenUsed="0" w:uiPriority="64" w:semiHidden="0" w:name="Medium Shading 2 Accent 3"/>
+    <w:lsdException w:unhideWhenUsed="0" w:uiPriority="65" w:semiHidden="0" w:name="Medium List 1 Accent 3"/>
+    <w:lsdException w:unhideWhenUsed="0" w:uiPriority="66" w:semiHidden="0" w:name="Medium List 2 Accent 3"/>
+    <w:lsdException w:unhideWhenUsed="0" w:uiPriority="67" w:semiHidden="0" w:name="Medium Grid 1 Accent 3"/>
+    <w:lsdException w:unhideWhenUsed="0" w:uiPriority="68" w:semiHidden="0" w:name="Medium Grid 2 Accent 3"/>
+    <w:lsdException w:unhideWhenUsed="0" w:uiPriority="69" w:semiHidden="0" w:name="Medium Grid 3 Accent 3"/>
+    <w:lsdException w:unhideWhenUsed="0" w:uiPriority="70" w:semiHidden="0" w:name="Dark List Accent 3"/>
+    <w:lsdException w:unhideWhenUsed="0" w:uiPriority="71" w:semiHidden="0" w:name="Colorful Shading Accent 3"/>
+    <w:lsdException w:unhideWhenUsed="0" w:uiPriority="72" w:semiHidden="0" w:name="Colorful List Accent 3"/>
+    <w:lsdException w:unhideWhenUsed="0" w:uiPriority="73" w:semiHidden="0" w:name="Colorful Grid Accent 3"/>
+    <w:lsdException w:unhideWhenUsed="0" w:uiPriority="60" w:semiHidden="0" w:name="Light Shading Accent 4"/>
+    <w:lsdException w:unhideWhenUsed="0" w:uiPriority="61" w:semiHidden="0" w:name="Light List Accent 4"/>
+    <w:lsdException w:unhideWhenUsed="0" w:uiPriority="62" w:semiHidden="0" w:name="Light Grid Accent 4"/>
+    <w:lsdException w:unhideWhenUsed="0" w:uiPriority="63" w:semiHidden="0" w:name="Medium Shading 1 Accent 4"/>
+    <w:lsdException w:unhideWhenUsed="0" w:uiPriority="64" w:semiHidden="0" w:name="Medium Shading 2 Accent 4"/>
+    <w:lsdException w:unhideWhenUsed="0" w:uiPriority="65" w:semiHidden="0" w:name="Medium List 1 Accent 4"/>
+    <w:lsdException w:unhideWhenUsed="0" w:uiPriority="66" w:semiHidden="0" w:name="Medium List 2 Accent 4"/>
+    <w:lsdException w:unhideWhenUsed="0" w:uiPriority="67" w:semiHidden="0" w:name="Medium Grid 1 Accent 4"/>
+    <w:lsdException w:unhideWhenUsed="0" w:uiPriority="68" w:semiHidden="0" w:name="Medium Grid 2 Accent 4"/>
+    <w:lsdException w:unhideWhenUsed="0" w:uiPriority="69" w:semiHidden="0" w:name="Medium Grid 3 Accent 4"/>
+    <w:lsdException w:unhideWhenUsed="0" w:uiPriority="70" w:semiHidden="0" w:name="Dark List Accent 4"/>
+    <w:lsdException w:unhideWhenUsed="0" w:uiPriority="71" w:semiHidden="0" w:name="Colorful Shading Accent 4"/>
+    <w:lsdException w:unhideWhenUsed="0" w:uiPriority="72" w:semiHidden="0" w:name="Colorful List Accent 4"/>
+    <w:lsdException w:unhideWhenUsed="0" w:uiPriority="73" w:semiHidden="0" w:name="Colorful Grid Accent 4"/>
+    <w:lsdException w:unhideWhenUsed="0" w:uiPriority="60" w:semiHidden="0" w:name="Light Shading Accent 5"/>
+    <w:lsdException w:unhideWhenUsed="0" w:uiPriority="61" w:semiHidden="0" w:name="Light List Accent 5"/>
+    <w:lsdException w:unhideWhenUsed="0" w:uiPriority="62" w:semiHidden="0" w:name="Light Grid Accent 5"/>
+    <w:lsdException w:unhideWhenUsed="0" w:uiPriority="63" w:semiHidden="0" w:name="Medium Shading 1 Accent 5"/>
+    <w:lsdException w:unhideWhenUsed="0" w:uiPriority="64" w:semiHidden="0" w:name="Medium Shading 2 Accent 5"/>
+    <w:lsdException w:unhideWhenUsed="0" w:uiPriority="65" w:semiHidden="0" w:name="Medium List 1 Accent 5"/>
+    <w:lsdException w:unhideWhenUsed="0" w:uiPriority="66" w:semiHidden="0" w:name="Medium List 2 Accent 5"/>
+    <w:lsdException w:unhideWhenUsed="0" w:uiPriority="67" w:semiHidden="0" w:name="Medium Grid 1 Accent 5"/>
+    <w:lsdException w:unhideWhenUsed="0" w:uiPriority="68" w:semiHidden="0" w:name="Medium Grid 2 Accent 5"/>
+    <w:lsdException w:unhideWhenUsed="0" w:uiPriority="69" w:semiHidden="0" w:name="Medium Grid 3 Accent 5"/>
+    <w:lsdException w:unhideWhenUsed="0" w:uiPriority="70" w:semiHidden="0" w:name="Dark List Accent 5"/>
+    <w:lsdException w:unhideWhenUsed="0" w:uiPriority="71" w:semiHidden="0" w:name="Colorful Shading Accent 5"/>
+    <w:lsdException w:unhideWhenUsed="0" w:uiPriority="72" w:semiHidden="0" w:name="Colorful List Accent 5"/>
+    <w:lsdException w:unhideWhenUsed="0" w:uiPriority="73" w:semiHidden="0" w:name="Colorful Grid Accent 5"/>
+    <w:lsdException w:unhideWhenUsed="0" w:uiPriority="60" w:semiHidden="0" w:name="Light Shading Accent 6"/>
+    <w:lsdException w:unhideWhenUsed="0" w:uiPriority="61" w:semiHidden="0" w:name="Light List Accent 6"/>
+    <w:lsdException w:unhideWhenUsed="0" w:uiPriority="62" w:semiHidden="0" w:name="Light Grid Accent 6"/>
+    <w:lsdException w:unhideWhenUsed="0" w:uiPriority="63" w:semiHidden="0" w:name="Medium Shading 1 Accent 6"/>
+    <w:lsdException w:unhideWhenUsed="0" w:uiPriority="64" w:semiHidden="0" w:name="Medium Shading 2 Accent 6"/>
+    <w:lsdException w:unhideWhenUsed="0" w:uiPriority="65" w:semiHidden="0" w:name="Medium List 1 Accent 6"/>
+    <w:lsdException w:unhideWhenUsed="0" w:uiPriority="66" w:semiHidden="0" w:name="Medium List 2 Accent 6"/>
+    <w:lsdException w:unhideWhenUsed="0" w:uiPriority="67" w:semiHidden="0" w:name="Medium Grid 1 Accent 6"/>
+    <w:lsdException w:unhideWhenUsed="0" w:uiPriority="68" w:semiHidden="0" w:name="Medium Grid 2 Accent 6"/>
+    <w:lsdException w:unhideWhenUsed="0" w:uiPriority="69" w:semiHidden="0" w:name="Medium Grid 3 Accent 6"/>
+    <w:lsdException w:unhideWhenUsed="0" w:uiPriority="70" w:semiHidden="0" w:name="Dark List Accent 6"/>
+    <w:lsdException w:unhideWhenUsed="0" w:uiPriority="71" w:semiHidden="0" w:name="Colorful Shading Accent 6"/>
+    <w:lsdException w:unhideWhenUsed="0" w:uiPriority="72" w:semiHidden="0" w:name="Colorful List Accent 6"/>
+    <w:lsdException w:unhideWhenUsed="0" w:uiPriority="73" w:semiHidden="0" w:name="Colorful Grid Accent 6"/>
+  </w:latentStyles>
+  <w:style w:type="paragraph" w:default="1" w:styleId="1">
+    <w:name w:val="Normal"/>
+    <w:qFormat/>
+    <w:uiPriority w:val="0"/>
+    <w:pPr>
+      <w:widowControl w:val="0"/>
+      <w:jc w:val="both"/>
+    </w:pPr>
+    <w:rPr>
+      <w:rFonts w:asciiTheme="minorHAnsi" w:hAnsiTheme="minorHAnsi" w:eastAsiaTheme="minorEastAsia" w:cstheme="minorBidi"/>
+      <w:sz w:val="21"/>
+      <w:szCs w:val="22"/>
+    </w:rPr>
+  </w:style>
+  <w:style w:type="character" w:default="1" w:styleId="3">
+    <w:name w:val="Default Paragraph Font"/>
+    <w:semiHidden/>
+    <w:uiPriority w:val="0"/>
+  </w:style>
+  <w:style w:type="table" w:default="1" w:styleId="2">
+    <w:name w:val="Normal Table"/>
+    <w:semiHidden/>
+    <w:uiPriority w:val="0"/>
+    <w:tblPr>
+      <w:tblCellMar>
+        <w:top w:w="0" w:type="dxa"/>
+        <w:left w:w="108" w:type="dxa"/>
+        <w:bottom w:w="0" w:type="dxa"/>
+        <w:right w:w="108" w:type="dxa"/>
+      </w:tblCellMar>
+    </w:tblPr>
+  </w:style>
+</w:styles>
+</file>
+
+<file path=word/theme/theme1.xml><?xml version="1.0" encoding="utf-8"?>
+<a:theme xmlns:a="http://schemas.openxmlformats.org/drawingml/2006/main" name="Office">
+  <a:themeElements>
+    <a:clrScheme name="Office">
+      <a:dk1>
+        <a:sysClr val="windowText" lastClr="000000"/>
+      </a:dk1>
+      <a:lt1>
+        <a:sysClr val="window" lastClr="FFFFFF"/>
+      </a:lt1>
+      <a:dk2>
+        <a:srgbClr val="1F497D"/>
+      </a:dk2>
+      <a:lt2>
+        <a:srgbClr val="EEECE1"/>
+      </a:lt2>
+      <a:accent1>
+        <a:srgbClr val="4F81BD"/>
+      </a:accent1>
+      <a:accent2>
+        <a:srgbClr val="C0504D"/>
+      </a:accent2>
+      <a:accent3>
+        <a:srgbClr val="9BBB59"/>
+      </a:accent3>
+      <a:accent4>
+        <a:srgbClr val="8064A2"/>
+      </a:accent4>
+      <a:accent5>
+        <a:srgbClr val="4BACC6"/>
+      </a:accent5>
+      <a:accent6>
+        <a:srgbClr val="F79646"/>
+      </a:accent6>
+      <a:hlink>
+        <a:srgbClr val="0000FF"/>
+      </a:hlink>
+      <a:folHlink>
+        <a:srgbClr val="800080"/>
+      </a:folHlink>
+    </a:clrScheme>
+    <a:fontScheme name="Office">
+      <a:majorFont>
+        <a:latin typeface="Cambria"/>
+        <a:ea typeface=""/>
+        <a:cs typeface=""/>
+        <a:font script="Jpan" typeface="游ゴシック Light"/>
+        <a:font script="Hang" typeface="맑은 고딕"/>
+        <a:font script="Hans" typeface="宋体"/>
+        <a:font script="Hant" typeface="新細明體"/>
+        <a:font script="Arab" typeface="Times New Roman"/>
+        <a:font script="Hebr" typeface="Times New Roman"/>
+        <a:font script="Thai" typeface="Angsana New"/>
+        <a:font script="Ethi" typeface="Nyala"/>
+        <a:font script="Beng" typeface="Vrinda"/>
+        <a:font script="Gujr" typeface="Shruti"/>
+        <a:font script="Khmr" typeface="MoolBoran"/>
+        <a:font script="Knda" typeface="Tunga"/>
+        <a:font script="Guru" typeface="Raavi"/>
+        <a:font script="Cans" typeface="Euphemia"/>
+        <a:font script="Cher" typeface="Plantagenet Cherokee"/>
+        <a:font script="Yiii" typeface="Microsoft Yi Baiti"/>
+        <a:font script="Tibt" typeface="Microsoft Himalaya"/>
+        <a:font script="Thaa" typeface="MV Boli"/>
+        <a:font script="Deva" typeface="Mangal"/>
+        <a:font script="Telu" typeface="Gautami"/>
+        <a:font script="Taml" typeface="Latha"/>
+        <a:font script="Syrc" typeface="Estrangelo Edessa"/>
+        <a:font script="Orya" typeface="Kalinga"/>
+        <a:font script="Mlym" typeface="Kartika"/>
+        <a:font script="Laoo" typeface="DokChampa"/>
+        <a:font script="Sinh" typeface="Iskoola Pota"/>
+        <a:font script="Mong" typeface="Mongolian Baiti"/>
+        <a:font script="Viet" typeface="Times New Roman"/>
+        <a:font script="Uigh" typeface="Microsoft Uighur"/>
+        <a:font script="Geor" typeface="Sylfaen"/>
+      </a:majorFont>
+      <a:minorFont>
+        <a:latin typeface="Calibri"/>
+        <a:ea typeface=""/>
+        <a:cs typeface=""/>
+        <a:font script="Jpan" typeface="游明朝"/>
+        <a:font script="Hang" typeface="맑은 고딕"/>
+        <a:font script="Hans" typeface="宋体"/>
+        <a:font script="Hant" typeface="新細明體"/>
+        <a:font script="Arab" typeface="Arial"/>
+        <a:font script="Hebr" typeface="Arial"/>
+        <a:font script="Thai" typeface="Cordia New"/>
+        <a:font script="Ethi" typeface="Nyala"/>
+        <a:font script="Beng" typeface="Vrinda"/>
+        <a:font script="Gujr" typeface="Shruti"/>
+        <a:font script="Khmr" typeface="DaunPenh"/>
+        <a:font script="Knda" typeface="Tunga"/>
+        <a:font script="Guru" typeface="Raavi"/>
+        <a:font script="Cans" typeface="Euphemia"/>
+        <a:font script="Cher" typeface="Plantagenet Cherokee"/>
+        <a:font script="Yiii" typeface="Microsoft Yi Baiti"/>
+        <a:font script="Tibt" typeface="Microsoft Himalaya"/>
+        <a:font script="Thaa" typeface="MV Boli"/>
+        <a:font script="Deva" typeface="Mangal"/>
+        <a:font script="Telu" typeface="Gautami"/>
+        <a:font script="Taml" typeface="Latha"/>
+        <a:font script="Syrc" typeface="Estrangelo Edessa"/>
+        <a:font script="Orya" typeface="Kalinga"/>
+        <a:font script="Mlym" typeface="Kartika"/>
+        <a:font script="Laoo" typeface="DokChampa"/>
+        <a:font script="Sinh" typeface="Iskoola Pota"/>
+        <a:font script="Mong" typeface="Mongolian Baiti"/>
+        <a:font script="Viet" typeface="Arial"/>
+        <a:font script="Uigh" typeface="Microsoft Uighur"/>
+        <a:font script="Geor" typeface="Sylfaen"/>
+      </a:minorFont>
+    </a:fontScheme>
+    <a:fmtScheme name="Office">
+      <a:fillStyleLst>
+        <a:solidFill>
+          <a:schemeClr val="phClr"/>
+        </a:solidFill>
+        <a:gradFill rotWithShape="1">
+          <a:gsLst>
+            <a:gs pos="0">
+              <a:schemeClr val="phClr">
+                <a:tint val="50000"/>
+                <a:satMod val="300000"/>
+              </a:schemeClr>
+            </a:gs>
+            <a:gs pos="35000">
+              <a:schemeClr val="phClr">
+                <a:tint val="37000"/>
+                <a:satMod val="300000"/>
+              </a:schemeClr>
+            </a:gs>
+            <a:gs pos="100000">
+              <a:schemeClr val="phClr">
+                <a:tint val="15000"/>
+                <a:satMod val="350000"/>
+              </a:schemeClr>
+            </a:gs>
+          </a:gsLst>
+          <a:lin ang="16200000" scaled="1"/>
+        </a:gradFill>
+        <a:gradFill rotWithShape="1">
+          <a:gsLst>
+            <a:gs pos="0">
+              <a:schemeClr val="phClr">
+                <a:shade val="51000"/>
+                <a:satMod val="130000"/>
+              </a:schemeClr>
+            </a:gs>
+            <a:gs pos="80000">
+              <a:schemeClr val="phClr">
+                <a:shade val="93000"/>
+                <a:satMod val="130000"/>
+              </a:schemeClr>
+            </a:gs>
+            <a:gs pos="100000">
+              <a:schemeClr val="phClr">
+                <a:shade val="94000"/>
+                <a:satMod val="135000"/>
+              </a:schemeClr>
+            </a:gs>
+          </a:gsLst>
+          <a:lin ang="16200000" scaled="0"/>
+        </a:gradFill>
+      </a:fillStyleLst>
+      <a:lnStyleLst>
+        <a:ln w="9525" cap="flat" cmpd="sng" algn="ctr">
+          <a:solidFill>
+            <a:schemeClr val="phClr">
+              <a:shade val="95000"/>
+              <a:satMod val="105000"/>
+            </a:schemeClr>
+          </a:solidFill>
+          <a:prstDash val="solid"/>
+        </a:ln>
+        <a:ln w="25400" cap="flat" cmpd="sng" algn="ctr">
+          <a:solidFill>
+            <a:schemeClr val="phClr"/>
+          </a:solidFill>
+          <a:prstDash val="solid"/>
+        </a:ln>
+        <a:ln w="38100" cap="flat" cmpd="sng" algn="ctr">
+          <a:solidFill>
+            <a:schemeClr val="phClr"/>
+          </a:solidFill>
+          <a:prstDash val="solid"/>
+        </a:ln>
+      </a:lnStyleLst>
+      <a:effectStyleLst>
+        <a:effectStyle>
+          <a:effectLst>
+            <a:outerShdw blurRad="40000" dist="20000" dir="5400000" rotWithShape="0">
+              <a:srgbClr val="000000">
+                <a:alpha val="38000"/>
+              </a:srgbClr>
+            </a:outerShdw>
+          </a:effectLst>
+        </a:effectStyle>
+        <a:effectStyle>
+          <a:effectLst>
+            <a:outerShdw blurRad="40000" dist="23000" dir="5400000" rotWithShape="0">
+              <a:srgbClr val="000000">
+                <a:alpha val="35000"/>
+              </a:srgbClr>
+            </a:outerShdw>
+          </a:effectLst>
+        </a:effectStyle>
+        <a:effectStyle>
+          <a:effectLst>
+            <a:outerShdw blurRad="40000" dist="23000" dir="5400000" rotWithShape="0">
+              <a:srgbClr val="000000">
+                <a:alpha val="35000"/>
+              </a:srgbClr>
+            </a:outerShdw>
+          </a:effectLst>
+          <a:scene3d>
+            <a:camera prst="orthographicFront">
+              <a:rot lat="0" lon="0" rev="0"/>
+            </a:camera>
+            <a:lightRig rig="threePt" dir="t">
+              <a:rot lat="0" lon="0" rev="1200000"/>
+            </a:lightRig>
+          </a:scene3d>
+          <a:sp3d>
+            <a:bevelT w="63500" h="25400"/>
+          </a:sp3d>
+        </a:effectStyle>
+      </a:effectStyleLst>
+      <a:bgFillStyleLst>
+        <a:solidFill>
+          <a:schemeClr val="phClr"/>
+        </a:solidFill>
+        <a:gradFill rotWithShape="1">
+          <a:gsLst>
+            <a:gs pos="0">
+              <a:schemeClr val="phClr">
+                <a:tint val="40000"/>
+                <a:satMod val="350000"/>
+              </a:schemeClr>
+            </a:gs>
+            <a:gs pos="40000">
+              <a:schemeClr val="phClr">
+                <a:tint val="45000"/>
+                <a:satMod val="350000"/>
+                <a:shade val="99000"/>
+              </a:schemeClr>
+            </a:gs>
+            <a:gs pos="100000">
+              <a:schemeClr val="phClr">
+                <a:shade val="20000"/>
+                <a:satMod val="255000"/>
+              </a:schemeClr>
+            </a:gs>
+          </a:gsLst>
+          <a:path path="circle">
+            <a:fillToRect l="50000" t="-80000" r="50000" b="180000"/>
+          </a:path>
+        </a:gradFill>
+        <a:gradFill rotWithShape="1">
+          <a:gsLst>
+            <a:gs pos="0">
+              <a:schemeClr val="phClr">
+                <a:tint val="80000"/>
+                <a:satMod val="300000"/>
+              </a:schemeClr>
+            </a:gs>
+            <a:gs pos="100000">
+              <a:schemeClr val="phClr">
+                <a:shade val="30000"/>
+                <a:satMod val="200000"/>
+              </a:schemeClr>
+            </a:gs>
+          </a:gsLst>
+          <a:path path="circle">
+            <a:fillToRect l="50000" t="50000" r="50000" b="50000"/>
+          </a:path>
+        </a:gradFill>
+      </a:bgFillStyleLst>
+    </a:fmtScheme>
+  </a:themeElements>
+  <a:objectDefaults/>
+</a:theme>
 </file>
</xml_diff>